<commit_message>
Printable Sheets are Ready
</commit_message>
<xml_diff>
--- a/Selenium Cheatsheets/Behaviour Driven Testing.docx
+++ b/Selenium Cheatsheets/Behaviour Driven Testing.docx
@@ -4,6 +4,30 @@
   <w:body>
     <w:p>
       <w:pPr>
+        <w:pStyle w:val="Title"/>
+        <w:jc w:val="center"/>
+        <w:rPr>
+          <w:rFonts w:eastAsia="Times New Roman"/>
+          <w:lang w:eastAsia="en-IN" w:bidi="ta-IN"/>
+        </w:rPr>
+      </w:pPr>
+      <w:r>
+        <w:rPr>
+          <w:rFonts w:eastAsia="Times New Roman"/>
+          <w:lang w:eastAsia="en-IN" w:bidi="ta-IN"/>
+        </w:rPr>
+        <w:t>Behaviour</w:t>
+      </w:r>
+      <w:r>
+        <w:rPr>
+          <w:rFonts w:eastAsia="Times New Roman"/>
+          <w:lang w:eastAsia="en-IN" w:bidi="ta-IN"/>
+        </w:rPr>
+        <w:t>-Driven Development (BDD)</w:t>
+      </w:r>
+    </w:p>
+    <w:p>
+      <w:pPr>
         <w:spacing w:before="100" w:beforeAutospacing="1" w:after="100" w:afterAutospacing="1" w:line="240" w:lineRule="auto"/>
         <w:outlineLvl w:val="2"/>
         <w:rPr>
@@ -17,7 +41,6 @@
           <w14:ligatures w14:val="none"/>
         </w:rPr>
       </w:pPr>
-      <w:proofErr w:type="spellStart"/>
       <w:r>
         <w:rPr>
           <w:rFonts w:ascii="Times New Roman" w:eastAsia="Times New Roman" w:hAnsi="Times New Roman" w:cs="Times New Roman"/>
@@ -29,45 +52,79 @@
           <w:lang w:eastAsia="en-IN" w:bidi="ta-IN"/>
           <w14:ligatures w14:val="none"/>
         </w:rPr>
-        <w:t>Behavior</w:t>
-      </w:r>
-      <w:proofErr w:type="spellEnd"/>
+        <w:t>Overview</w:t>
+      </w:r>
+    </w:p>
+    <w:p>
+      <w:pPr>
+        <w:spacing w:before="100" w:beforeAutospacing="1" w:after="100" w:afterAutospacing="1" w:line="240" w:lineRule="auto"/>
+        <w:rPr>
+          <w:rFonts w:ascii="Times New Roman" w:eastAsia="Times New Roman" w:hAnsi="Times New Roman" w:cs="Times New Roman"/>
+          <w:kern w:val="0"/>
+          <w:sz w:val="24"/>
+          <w:szCs w:val="24"/>
+          <w:lang w:eastAsia="en-IN" w:bidi="ta-IN"/>
+          <w14:ligatures w14:val="none"/>
+        </w:rPr>
+      </w:pPr>
+      <w:r>
+        <w:rPr>
+          <w:rFonts w:ascii="Times New Roman" w:eastAsia="Times New Roman" w:hAnsi="Times New Roman" w:cs="Times New Roman"/>
+          <w:kern w:val="0"/>
+          <w:sz w:val="24"/>
+          <w:szCs w:val="24"/>
+          <w:lang w:eastAsia="en-IN" w:bidi="ta-IN"/>
+          <w14:ligatures w14:val="none"/>
+        </w:rPr>
+        <w:t xml:space="preserve">BDD is a software development methodology that bridges the gap between business stakeholders and technical teams. It uses </w:t>
+      </w:r>
       <w:r>
         <w:rPr>
           <w:rFonts w:ascii="Times New Roman" w:eastAsia="Times New Roman" w:hAnsi="Times New Roman" w:cs="Times New Roman"/>
           <w:b/>
           <w:bCs/>
           <w:kern w:val="0"/>
-          <w:sz w:val="27"/>
-          <w:szCs w:val="27"/>
-          <w:lang w:eastAsia="en-IN" w:bidi="ta-IN"/>
-          <w14:ligatures w14:val="none"/>
-        </w:rPr>
-        <w:t>-Driven Development (BDD): Overview</w:t>
-      </w:r>
-    </w:p>
-    <w:p>
-      <w:pPr>
-        <w:spacing w:before="100" w:beforeAutospacing="1" w:after="100" w:afterAutospacing="1" w:line="240" w:lineRule="auto"/>
-        <w:rPr>
-          <w:rFonts w:ascii="Times New Roman" w:eastAsia="Times New Roman" w:hAnsi="Times New Roman" w:cs="Times New Roman"/>
-          <w:kern w:val="0"/>
-          <w:sz w:val="24"/>
-          <w:szCs w:val="24"/>
-          <w:lang w:eastAsia="en-IN" w:bidi="ta-IN"/>
-          <w14:ligatures w14:val="none"/>
-        </w:rPr>
-      </w:pPr>
-      <w:r>
-        <w:rPr>
-          <w:rFonts w:ascii="Times New Roman" w:eastAsia="Times New Roman" w:hAnsi="Times New Roman" w:cs="Times New Roman"/>
-          <w:kern w:val="0"/>
-          <w:sz w:val="24"/>
-          <w:szCs w:val="24"/>
-          <w:lang w:eastAsia="en-IN" w:bidi="ta-IN"/>
-          <w14:ligatures w14:val="none"/>
-        </w:rPr>
-        <w:t xml:space="preserve">BDD is a software development methodology that bridges the gap between business stakeholders and technical teams. It uses </w:t>
+          <w:sz w:val="24"/>
+          <w:szCs w:val="24"/>
+          <w:lang w:eastAsia="en-IN" w:bidi="ta-IN"/>
+          <w14:ligatures w14:val="none"/>
+        </w:rPr>
+        <w:t>plain language descriptions</w:t>
+      </w:r>
+      <w:r>
+        <w:rPr>
+          <w:rFonts w:ascii="Times New Roman" w:eastAsia="Times New Roman" w:hAnsi="Times New Roman" w:cs="Times New Roman"/>
+          <w:kern w:val="0"/>
+          <w:sz w:val="24"/>
+          <w:szCs w:val="24"/>
+          <w:lang w:eastAsia="en-IN" w:bidi="ta-IN"/>
+          <w14:ligatures w14:val="none"/>
+        </w:rPr>
+        <w:t xml:space="preserve"> of expected application </w:t>
+      </w:r>
+      <w:proofErr w:type="spellStart"/>
+      <w:r>
+        <w:rPr>
+          <w:rFonts w:ascii="Times New Roman" w:eastAsia="Times New Roman" w:hAnsi="Times New Roman" w:cs="Times New Roman"/>
+          <w:kern w:val="0"/>
+          <w:sz w:val="24"/>
+          <w:szCs w:val="24"/>
+          <w:lang w:eastAsia="en-IN" w:bidi="ta-IN"/>
+          <w14:ligatures w14:val="none"/>
+        </w:rPr>
+        <w:t>behavior</w:t>
+      </w:r>
+      <w:proofErr w:type="spellEnd"/>
+      <w:r>
+        <w:rPr>
+          <w:rFonts w:ascii="Times New Roman" w:eastAsia="Times New Roman" w:hAnsi="Times New Roman" w:cs="Times New Roman"/>
+          <w:kern w:val="0"/>
+          <w:sz w:val="24"/>
+          <w:szCs w:val="24"/>
+          <w:lang w:eastAsia="en-IN" w:bidi="ta-IN"/>
+          <w14:ligatures w14:val="none"/>
+        </w:rPr>
+        <w:t xml:space="preserve">, often written in </w:t>
       </w:r>
       <w:r>
         <w:rPr>
@@ -80,54 +137,6 @@
           <w:lang w:eastAsia="en-IN" w:bidi="ta-IN"/>
           <w14:ligatures w14:val="none"/>
         </w:rPr>
-        <w:t>plain language descriptions</w:t>
-      </w:r>
-      <w:r>
-        <w:rPr>
-          <w:rFonts w:ascii="Times New Roman" w:eastAsia="Times New Roman" w:hAnsi="Times New Roman" w:cs="Times New Roman"/>
-          <w:kern w:val="0"/>
-          <w:sz w:val="24"/>
-          <w:szCs w:val="24"/>
-          <w:lang w:eastAsia="en-IN" w:bidi="ta-IN"/>
-          <w14:ligatures w14:val="none"/>
-        </w:rPr>
-        <w:t xml:space="preserve"> of expected application </w:t>
-      </w:r>
-      <w:proofErr w:type="spellStart"/>
-      <w:r>
-        <w:rPr>
-          <w:rFonts w:ascii="Times New Roman" w:eastAsia="Times New Roman" w:hAnsi="Times New Roman" w:cs="Times New Roman"/>
-          <w:kern w:val="0"/>
-          <w:sz w:val="24"/>
-          <w:szCs w:val="24"/>
-          <w:lang w:eastAsia="en-IN" w:bidi="ta-IN"/>
-          <w14:ligatures w14:val="none"/>
-        </w:rPr>
-        <w:t>behavior</w:t>
-      </w:r>
-      <w:proofErr w:type="spellEnd"/>
-      <w:r>
-        <w:rPr>
-          <w:rFonts w:ascii="Times New Roman" w:eastAsia="Times New Roman" w:hAnsi="Times New Roman" w:cs="Times New Roman"/>
-          <w:kern w:val="0"/>
-          <w:sz w:val="24"/>
-          <w:szCs w:val="24"/>
-          <w:lang w:eastAsia="en-IN" w:bidi="ta-IN"/>
-          <w14:ligatures w14:val="none"/>
-        </w:rPr>
-        <w:t xml:space="preserve">, often written in </w:t>
-      </w:r>
-      <w:r>
-        <w:rPr>
-          <w:rFonts w:ascii="Times New Roman" w:eastAsia="Times New Roman" w:hAnsi="Times New Roman" w:cs="Times New Roman"/>
-          <w:b/>
-          <w:bCs/>
-          <w:kern w:val="0"/>
-          <w:sz w:val="24"/>
-          <w:szCs w:val="24"/>
-          <w:lang w:eastAsia="en-IN" w:bidi="ta-IN"/>
-          <w14:ligatures w14:val="none"/>
-        </w:rPr>
         <w:t>Gherkin syntax</w:t>
       </w:r>
       <w:r>
@@ -164,7 +173,7 @@
           <w14:ligatures w14:val="none"/>
         </w:rPr>
         <w:pict w14:anchorId="3D0BDC71">
-          <v:rect id="_x0000_i1151" style="width:0;height:1.5pt" o:hralign="center" o:hrstd="t" o:hr="t" fillcolor="#a0a0a0" stroked="f"/>
+          <v:rect id="_x0000_i1025" style="width:0;height:1.5pt" o:hralign="center" o:hrstd="t" o:hr="t" fillcolor="#a0a0a0" stroked="f"/>
         </w:pict>
       </w:r>
     </w:p>
@@ -802,7 +811,7 @@
           <w14:ligatures w14:val="none"/>
         </w:rPr>
         <w:pict w14:anchorId="0B149E57">
-          <v:rect id="_x0000_i1152" style="width:0;height:1.5pt" o:hralign="center" o:hrstd="t" o:hr="t" fillcolor="#a0a0a0" stroked="f"/>
+          <v:rect id="_x0000_i1026" style="width:0;height:1.5pt" o:hralign="center" o:hrstd="t" o:hr="t" fillcolor="#a0a0a0" stroked="f"/>
         </w:pict>
       </w:r>
     </w:p>
@@ -1422,31 +1431,7 @@
           <w:lang w:eastAsia="en-IN" w:bidi="ta-IN"/>
           <w14:ligatures w14:val="none"/>
         </w:rPr>
-        <w:t>@</w:t>
-      </w:r>
-      <w:proofErr w:type="gramStart"/>
-      <w:r>
-        <w:rPr>
-          <w:rFonts w:ascii="Courier New" w:eastAsia="Times New Roman" w:hAnsi="Courier New" w:cs="Courier New"/>
-          <w:kern w:val="0"/>
-          <w:sz w:val="20"/>
-          <w:szCs w:val="20"/>
-          <w:lang w:eastAsia="en-IN" w:bidi="ta-IN"/>
-          <w14:ligatures w14:val="none"/>
-        </w:rPr>
-        <w:t>given(</w:t>
-      </w:r>
-      <w:proofErr w:type="gramEnd"/>
-      <w:r>
-        <w:rPr>
-          <w:rFonts w:ascii="Courier New" w:eastAsia="Times New Roman" w:hAnsi="Courier New" w:cs="Courier New"/>
-          <w:kern w:val="0"/>
-          <w:sz w:val="20"/>
-          <w:szCs w:val="20"/>
-          <w:lang w:eastAsia="en-IN" w:bidi="ta-IN"/>
-          <w14:ligatures w14:val="none"/>
-        </w:rPr>
-        <w:t>"the user is on the login page")</w:t>
+        <w:t>@given("the user is on the login page")</w:t>
       </w:r>
     </w:p>
     <w:p>
@@ -1596,11 +1581,9 @@
           <w:lang w:eastAsia="en-IN" w:bidi="ta-IN"/>
           <w14:ligatures w14:val="none"/>
         </w:rPr>
-        <w:lastRenderedPageBreak/>
         <w:t xml:space="preserve">    driver = </w:t>
       </w:r>
       <w:proofErr w:type="spellStart"/>
-      <w:proofErr w:type="gramStart"/>
       <w:r>
         <w:rPr>
           <w:rFonts w:ascii="Courier New" w:eastAsia="Times New Roman" w:hAnsi="Courier New" w:cs="Courier New"/>
@@ -1613,7 +1596,6 @@
         <w:t>webdriver.Chrome</w:t>
       </w:r>
       <w:proofErr w:type="spellEnd"/>
-      <w:proofErr w:type="gramEnd"/>
       <w:r>
         <w:rPr>
           <w:rFonts w:ascii="Courier New" w:eastAsia="Times New Roman" w:hAnsi="Courier New" w:cs="Courier New"/>
@@ -1762,31 +1744,7 @@
           <w:lang w:eastAsia="en-IN" w:bidi="ta-IN"/>
           <w14:ligatures w14:val="none"/>
         </w:rPr>
-        <w:t>@</w:t>
-      </w:r>
-      <w:proofErr w:type="gramStart"/>
-      <w:r>
-        <w:rPr>
-          <w:rFonts w:ascii="Courier New" w:eastAsia="Times New Roman" w:hAnsi="Courier New" w:cs="Courier New"/>
-          <w:kern w:val="0"/>
-          <w:sz w:val="20"/>
-          <w:szCs w:val="20"/>
-          <w:lang w:eastAsia="en-IN" w:bidi="ta-IN"/>
-          <w14:ligatures w14:val="none"/>
-        </w:rPr>
-        <w:t>when(</w:t>
-      </w:r>
-      <w:proofErr w:type="gramEnd"/>
-      <w:r>
-        <w:rPr>
-          <w:rFonts w:ascii="Courier New" w:eastAsia="Times New Roman" w:hAnsi="Courier New" w:cs="Courier New"/>
-          <w:kern w:val="0"/>
-          <w:sz w:val="20"/>
-          <w:szCs w:val="20"/>
-          <w:lang w:eastAsia="en-IN" w:bidi="ta-IN"/>
-          <w14:ligatures w14:val="none"/>
-        </w:rPr>
-        <w:t>"the user enters valid credentials")</w:t>
+        <w:t>@when("the user enters valid credentials")</w:t>
       </w:r>
     </w:p>
     <w:p>
@@ -1897,29 +1855,16 @@
         <w:t xml:space="preserve">    </w:t>
       </w:r>
       <w:proofErr w:type="spellStart"/>
-      <w:proofErr w:type="gramStart"/>
-      <w:r>
-        <w:rPr>
-          <w:rFonts w:ascii="Courier New" w:eastAsia="Times New Roman" w:hAnsi="Courier New" w:cs="Courier New"/>
-          <w:kern w:val="0"/>
-          <w:sz w:val="20"/>
-          <w:szCs w:val="20"/>
-          <w:lang w:eastAsia="en-IN" w:bidi="ta-IN"/>
-          <w14:ligatures w14:val="none"/>
-        </w:rPr>
-        <w:t>driver.find</w:t>
-      </w:r>
-      <w:proofErr w:type="gramEnd"/>
-      <w:r>
-        <w:rPr>
-          <w:rFonts w:ascii="Courier New" w:eastAsia="Times New Roman" w:hAnsi="Courier New" w:cs="Courier New"/>
-          <w:kern w:val="0"/>
-          <w:sz w:val="20"/>
-          <w:szCs w:val="20"/>
-          <w:lang w:eastAsia="en-IN" w:bidi="ta-IN"/>
-          <w14:ligatures w14:val="none"/>
-        </w:rPr>
-        <w:t>_element_by_id</w:t>
+      <w:r>
+        <w:rPr>
+          <w:rFonts w:ascii="Courier New" w:eastAsia="Times New Roman" w:hAnsi="Courier New" w:cs="Courier New"/>
+          <w:kern w:val="0"/>
+          <w:sz w:val="20"/>
+          <w:szCs w:val="20"/>
+          <w:lang w:eastAsia="en-IN" w:bidi="ta-IN"/>
+          <w14:ligatures w14:val="none"/>
+        </w:rPr>
+        <w:t>driver.find_element_by_id</w:t>
       </w:r>
       <w:proofErr w:type="spellEnd"/>
       <w:r>
@@ -2021,32 +1966,268 @@
           <w:lang w:eastAsia="en-IN" w:bidi="ta-IN"/>
           <w14:ligatures w14:val="none"/>
         </w:rPr>
+        <w:t xml:space="preserve">    driver.find_element_by_id("password").send_keys("secure_password")</w:t>
+      </w:r>
+    </w:p>
+    <w:p>
+      <w:pPr>
+        <w:tabs>
+          <w:tab w:val="left" w:pos="916"/>
+          <w:tab w:val="left" w:pos="1832"/>
+          <w:tab w:val="left" w:pos="2748"/>
+          <w:tab w:val="left" w:pos="3664"/>
+          <w:tab w:val="left" w:pos="4580"/>
+          <w:tab w:val="left" w:pos="5496"/>
+          <w:tab w:val="left" w:pos="6412"/>
+          <w:tab w:val="left" w:pos="7328"/>
+          <w:tab w:val="left" w:pos="8244"/>
+          <w:tab w:val="left" w:pos="9160"/>
+          <w:tab w:val="left" w:pos="10076"/>
+          <w:tab w:val="left" w:pos="10992"/>
+          <w:tab w:val="left" w:pos="11908"/>
+          <w:tab w:val="left" w:pos="12824"/>
+          <w:tab w:val="left" w:pos="13740"/>
+          <w:tab w:val="left" w:pos="14656"/>
+        </w:tabs>
+        <w:spacing w:after="0" w:line="240" w:lineRule="auto"/>
+        <w:rPr>
+          <w:rFonts w:ascii="Courier New" w:eastAsia="Times New Roman" w:hAnsi="Courier New" w:cs="Courier New"/>
+          <w:kern w:val="0"/>
+          <w:sz w:val="20"/>
+          <w:szCs w:val="20"/>
+          <w:lang w:eastAsia="en-IN" w:bidi="ta-IN"/>
+          <w14:ligatures w14:val="none"/>
+        </w:rPr>
+      </w:pPr>
+      <w:r>
+        <w:rPr>
+          <w:rFonts w:ascii="Courier New" w:eastAsia="Times New Roman" w:hAnsi="Courier New" w:cs="Courier New"/>
+          <w:kern w:val="0"/>
+          <w:sz w:val="20"/>
+          <w:szCs w:val="20"/>
+          <w:lang w:eastAsia="en-IN" w:bidi="ta-IN"/>
+          <w14:ligatures w14:val="none"/>
+        </w:rPr>
         <w:t xml:space="preserve">    </w:t>
       </w:r>
-      <w:proofErr w:type="gramStart"/>
-      <w:r>
-        <w:rPr>
-          <w:rFonts w:ascii="Courier New" w:eastAsia="Times New Roman" w:hAnsi="Courier New" w:cs="Courier New"/>
-          <w:kern w:val="0"/>
-          <w:sz w:val="20"/>
-          <w:szCs w:val="20"/>
-          <w:lang w:eastAsia="en-IN" w:bidi="ta-IN"/>
-          <w14:ligatures w14:val="none"/>
-        </w:rPr>
-        <w:t>driver.find</w:t>
-      </w:r>
-      <w:proofErr w:type="gramEnd"/>
-      <w:r>
-        <w:rPr>
-          <w:rFonts w:ascii="Courier New" w:eastAsia="Times New Roman" w:hAnsi="Courier New" w:cs="Courier New"/>
-          <w:kern w:val="0"/>
-          <w:sz w:val="20"/>
-          <w:szCs w:val="20"/>
-          <w:lang w:eastAsia="en-IN" w:bidi="ta-IN"/>
-          <w14:ligatures w14:val="none"/>
-        </w:rPr>
-        <w:t>_element_by_id("password").send_keys("secure_password")</w:t>
-      </w:r>
+      <w:proofErr w:type="spellStart"/>
+      <w:r>
+        <w:rPr>
+          <w:rFonts w:ascii="Courier New" w:eastAsia="Times New Roman" w:hAnsi="Courier New" w:cs="Courier New"/>
+          <w:kern w:val="0"/>
+          <w:sz w:val="20"/>
+          <w:szCs w:val="20"/>
+          <w:lang w:eastAsia="en-IN" w:bidi="ta-IN"/>
+          <w14:ligatures w14:val="none"/>
+        </w:rPr>
+        <w:t>driver.find_element_by_id</w:t>
+      </w:r>
+      <w:proofErr w:type="spellEnd"/>
+      <w:r>
+        <w:rPr>
+          <w:rFonts w:ascii="Courier New" w:eastAsia="Times New Roman" w:hAnsi="Courier New" w:cs="Courier New"/>
+          <w:kern w:val="0"/>
+          <w:sz w:val="20"/>
+          <w:szCs w:val="20"/>
+          <w:lang w:eastAsia="en-IN" w:bidi="ta-IN"/>
+          <w14:ligatures w14:val="none"/>
+        </w:rPr>
+        <w:t>("login-button").click()</w:t>
+      </w:r>
+    </w:p>
+    <w:p>
+      <w:pPr>
+        <w:tabs>
+          <w:tab w:val="left" w:pos="916"/>
+          <w:tab w:val="left" w:pos="1832"/>
+          <w:tab w:val="left" w:pos="2748"/>
+          <w:tab w:val="left" w:pos="3664"/>
+          <w:tab w:val="left" w:pos="4580"/>
+          <w:tab w:val="left" w:pos="5496"/>
+          <w:tab w:val="left" w:pos="6412"/>
+          <w:tab w:val="left" w:pos="7328"/>
+          <w:tab w:val="left" w:pos="8244"/>
+          <w:tab w:val="left" w:pos="9160"/>
+          <w:tab w:val="left" w:pos="10076"/>
+          <w:tab w:val="left" w:pos="10992"/>
+          <w:tab w:val="left" w:pos="11908"/>
+          <w:tab w:val="left" w:pos="12824"/>
+          <w:tab w:val="left" w:pos="13740"/>
+          <w:tab w:val="left" w:pos="14656"/>
+        </w:tabs>
+        <w:spacing w:after="0" w:line="240" w:lineRule="auto"/>
+        <w:rPr>
+          <w:rFonts w:ascii="Courier New" w:eastAsia="Times New Roman" w:hAnsi="Courier New" w:cs="Courier New"/>
+          <w:kern w:val="0"/>
+          <w:sz w:val="20"/>
+          <w:szCs w:val="20"/>
+          <w:lang w:eastAsia="en-IN" w:bidi="ta-IN"/>
+          <w14:ligatures w14:val="none"/>
+        </w:rPr>
+      </w:pPr>
+    </w:p>
+    <w:p>
+      <w:pPr>
+        <w:tabs>
+          <w:tab w:val="left" w:pos="916"/>
+          <w:tab w:val="left" w:pos="1832"/>
+          <w:tab w:val="left" w:pos="2748"/>
+          <w:tab w:val="left" w:pos="3664"/>
+          <w:tab w:val="left" w:pos="4580"/>
+          <w:tab w:val="left" w:pos="5496"/>
+          <w:tab w:val="left" w:pos="6412"/>
+          <w:tab w:val="left" w:pos="7328"/>
+          <w:tab w:val="left" w:pos="8244"/>
+          <w:tab w:val="left" w:pos="9160"/>
+          <w:tab w:val="left" w:pos="10076"/>
+          <w:tab w:val="left" w:pos="10992"/>
+          <w:tab w:val="left" w:pos="11908"/>
+          <w:tab w:val="left" w:pos="12824"/>
+          <w:tab w:val="left" w:pos="13740"/>
+          <w:tab w:val="left" w:pos="14656"/>
+        </w:tabs>
+        <w:spacing w:after="0" w:line="240" w:lineRule="auto"/>
+        <w:rPr>
+          <w:rFonts w:ascii="Courier New" w:eastAsia="Times New Roman" w:hAnsi="Courier New" w:cs="Courier New"/>
+          <w:kern w:val="0"/>
+          <w:sz w:val="20"/>
+          <w:szCs w:val="20"/>
+          <w:lang w:eastAsia="en-IN" w:bidi="ta-IN"/>
+          <w14:ligatures w14:val="none"/>
+        </w:rPr>
+      </w:pPr>
+      <w:r>
+        <w:rPr>
+          <w:rFonts w:ascii="Courier New" w:eastAsia="Times New Roman" w:hAnsi="Courier New" w:cs="Courier New"/>
+          <w:kern w:val="0"/>
+          <w:sz w:val="20"/>
+          <w:szCs w:val="20"/>
+          <w:lang w:eastAsia="en-IN" w:bidi="ta-IN"/>
+          <w14:ligatures w14:val="none"/>
+        </w:rPr>
+        <w:t>@then("the user should be redirected to the dashboard")</w:t>
+      </w:r>
+    </w:p>
+    <w:p>
+      <w:pPr>
+        <w:tabs>
+          <w:tab w:val="left" w:pos="916"/>
+          <w:tab w:val="left" w:pos="1832"/>
+          <w:tab w:val="left" w:pos="2748"/>
+          <w:tab w:val="left" w:pos="3664"/>
+          <w:tab w:val="left" w:pos="4580"/>
+          <w:tab w:val="left" w:pos="5496"/>
+          <w:tab w:val="left" w:pos="6412"/>
+          <w:tab w:val="left" w:pos="7328"/>
+          <w:tab w:val="left" w:pos="8244"/>
+          <w:tab w:val="left" w:pos="9160"/>
+          <w:tab w:val="left" w:pos="10076"/>
+          <w:tab w:val="left" w:pos="10992"/>
+          <w:tab w:val="left" w:pos="11908"/>
+          <w:tab w:val="left" w:pos="12824"/>
+          <w:tab w:val="left" w:pos="13740"/>
+          <w:tab w:val="left" w:pos="14656"/>
+        </w:tabs>
+        <w:spacing w:after="0" w:line="240" w:lineRule="auto"/>
+        <w:rPr>
+          <w:rFonts w:ascii="Courier New" w:eastAsia="Times New Roman" w:hAnsi="Courier New" w:cs="Courier New"/>
+          <w:kern w:val="0"/>
+          <w:sz w:val="20"/>
+          <w:szCs w:val="20"/>
+          <w:lang w:eastAsia="en-IN" w:bidi="ta-IN"/>
+          <w14:ligatures w14:val="none"/>
+        </w:rPr>
+      </w:pPr>
+      <w:r>
+        <w:rPr>
+          <w:rFonts w:ascii="Courier New" w:eastAsia="Times New Roman" w:hAnsi="Courier New" w:cs="Courier New"/>
+          <w:kern w:val="0"/>
+          <w:sz w:val="20"/>
+          <w:szCs w:val="20"/>
+          <w:lang w:eastAsia="en-IN" w:bidi="ta-IN"/>
+          <w14:ligatures w14:val="none"/>
+        </w:rPr>
+        <w:t xml:space="preserve">def </w:t>
+      </w:r>
+      <w:proofErr w:type="spellStart"/>
+      <w:r>
+        <w:rPr>
+          <w:rFonts w:ascii="Courier New" w:eastAsia="Times New Roman" w:hAnsi="Courier New" w:cs="Courier New"/>
+          <w:kern w:val="0"/>
+          <w:sz w:val="20"/>
+          <w:szCs w:val="20"/>
+          <w:lang w:eastAsia="en-IN" w:bidi="ta-IN"/>
+          <w14:ligatures w14:val="none"/>
+        </w:rPr>
+        <w:t>step_then_user_redirected_to_dashboard</w:t>
+      </w:r>
+      <w:proofErr w:type="spellEnd"/>
+      <w:r>
+        <w:rPr>
+          <w:rFonts w:ascii="Courier New" w:eastAsia="Times New Roman" w:hAnsi="Courier New" w:cs="Courier New"/>
+          <w:kern w:val="0"/>
+          <w:sz w:val="20"/>
+          <w:szCs w:val="20"/>
+          <w:lang w:eastAsia="en-IN" w:bidi="ta-IN"/>
+          <w14:ligatures w14:val="none"/>
+        </w:rPr>
+        <w:t>(context):</w:t>
+      </w:r>
+    </w:p>
+    <w:p>
+      <w:pPr>
+        <w:tabs>
+          <w:tab w:val="left" w:pos="916"/>
+          <w:tab w:val="left" w:pos="1832"/>
+          <w:tab w:val="left" w:pos="2748"/>
+          <w:tab w:val="left" w:pos="3664"/>
+          <w:tab w:val="left" w:pos="4580"/>
+          <w:tab w:val="left" w:pos="5496"/>
+          <w:tab w:val="left" w:pos="6412"/>
+          <w:tab w:val="left" w:pos="7328"/>
+          <w:tab w:val="left" w:pos="8244"/>
+          <w:tab w:val="left" w:pos="9160"/>
+          <w:tab w:val="left" w:pos="10076"/>
+          <w:tab w:val="left" w:pos="10992"/>
+          <w:tab w:val="left" w:pos="11908"/>
+          <w:tab w:val="left" w:pos="12824"/>
+          <w:tab w:val="left" w:pos="13740"/>
+          <w:tab w:val="left" w:pos="14656"/>
+        </w:tabs>
+        <w:spacing w:after="0" w:line="240" w:lineRule="auto"/>
+        <w:rPr>
+          <w:rFonts w:ascii="Courier New" w:eastAsia="Times New Roman" w:hAnsi="Courier New" w:cs="Courier New"/>
+          <w:kern w:val="0"/>
+          <w:sz w:val="20"/>
+          <w:szCs w:val="20"/>
+          <w:lang w:eastAsia="en-IN" w:bidi="ta-IN"/>
+          <w14:ligatures w14:val="none"/>
+        </w:rPr>
+      </w:pPr>
+      <w:r>
+        <w:rPr>
+          <w:rFonts w:ascii="Courier New" w:eastAsia="Times New Roman" w:hAnsi="Courier New" w:cs="Courier New"/>
+          <w:kern w:val="0"/>
+          <w:sz w:val="20"/>
+          <w:szCs w:val="20"/>
+          <w:lang w:eastAsia="en-IN" w:bidi="ta-IN"/>
+          <w14:ligatures w14:val="none"/>
+        </w:rPr>
+        <w:t xml:space="preserve">    assert "dashboard" in </w:t>
+      </w:r>
+      <w:proofErr w:type="spellStart"/>
+      <w:r>
+        <w:rPr>
+          <w:rFonts w:ascii="Courier New" w:eastAsia="Times New Roman" w:hAnsi="Courier New" w:cs="Courier New"/>
+          <w:kern w:val="0"/>
+          <w:sz w:val="20"/>
+          <w:szCs w:val="20"/>
+          <w:lang w:eastAsia="en-IN" w:bidi="ta-IN"/>
+          <w14:ligatures w14:val="none"/>
+        </w:rPr>
+        <w:t>driver.current_url</w:t>
+      </w:r>
+      <w:proofErr w:type="spellEnd"/>
     </w:p>
     <w:p>
       <w:pPr>
@@ -2090,330 +2271,18 @@
         <w:t xml:space="preserve">    </w:t>
       </w:r>
       <w:proofErr w:type="spellStart"/>
-      <w:proofErr w:type="gramStart"/>
-      <w:r>
-        <w:rPr>
-          <w:rFonts w:ascii="Courier New" w:eastAsia="Times New Roman" w:hAnsi="Courier New" w:cs="Courier New"/>
-          <w:kern w:val="0"/>
-          <w:sz w:val="20"/>
-          <w:szCs w:val="20"/>
-          <w:lang w:eastAsia="en-IN" w:bidi="ta-IN"/>
-          <w14:ligatures w14:val="none"/>
-        </w:rPr>
-        <w:t>driver.find</w:t>
-      </w:r>
-      <w:proofErr w:type="gramEnd"/>
-      <w:r>
-        <w:rPr>
-          <w:rFonts w:ascii="Courier New" w:eastAsia="Times New Roman" w:hAnsi="Courier New" w:cs="Courier New"/>
-          <w:kern w:val="0"/>
-          <w:sz w:val="20"/>
-          <w:szCs w:val="20"/>
-          <w:lang w:eastAsia="en-IN" w:bidi="ta-IN"/>
-          <w14:ligatures w14:val="none"/>
-        </w:rPr>
-        <w:t>_element_by_id</w:t>
+      <w:r>
+        <w:rPr>
+          <w:rFonts w:ascii="Courier New" w:eastAsia="Times New Roman" w:hAnsi="Courier New" w:cs="Courier New"/>
+          <w:kern w:val="0"/>
+          <w:sz w:val="20"/>
+          <w:szCs w:val="20"/>
+          <w:lang w:eastAsia="en-IN" w:bidi="ta-IN"/>
+          <w14:ligatures w14:val="none"/>
+        </w:rPr>
+        <w:t>driver.quit</w:t>
       </w:r>
       <w:proofErr w:type="spellEnd"/>
-      <w:r>
-        <w:rPr>
-          <w:rFonts w:ascii="Courier New" w:eastAsia="Times New Roman" w:hAnsi="Courier New" w:cs="Courier New"/>
-          <w:kern w:val="0"/>
-          <w:sz w:val="20"/>
-          <w:szCs w:val="20"/>
-          <w:lang w:eastAsia="en-IN" w:bidi="ta-IN"/>
-          <w14:ligatures w14:val="none"/>
-        </w:rPr>
-        <w:t>("login-button").click()</w:t>
-      </w:r>
-    </w:p>
-    <w:p>
-      <w:pPr>
-        <w:tabs>
-          <w:tab w:val="left" w:pos="916"/>
-          <w:tab w:val="left" w:pos="1832"/>
-          <w:tab w:val="left" w:pos="2748"/>
-          <w:tab w:val="left" w:pos="3664"/>
-          <w:tab w:val="left" w:pos="4580"/>
-          <w:tab w:val="left" w:pos="5496"/>
-          <w:tab w:val="left" w:pos="6412"/>
-          <w:tab w:val="left" w:pos="7328"/>
-          <w:tab w:val="left" w:pos="8244"/>
-          <w:tab w:val="left" w:pos="9160"/>
-          <w:tab w:val="left" w:pos="10076"/>
-          <w:tab w:val="left" w:pos="10992"/>
-          <w:tab w:val="left" w:pos="11908"/>
-          <w:tab w:val="left" w:pos="12824"/>
-          <w:tab w:val="left" w:pos="13740"/>
-          <w:tab w:val="left" w:pos="14656"/>
-        </w:tabs>
-        <w:spacing w:after="0" w:line="240" w:lineRule="auto"/>
-        <w:rPr>
-          <w:rFonts w:ascii="Courier New" w:eastAsia="Times New Roman" w:hAnsi="Courier New" w:cs="Courier New"/>
-          <w:kern w:val="0"/>
-          <w:sz w:val="20"/>
-          <w:szCs w:val="20"/>
-          <w:lang w:eastAsia="en-IN" w:bidi="ta-IN"/>
-          <w14:ligatures w14:val="none"/>
-        </w:rPr>
-      </w:pPr>
-    </w:p>
-    <w:p>
-      <w:pPr>
-        <w:tabs>
-          <w:tab w:val="left" w:pos="916"/>
-          <w:tab w:val="left" w:pos="1832"/>
-          <w:tab w:val="left" w:pos="2748"/>
-          <w:tab w:val="left" w:pos="3664"/>
-          <w:tab w:val="left" w:pos="4580"/>
-          <w:tab w:val="left" w:pos="5496"/>
-          <w:tab w:val="left" w:pos="6412"/>
-          <w:tab w:val="left" w:pos="7328"/>
-          <w:tab w:val="left" w:pos="8244"/>
-          <w:tab w:val="left" w:pos="9160"/>
-          <w:tab w:val="left" w:pos="10076"/>
-          <w:tab w:val="left" w:pos="10992"/>
-          <w:tab w:val="left" w:pos="11908"/>
-          <w:tab w:val="left" w:pos="12824"/>
-          <w:tab w:val="left" w:pos="13740"/>
-          <w:tab w:val="left" w:pos="14656"/>
-        </w:tabs>
-        <w:spacing w:after="0" w:line="240" w:lineRule="auto"/>
-        <w:rPr>
-          <w:rFonts w:ascii="Courier New" w:eastAsia="Times New Roman" w:hAnsi="Courier New" w:cs="Courier New"/>
-          <w:kern w:val="0"/>
-          <w:sz w:val="20"/>
-          <w:szCs w:val="20"/>
-          <w:lang w:eastAsia="en-IN" w:bidi="ta-IN"/>
-          <w14:ligatures w14:val="none"/>
-        </w:rPr>
-      </w:pPr>
-      <w:r>
-        <w:rPr>
-          <w:rFonts w:ascii="Courier New" w:eastAsia="Times New Roman" w:hAnsi="Courier New" w:cs="Courier New"/>
-          <w:kern w:val="0"/>
-          <w:sz w:val="20"/>
-          <w:szCs w:val="20"/>
-          <w:lang w:eastAsia="en-IN" w:bidi="ta-IN"/>
-          <w14:ligatures w14:val="none"/>
-        </w:rPr>
-        <w:t>@</w:t>
-      </w:r>
-      <w:proofErr w:type="gramStart"/>
-      <w:r>
-        <w:rPr>
-          <w:rFonts w:ascii="Courier New" w:eastAsia="Times New Roman" w:hAnsi="Courier New" w:cs="Courier New"/>
-          <w:kern w:val="0"/>
-          <w:sz w:val="20"/>
-          <w:szCs w:val="20"/>
-          <w:lang w:eastAsia="en-IN" w:bidi="ta-IN"/>
-          <w14:ligatures w14:val="none"/>
-        </w:rPr>
-        <w:t>then(</w:t>
-      </w:r>
-      <w:proofErr w:type="gramEnd"/>
-      <w:r>
-        <w:rPr>
-          <w:rFonts w:ascii="Courier New" w:eastAsia="Times New Roman" w:hAnsi="Courier New" w:cs="Courier New"/>
-          <w:kern w:val="0"/>
-          <w:sz w:val="20"/>
-          <w:szCs w:val="20"/>
-          <w:lang w:eastAsia="en-IN" w:bidi="ta-IN"/>
-          <w14:ligatures w14:val="none"/>
-        </w:rPr>
-        <w:t>"the user should be redirected to the dashboard")</w:t>
-      </w:r>
-    </w:p>
-    <w:p>
-      <w:pPr>
-        <w:tabs>
-          <w:tab w:val="left" w:pos="916"/>
-          <w:tab w:val="left" w:pos="1832"/>
-          <w:tab w:val="left" w:pos="2748"/>
-          <w:tab w:val="left" w:pos="3664"/>
-          <w:tab w:val="left" w:pos="4580"/>
-          <w:tab w:val="left" w:pos="5496"/>
-          <w:tab w:val="left" w:pos="6412"/>
-          <w:tab w:val="left" w:pos="7328"/>
-          <w:tab w:val="left" w:pos="8244"/>
-          <w:tab w:val="left" w:pos="9160"/>
-          <w:tab w:val="left" w:pos="10076"/>
-          <w:tab w:val="left" w:pos="10992"/>
-          <w:tab w:val="left" w:pos="11908"/>
-          <w:tab w:val="left" w:pos="12824"/>
-          <w:tab w:val="left" w:pos="13740"/>
-          <w:tab w:val="left" w:pos="14656"/>
-        </w:tabs>
-        <w:spacing w:after="0" w:line="240" w:lineRule="auto"/>
-        <w:rPr>
-          <w:rFonts w:ascii="Courier New" w:eastAsia="Times New Roman" w:hAnsi="Courier New" w:cs="Courier New"/>
-          <w:kern w:val="0"/>
-          <w:sz w:val="20"/>
-          <w:szCs w:val="20"/>
-          <w:lang w:eastAsia="en-IN" w:bidi="ta-IN"/>
-          <w14:ligatures w14:val="none"/>
-        </w:rPr>
-      </w:pPr>
-      <w:r>
-        <w:rPr>
-          <w:rFonts w:ascii="Courier New" w:eastAsia="Times New Roman" w:hAnsi="Courier New" w:cs="Courier New"/>
-          <w:kern w:val="0"/>
-          <w:sz w:val="20"/>
-          <w:szCs w:val="20"/>
-          <w:lang w:eastAsia="en-IN" w:bidi="ta-IN"/>
-          <w14:ligatures w14:val="none"/>
-        </w:rPr>
-        <w:t xml:space="preserve">def </w:t>
-      </w:r>
-      <w:proofErr w:type="spellStart"/>
-      <w:r>
-        <w:rPr>
-          <w:rFonts w:ascii="Courier New" w:eastAsia="Times New Roman" w:hAnsi="Courier New" w:cs="Courier New"/>
-          <w:kern w:val="0"/>
-          <w:sz w:val="20"/>
-          <w:szCs w:val="20"/>
-          <w:lang w:eastAsia="en-IN" w:bidi="ta-IN"/>
-          <w14:ligatures w14:val="none"/>
-        </w:rPr>
-        <w:t>step_then_user_redirected_to_dashboard</w:t>
-      </w:r>
-      <w:proofErr w:type="spellEnd"/>
-      <w:r>
-        <w:rPr>
-          <w:rFonts w:ascii="Courier New" w:eastAsia="Times New Roman" w:hAnsi="Courier New" w:cs="Courier New"/>
-          <w:kern w:val="0"/>
-          <w:sz w:val="20"/>
-          <w:szCs w:val="20"/>
-          <w:lang w:eastAsia="en-IN" w:bidi="ta-IN"/>
-          <w14:ligatures w14:val="none"/>
-        </w:rPr>
-        <w:t>(context):</w:t>
-      </w:r>
-    </w:p>
-    <w:p>
-      <w:pPr>
-        <w:tabs>
-          <w:tab w:val="left" w:pos="916"/>
-          <w:tab w:val="left" w:pos="1832"/>
-          <w:tab w:val="left" w:pos="2748"/>
-          <w:tab w:val="left" w:pos="3664"/>
-          <w:tab w:val="left" w:pos="4580"/>
-          <w:tab w:val="left" w:pos="5496"/>
-          <w:tab w:val="left" w:pos="6412"/>
-          <w:tab w:val="left" w:pos="7328"/>
-          <w:tab w:val="left" w:pos="8244"/>
-          <w:tab w:val="left" w:pos="9160"/>
-          <w:tab w:val="left" w:pos="10076"/>
-          <w:tab w:val="left" w:pos="10992"/>
-          <w:tab w:val="left" w:pos="11908"/>
-          <w:tab w:val="left" w:pos="12824"/>
-          <w:tab w:val="left" w:pos="13740"/>
-          <w:tab w:val="left" w:pos="14656"/>
-        </w:tabs>
-        <w:spacing w:after="0" w:line="240" w:lineRule="auto"/>
-        <w:rPr>
-          <w:rFonts w:ascii="Courier New" w:eastAsia="Times New Roman" w:hAnsi="Courier New" w:cs="Courier New"/>
-          <w:kern w:val="0"/>
-          <w:sz w:val="20"/>
-          <w:szCs w:val="20"/>
-          <w:lang w:eastAsia="en-IN" w:bidi="ta-IN"/>
-          <w14:ligatures w14:val="none"/>
-        </w:rPr>
-      </w:pPr>
-      <w:r>
-        <w:rPr>
-          <w:rFonts w:ascii="Courier New" w:eastAsia="Times New Roman" w:hAnsi="Courier New" w:cs="Courier New"/>
-          <w:kern w:val="0"/>
-          <w:sz w:val="20"/>
-          <w:szCs w:val="20"/>
-          <w:lang w:eastAsia="en-IN" w:bidi="ta-IN"/>
-          <w14:ligatures w14:val="none"/>
-        </w:rPr>
-        <w:t xml:space="preserve">    assert "dashboard" in </w:t>
-      </w:r>
-      <w:proofErr w:type="spellStart"/>
-      <w:proofErr w:type="gramStart"/>
-      <w:r>
-        <w:rPr>
-          <w:rFonts w:ascii="Courier New" w:eastAsia="Times New Roman" w:hAnsi="Courier New" w:cs="Courier New"/>
-          <w:kern w:val="0"/>
-          <w:sz w:val="20"/>
-          <w:szCs w:val="20"/>
-          <w:lang w:eastAsia="en-IN" w:bidi="ta-IN"/>
-          <w14:ligatures w14:val="none"/>
-        </w:rPr>
-        <w:t>driver.current</w:t>
-      </w:r>
-      <w:proofErr w:type="gramEnd"/>
-      <w:r>
-        <w:rPr>
-          <w:rFonts w:ascii="Courier New" w:eastAsia="Times New Roman" w:hAnsi="Courier New" w:cs="Courier New"/>
-          <w:kern w:val="0"/>
-          <w:sz w:val="20"/>
-          <w:szCs w:val="20"/>
-          <w:lang w:eastAsia="en-IN" w:bidi="ta-IN"/>
-          <w14:ligatures w14:val="none"/>
-        </w:rPr>
-        <w:t>_url</w:t>
-      </w:r>
-      <w:proofErr w:type="spellEnd"/>
-    </w:p>
-    <w:p>
-      <w:pPr>
-        <w:tabs>
-          <w:tab w:val="left" w:pos="916"/>
-          <w:tab w:val="left" w:pos="1832"/>
-          <w:tab w:val="left" w:pos="2748"/>
-          <w:tab w:val="left" w:pos="3664"/>
-          <w:tab w:val="left" w:pos="4580"/>
-          <w:tab w:val="left" w:pos="5496"/>
-          <w:tab w:val="left" w:pos="6412"/>
-          <w:tab w:val="left" w:pos="7328"/>
-          <w:tab w:val="left" w:pos="8244"/>
-          <w:tab w:val="left" w:pos="9160"/>
-          <w:tab w:val="left" w:pos="10076"/>
-          <w:tab w:val="left" w:pos="10992"/>
-          <w:tab w:val="left" w:pos="11908"/>
-          <w:tab w:val="left" w:pos="12824"/>
-          <w:tab w:val="left" w:pos="13740"/>
-          <w:tab w:val="left" w:pos="14656"/>
-        </w:tabs>
-        <w:spacing w:after="0" w:line="240" w:lineRule="auto"/>
-        <w:rPr>
-          <w:rFonts w:ascii="Courier New" w:eastAsia="Times New Roman" w:hAnsi="Courier New" w:cs="Courier New"/>
-          <w:kern w:val="0"/>
-          <w:sz w:val="20"/>
-          <w:szCs w:val="20"/>
-          <w:lang w:eastAsia="en-IN" w:bidi="ta-IN"/>
-          <w14:ligatures w14:val="none"/>
-        </w:rPr>
-      </w:pPr>
-      <w:r>
-        <w:rPr>
-          <w:rFonts w:ascii="Courier New" w:eastAsia="Times New Roman" w:hAnsi="Courier New" w:cs="Courier New"/>
-          <w:kern w:val="0"/>
-          <w:sz w:val="20"/>
-          <w:szCs w:val="20"/>
-          <w:lang w:eastAsia="en-IN" w:bidi="ta-IN"/>
-          <w14:ligatures w14:val="none"/>
-        </w:rPr>
-        <w:t xml:space="preserve">    </w:t>
-      </w:r>
-      <w:proofErr w:type="spellStart"/>
-      <w:proofErr w:type="gramStart"/>
-      <w:r>
-        <w:rPr>
-          <w:rFonts w:ascii="Courier New" w:eastAsia="Times New Roman" w:hAnsi="Courier New" w:cs="Courier New"/>
-          <w:kern w:val="0"/>
-          <w:sz w:val="20"/>
-          <w:szCs w:val="20"/>
-          <w:lang w:eastAsia="en-IN" w:bidi="ta-IN"/>
-          <w14:ligatures w14:val="none"/>
-        </w:rPr>
-        <w:t>driver.quit</w:t>
-      </w:r>
-      <w:proofErr w:type="spellEnd"/>
-      <w:proofErr w:type="gramEnd"/>
       <w:r>
         <w:rPr>
           <w:rFonts w:ascii="Courier New" w:eastAsia="Times New Roman" w:hAnsi="Courier New" w:cs="Courier New"/>
@@ -2565,7 +2434,7 @@
           <w14:ligatures w14:val="none"/>
         </w:rPr>
         <w:pict w14:anchorId="310B276E">
-          <v:rect id="_x0000_i1153" style="width:0;height:1.5pt" o:hralign="center" o:hrstd="t" o:hr="t" fillcolor="#a0a0a0" stroked="f"/>
+          <v:rect id="_x0000_i1027" style="width:0;height:1.5pt" o:hralign="center" o:hrstd="t" o:hr="t" fillcolor="#a0a0a0" stroked="f"/>
         </w:pict>
       </w:r>
     </w:p>
@@ -2996,19 +2865,7 @@
           <w:lang w:eastAsia="en-IN" w:bidi="ta-IN"/>
           <w14:ligatures w14:val="none"/>
         </w:rPr>
-        <w:t>io.cucumber.java.</w:t>
-      </w:r>
-      <w:proofErr w:type="gramStart"/>
-      <w:r>
-        <w:rPr>
-          <w:rFonts w:ascii="Courier New" w:eastAsia="Times New Roman" w:hAnsi="Courier New" w:cs="Courier New"/>
-          <w:kern w:val="0"/>
-          <w:sz w:val="20"/>
-          <w:szCs w:val="20"/>
-          <w:lang w:eastAsia="en-IN" w:bidi="ta-IN"/>
-          <w14:ligatures w14:val="none"/>
-        </w:rPr>
-        <w:t>en</w:t>
+        <w:t>io.cucumber.java.en</w:t>
       </w:r>
       <w:proofErr w:type="spellEnd"/>
       <w:r>
@@ -3020,9 +2877,63 @@
           <w:lang w:eastAsia="en-IN" w:bidi="ta-IN"/>
           <w14:ligatures w14:val="none"/>
         </w:rPr>
-        <w:t>.*</w:t>
-      </w:r>
-      <w:proofErr w:type="gramEnd"/>
+        <w:t>.*;</w:t>
+      </w:r>
+    </w:p>
+    <w:p>
+      <w:pPr>
+        <w:tabs>
+          <w:tab w:val="left" w:pos="916"/>
+          <w:tab w:val="left" w:pos="1832"/>
+          <w:tab w:val="left" w:pos="2748"/>
+          <w:tab w:val="left" w:pos="3664"/>
+          <w:tab w:val="left" w:pos="4580"/>
+          <w:tab w:val="left" w:pos="5496"/>
+          <w:tab w:val="left" w:pos="6412"/>
+          <w:tab w:val="left" w:pos="7328"/>
+          <w:tab w:val="left" w:pos="8244"/>
+          <w:tab w:val="left" w:pos="9160"/>
+          <w:tab w:val="left" w:pos="10076"/>
+          <w:tab w:val="left" w:pos="10992"/>
+          <w:tab w:val="left" w:pos="11908"/>
+          <w:tab w:val="left" w:pos="12824"/>
+          <w:tab w:val="left" w:pos="13740"/>
+          <w:tab w:val="left" w:pos="14656"/>
+        </w:tabs>
+        <w:spacing w:after="0" w:line="240" w:lineRule="auto"/>
+        <w:rPr>
+          <w:rFonts w:ascii="Courier New" w:eastAsia="Times New Roman" w:hAnsi="Courier New" w:cs="Courier New"/>
+          <w:kern w:val="0"/>
+          <w:sz w:val="20"/>
+          <w:szCs w:val="20"/>
+          <w:lang w:eastAsia="en-IN" w:bidi="ta-IN"/>
+          <w14:ligatures w14:val="none"/>
+        </w:rPr>
+      </w:pPr>
+      <w:r>
+        <w:rPr>
+          <w:rFonts w:ascii="Courier New" w:eastAsia="Times New Roman" w:hAnsi="Courier New" w:cs="Courier New"/>
+          <w:kern w:val="0"/>
+          <w:sz w:val="20"/>
+          <w:szCs w:val="20"/>
+          <w:lang w:eastAsia="en-IN" w:bidi="ta-IN"/>
+          <w14:ligatures w14:val="none"/>
+        </w:rPr>
+        <w:t xml:space="preserve">import </w:t>
+      </w:r>
+      <w:proofErr w:type="spellStart"/>
+      <w:r>
+        <w:rPr>
+          <w:rFonts w:ascii="Courier New" w:eastAsia="Times New Roman" w:hAnsi="Courier New" w:cs="Courier New"/>
+          <w:kern w:val="0"/>
+          <w:sz w:val="20"/>
+          <w:szCs w:val="20"/>
+          <w:lang w:eastAsia="en-IN" w:bidi="ta-IN"/>
+          <w14:ligatures w14:val="none"/>
+        </w:rPr>
+        <w:t>org.openqa.selenium.By</w:t>
+      </w:r>
+      <w:proofErr w:type="spellEnd"/>
       <w:r>
         <w:rPr>
           <w:rFonts w:ascii="Courier New" w:eastAsia="Times New Roman" w:hAnsi="Courier New" w:cs="Courier New"/>
@@ -3077,29 +2988,16 @@
         <w:t xml:space="preserve">import </w:t>
       </w:r>
       <w:proofErr w:type="spellStart"/>
-      <w:proofErr w:type="gramStart"/>
-      <w:r>
-        <w:rPr>
-          <w:rFonts w:ascii="Courier New" w:eastAsia="Times New Roman" w:hAnsi="Courier New" w:cs="Courier New"/>
-          <w:kern w:val="0"/>
-          <w:sz w:val="20"/>
-          <w:szCs w:val="20"/>
-          <w:lang w:eastAsia="en-IN" w:bidi="ta-IN"/>
-          <w14:ligatures w14:val="none"/>
-        </w:rPr>
-        <w:t>org.openqa</w:t>
-      </w:r>
-      <w:proofErr w:type="gramEnd"/>
-      <w:r>
-        <w:rPr>
-          <w:rFonts w:ascii="Courier New" w:eastAsia="Times New Roman" w:hAnsi="Courier New" w:cs="Courier New"/>
-          <w:kern w:val="0"/>
-          <w:sz w:val="20"/>
-          <w:szCs w:val="20"/>
-          <w:lang w:eastAsia="en-IN" w:bidi="ta-IN"/>
-          <w14:ligatures w14:val="none"/>
-        </w:rPr>
-        <w:t>.selenium.By</w:t>
+      <w:r>
+        <w:rPr>
+          <w:rFonts w:ascii="Courier New" w:eastAsia="Times New Roman" w:hAnsi="Courier New" w:cs="Courier New"/>
+          <w:kern w:val="0"/>
+          <w:sz w:val="20"/>
+          <w:szCs w:val="20"/>
+          <w:lang w:eastAsia="en-IN" w:bidi="ta-IN"/>
+          <w14:ligatures w14:val="none"/>
+        </w:rPr>
+        <w:t>org.openqa.selenium.WebDriver</w:t>
       </w:r>
       <w:proofErr w:type="spellEnd"/>
       <w:r>
@@ -3156,29 +3054,16 @@
         <w:t xml:space="preserve">import </w:t>
       </w:r>
       <w:proofErr w:type="spellStart"/>
-      <w:proofErr w:type="gramStart"/>
-      <w:r>
-        <w:rPr>
-          <w:rFonts w:ascii="Courier New" w:eastAsia="Times New Roman" w:hAnsi="Courier New" w:cs="Courier New"/>
-          <w:kern w:val="0"/>
-          <w:sz w:val="20"/>
-          <w:szCs w:val="20"/>
-          <w:lang w:eastAsia="en-IN" w:bidi="ta-IN"/>
-          <w14:ligatures w14:val="none"/>
-        </w:rPr>
-        <w:t>org.openqa</w:t>
-      </w:r>
-      <w:proofErr w:type="gramEnd"/>
-      <w:r>
-        <w:rPr>
-          <w:rFonts w:ascii="Courier New" w:eastAsia="Times New Roman" w:hAnsi="Courier New" w:cs="Courier New"/>
-          <w:kern w:val="0"/>
-          <w:sz w:val="20"/>
-          <w:szCs w:val="20"/>
-          <w:lang w:eastAsia="en-IN" w:bidi="ta-IN"/>
-          <w14:ligatures w14:val="none"/>
-        </w:rPr>
-        <w:t>.selenium.WebDriver</w:t>
+      <w:r>
+        <w:rPr>
+          <w:rFonts w:ascii="Courier New" w:eastAsia="Times New Roman" w:hAnsi="Courier New" w:cs="Courier New"/>
+          <w:kern w:val="0"/>
+          <w:sz w:val="20"/>
+          <w:szCs w:val="20"/>
+          <w:lang w:eastAsia="en-IN" w:bidi="ta-IN"/>
+          <w14:ligatures w14:val="none"/>
+        </w:rPr>
+        <w:t>org.openqa.selenium.chrome.ChromeDriver</w:t>
       </w:r>
       <w:proofErr w:type="spellEnd"/>
       <w:r>
@@ -3223,41 +3108,59 @@
           <w14:ligatures w14:val="none"/>
         </w:rPr>
       </w:pPr>
-      <w:r>
-        <w:rPr>
-          <w:rFonts w:ascii="Courier New" w:eastAsia="Times New Roman" w:hAnsi="Courier New" w:cs="Courier New"/>
-          <w:kern w:val="0"/>
-          <w:sz w:val="20"/>
-          <w:szCs w:val="20"/>
-          <w:lang w:eastAsia="en-IN" w:bidi="ta-IN"/>
-          <w14:ligatures w14:val="none"/>
-        </w:rPr>
-        <w:t xml:space="preserve">import </w:t>
+    </w:p>
+    <w:p>
+      <w:pPr>
+        <w:tabs>
+          <w:tab w:val="left" w:pos="916"/>
+          <w:tab w:val="left" w:pos="1832"/>
+          <w:tab w:val="left" w:pos="2748"/>
+          <w:tab w:val="left" w:pos="3664"/>
+          <w:tab w:val="left" w:pos="4580"/>
+          <w:tab w:val="left" w:pos="5496"/>
+          <w:tab w:val="left" w:pos="6412"/>
+          <w:tab w:val="left" w:pos="7328"/>
+          <w:tab w:val="left" w:pos="8244"/>
+          <w:tab w:val="left" w:pos="9160"/>
+          <w:tab w:val="left" w:pos="10076"/>
+          <w:tab w:val="left" w:pos="10992"/>
+          <w:tab w:val="left" w:pos="11908"/>
+          <w:tab w:val="left" w:pos="12824"/>
+          <w:tab w:val="left" w:pos="13740"/>
+          <w:tab w:val="left" w:pos="14656"/>
+        </w:tabs>
+        <w:spacing w:after="0" w:line="240" w:lineRule="auto"/>
+        <w:rPr>
+          <w:rFonts w:ascii="Courier New" w:eastAsia="Times New Roman" w:hAnsi="Courier New" w:cs="Courier New"/>
+          <w:kern w:val="0"/>
+          <w:sz w:val="20"/>
+          <w:szCs w:val="20"/>
+          <w:lang w:eastAsia="en-IN" w:bidi="ta-IN"/>
+          <w14:ligatures w14:val="none"/>
+        </w:rPr>
+      </w:pPr>
+      <w:r>
+        <w:rPr>
+          <w:rFonts w:ascii="Courier New" w:eastAsia="Times New Roman" w:hAnsi="Courier New" w:cs="Courier New"/>
+          <w:kern w:val="0"/>
+          <w:sz w:val="20"/>
+          <w:szCs w:val="20"/>
+          <w:lang w:eastAsia="en-IN" w:bidi="ta-IN"/>
+          <w14:ligatures w14:val="none"/>
+        </w:rPr>
+        <w:t xml:space="preserve">public class </w:t>
       </w:r>
       <w:proofErr w:type="spellStart"/>
-      <w:proofErr w:type="gramStart"/>
-      <w:r>
-        <w:rPr>
-          <w:rFonts w:ascii="Courier New" w:eastAsia="Times New Roman" w:hAnsi="Courier New" w:cs="Courier New"/>
-          <w:kern w:val="0"/>
-          <w:sz w:val="20"/>
-          <w:szCs w:val="20"/>
-          <w:lang w:eastAsia="en-IN" w:bidi="ta-IN"/>
-          <w14:ligatures w14:val="none"/>
-        </w:rPr>
-        <w:t>org.openqa</w:t>
-      </w:r>
-      <w:proofErr w:type="gramEnd"/>
-      <w:r>
-        <w:rPr>
-          <w:rFonts w:ascii="Courier New" w:eastAsia="Times New Roman" w:hAnsi="Courier New" w:cs="Courier New"/>
-          <w:kern w:val="0"/>
-          <w:sz w:val="20"/>
-          <w:szCs w:val="20"/>
-          <w:lang w:eastAsia="en-IN" w:bidi="ta-IN"/>
-          <w14:ligatures w14:val="none"/>
-        </w:rPr>
-        <w:t>.selenium.chrome.ChromeDriver</w:t>
+      <w:r>
+        <w:rPr>
+          <w:rFonts w:ascii="Courier New" w:eastAsia="Times New Roman" w:hAnsi="Courier New" w:cs="Courier New"/>
+          <w:kern w:val="0"/>
+          <w:sz w:val="20"/>
+          <w:szCs w:val="20"/>
+          <w:lang w:eastAsia="en-IN" w:bidi="ta-IN"/>
+          <w14:ligatures w14:val="none"/>
+        </w:rPr>
+        <w:t>LoginSteps</w:t>
       </w:r>
       <w:proofErr w:type="spellEnd"/>
       <w:r>
@@ -3269,80 +3172,164 @@
           <w:lang w:eastAsia="en-IN" w:bidi="ta-IN"/>
           <w14:ligatures w14:val="none"/>
         </w:rPr>
-        <w:t>;</w:t>
-      </w:r>
-    </w:p>
-    <w:p>
-      <w:pPr>
-        <w:tabs>
-          <w:tab w:val="left" w:pos="916"/>
-          <w:tab w:val="left" w:pos="1832"/>
-          <w:tab w:val="left" w:pos="2748"/>
-          <w:tab w:val="left" w:pos="3664"/>
-          <w:tab w:val="left" w:pos="4580"/>
-          <w:tab w:val="left" w:pos="5496"/>
-          <w:tab w:val="left" w:pos="6412"/>
-          <w:tab w:val="left" w:pos="7328"/>
-          <w:tab w:val="left" w:pos="8244"/>
-          <w:tab w:val="left" w:pos="9160"/>
-          <w:tab w:val="left" w:pos="10076"/>
-          <w:tab w:val="left" w:pos="10992"/>
-          <w:tab w:val="left" w:pos="11908"/>
-          <w:tab w:val="left" w:pos="12824"/>
-          <w:tab w:val="left" w:pos="13740"/>
-          <w:tab w:val="left" w:pos="14656"/>
-        </w:tabs>
-        <w:spacing w:after="0" w:line="240" w:lineRule="auto"/>
-        <w:rPr>
-          <w:rFonts w:ascii="Courier New" w:eastAsia="Times New Roman" w:hAnsi="Courier New" w:cs="Courier New"/>
-          <w:kern w:val="0"/>
-          <w:sz w:val="20"/>
-          <w:szCs w:val="20"/>
-          <w:lang w:eastAsia="en-IN" w:bidi="ta-IN"/>
-          <w14:ligatures w14:val="none"/>
-        </w:rPr>
-      </w:pPr>
-    </w:p>
-    <w:p>
-      <w:pPr>
-        <w:tabs>
-          <w:tab w:val="left" w:pos="916"/>
-          <w:tab w:val="left" w:pos="1832"/>
-          <w:tab w:val="left" w:pos="2748"/>
-          <w:tab w:val="left" w:pos="3664"/>
-          <w:tab w:val="left" w:pos="4580"/>
-          <w:tab w:val="left" w:pos="5496"/>
-          <w:tab w:val="left" w:pos="6412"/>
-          <w:tab w:val="left" w:pos="7328"/>
-          <w:tab w:val="left" w:pos="8244"/>
-          <w:tab w:val="left" w:pos="9160"/>
-          <w:tab w:val="left" w:pos="10076"/>
-          <w:tab w:val="left" w:pos="10992"/>
-          <w:tab w:val="left" w:pos="11908"/>
-          <w:tab w:val="left" w:pos="12824"/>
-          <w:tab w:val="left" w:pos="13740"/>
-          <w:tab w:val="left" w:pos="14656"/>
-        </w:tabs>
-        <w:spacing w:after="0" w:line="240" w:lineRule="auto"/>
-        <w:rPr>
-          <w:rFonts w:ascii="Courier New" w:eastAsia="Times New Roman" w:hAnsi="Courier New" w:cs="Courier New"/>
-          <w:kern w:val="0"/>
-          <w:sz w:val="20"/>
-          <w:szCs w:val="20"/>
-          <w:lang w:eastAsia="en-IN" w:bidi="ta-IN"/>
-          <w14:ligatures w14:val="none"/>
-        </w:rPr>
-      </w:pPr>
-      <w:r>
-        <w:rPr>
-          <w:rFonts w:ascii="Courier New" w:eastAsia="Times New Roman" w:hAnsi="Courier New" w:cs="Courier New"/>
-          <w:kern w:val="0"/>
-          <w:sz w:val="20"/>
-          <w:szCs w:val="20"/>
-          <w:lang w:eastAsia="en-IN" w:bidi="ta-IN"/>
-          <w14:ligatures w14:val="none"/>
-        </w:rPr>
-        <w:t xml:space="preserve">public class </w:t>
+        <w:t xml:space="preserve"> {</w:t>
+      </w:r>
+    </w:p>
+    <w:p>
+      <w:pPr>
+        <w:tabs>
+          <w:tab w:val="left" w:pos="916"/>
+          <w:tab w:val="left" w:pos="1832"/>
+          <w:tab w:val="left" w:pos="2748"/>
+          <w:tab w:val="left" w:pos="3664"/>
+          <w:tab w:val="left" w:pos="4580"/>
+          <w:tab w:val="left" w:pos="5496"/>
+          <w:tab w:val="left" w:pos="6412"/>
+          <w:tab w:val="left" w:pos="7328"/>
+          <w:tab w:val="left" w:pos="8244"/>
+          <w:tab w:val="left" w:pos="9160"/>
+          <w:tab w:val="left" w:pos="10076"/>
+          <w:tab w:val="left" w:pos="10992"/>
+          <w:tab w:val="left" w:pos="11908"/>
+          <w:tab w:val="left" w:pos="12824"/>
+          <w:tab w:val="left" w:pos="13740"/>
+          <w:tab w:val="left" w:pos="14656"/>
+        </w:tabs>
+        <w:spacing w:after="0" w:line="240" w:lineRule="auto"/>
+        <w:rPr>
+          <w:rFonts w:ascii="Courier New" w:eastAsia="Times New Roman" w:hAnsi="Courier New" w:cs="Courier New"/>
+          <w:kern w:val="0"/>
+          <w:sz w:val="20"/>
+          <w:szCs w:val="20"/>
+          <w:lang w:eastAsia="en-IN" w:bidi="ta-IN"/>
+          <w14:ligatures w14:val="none"/>
+        </w:rPr>
+      </w:pPr>
+      <w:r>
+        <w:rPr>
+          <w:rFonts w:ascii="Courier New" w:eastAsia="Times New Roman" w:hAnsi="Courier New" w:cs="Courier New"/>
+          <w:kern w:val="0"/>
+          <w:sz w:val="20"/>
+          <w:szCs w:val="20"/>
+          <w:lang w:eastAsia="en-IN" w:bidi="ta-IN"/>
+          <w14:ligatures w14:val="none"/>
+        </w:rPr>
+        <w:t xml:space="preserve">    WebDriver driver;</w:t>
+      </w:r>
+    </w:p>
+    <w:p>
+      <w:pPr>
+        <w:tabs>
+          <w:tab w:val="left" w:pos="916"/>
+          <w:tab w:val="left" w:pos="1832"/>
+          <w:tab w:val="left" w:pos="2748"/>
+          <w:tab w:val="left" w:pos="3664"/>
+          <w:tab w:val="left" w:pos="4580"/>
+          <w:tab w:val="left" w:pos="5496"/>
+          <w:tab w:val="left" w:pos="6412"/>
+          <w:tab w:val="left" w:pos="7328"/>
+          <w:tab w:val="left" w:pos="8244"/>
+          <w:tab w:val="left" w:pos="9160"/>
+          <w:tab w:val="left" w:pos="10076"/>
+          <w:tab w:val="left" w:pos="10992"/>
+          <w:tab w:val="left" w:pos="11908"/>
+          <w:tab w:val="left" w:pos="12824"/>
+          <w:tab w:val="left" w:pos="13740"/>
+          <w:tab w:val="left" w:pos="14656"/>
+        </w:tabs>
+        <w:spacing w:after="0" w:line="240" w:lineRule="auto"/>
+        <w:rPr>
+          <w:rFonts w:ascii="Courier New" w:eastAsia="Times New Roman" w:hAnsi="Courier New" w:cs="Courier New"/>
+          <w:kern w:val="0"/>
+          <w:sz w:val="20"/>
+          <w:szCs w:val="20"/>
+          <w:lang w:eastAsia="en-IN" w:bidi="ta-IN"/>
+          <w14:ligatures w14:val="none"/>
+        </w:rPr>
+      </w:pPr>
+    </w:p>
+    <w:p>
+      <w:pPr>
+        <w:tabs>
+          <w:tab w:val="left" w:pos="916"/>
+          <w:tab w:val="left" w:pos="1832"/>
+          <w:tab w:val="left" w:pos="2748"/>
+          <w:tab w:val="left" w:pos="3664"/>
+          <w:tab w:val="left" w:pos="4580"/>
+          <w:tab w:val="left" w:pos="5496"/>
+          <w:tab w:val="left" w:pos="6412"/>
+          <w:tab w:val="left" w:pos="7328"/>
+          <w:tab w:val="left" w:pos="8244"/>
+          <w:tab w:val="left" w:pos="9160"/>
+          <w:tab w:val="left" w:pos="10076"/>
+          <w:tab w:val="left" w:pos="10992"/>
+          <w:tab w:val="left" w:pos="11908"/>
+          <w:tab w:val="left" w:pos="12824"/>
+          <w:tab w:val="left" w:pos="13740"/>
+          <w:tab w:val="left" w:pos="14656"/>
+        </w:tabs>
+        <w:spacing w:after="0" w:line="240" w:lineRule="auto"/>
+        <w:rPr>
+          <w:rFonts w:ascii="Courier New" w:eastAsia="Times New Roman" w:hAnsi="Courier New" w:cs="Courier New"/>
+          <w:kern w:val="0"/>
+          <w:sz w:val="20"/>
+          <w:szCs w:val="20"/>
+          <w:lang w:eastAsia="en-IN" w:bidi="ta-IN"/>
+          <w14:ligatures w14:val="none"/>
+        </w:rPr>
+      </w:pPr>
+      <w:r>
+        <w:rPr>
+          <w:rFonts w:ascii="Courier New" w:eastAsia="Times New Roman" w:hAnsi="Courier New" w:cs="Courier New"/>
+          <w:kern w:val="0"/>
+          <w:sz w:val="20"/>
+          <w:szCs w:val="20"/>
+          <w:lang w:eastAsia="en-IN" w:bidi="ta-IN"/>
+          <w14:ligatures w14:val="none"/>
+        </w:rPr>
+        <w:t xml:space="preserve">    @Given("the user is on the login page")</w:t>
+      </w:r>
+    </w:p>
+    <w:p>
+      <w:pPr>
+        <w:tabs>
+          <w:tab w:val="left" w:pos="916"/>
+          <w:tab w:val="left" w:pos="1832"/>
+          <w:tab w:val="left" w:pos="2748"/>
+          <w:tab w:val="left" w:pos="3664"/>
+          <w:tab w:val="left" w:pos="4580"/>
+          <w:tab w:val="left" w:pos="5496"/>
+          <w:tab w:val="left" w:pos="6412"/>
+          <w:tab w:val="left" w:pos="7328"/>
+          <w:tab w:val="left" w:pos="8244"/>
+          <w:tab w:val="left" w:pos="9160"/>
+          <w:tab w:val="left" w:pos="10076"/>
+          <w:tab w:val="left" w:pos="10992"/>
+          <w:tab w:val="left" w:pos="11908"/>
+          <w:tab w:val="left" w:pos="12824"/>
+          <w:tab w:val="left" w:pos="13740"/>
+          <w:tab w:val="left" w:pos="14656"/>
+        </w:tabs>
+        <w:spacing w:after="0" w:line="240" w:lineRule="auto"/>
+        <w:rPr>
+          <w:rFonts w:ascii="Courier New" w:eastAsia="Times New Roman" w:hAnsi="Courier New" w:cs="Courier New"/>
+          <w:kern w:val="0"/>
+          <w:sz w:val="20"/>
+          <w:szCs w:val="20"/>
+          <w:lang w:eastAsia="en-IN" w:bidi="ta-IN"/>
+          <w14:ligatures w14:val="none"/>
+        </w:rPr>
+      </w:pPr>
+      <w:r>
+        <w:rPr>
+          <w:rFonts w:ascii="Courier New" w:eastAsia="Times New Roman" w:hAnsi="Courier New" w:cs="Courier New"/>
+          <w:kern w:val="0"/>
+          <w:sz w:val="20"/>
+          <w:szCs w:val="20"/>
+          <w:lang w:eastAsia="en-IN" w:bidi="ta-IN"/>
+          <w14:ligatures w14:val="none"/>
+        </w:rPr>
+        <w:t xml:space="preserve">    public void </w:t>
       </w:r>
       <w:proofErr w:type="spellStart"/>
       <w:r>
@@ -3354,7 +3341,7 @@
           <w:lang w:eastAsia="en-IN" w:bidi="ta-IN"/>
           <w14:ligatures w14:val="none"/>
         </w:rPr>
-        <w:t>LoginSteps</w:t>
+        <w:t>the_user_is_on_the_login_page</w:t>
       </w:r>
       <w:proofErr w:type="spellEnd"/>
       <w:r>
@@ -3366,146 +3353,254 @@
           <w:lang w:eastAsia="en-IN" w:bidi="ta-IN"/>
           <w14:ligatures w14:val="none"/>
         </w:rPr>
-        <w:t xml:space="preserve"> {</w:t>
-      </w:r>
-    </w:p>
-    <w:p>
-      <w:pPr>
-        <w:tabs>
-          <w:tab w:val="left" w:pos="916"/>
-          <w:tab w:val="left" w:pos="1832"/>
-          <w:tab w:val="left" w:pos="2748"/>
-          <w:tab w:val="left" w:pos="3664"/>
-          <w:tab w:val="left" w:pos="4580"/>
-          <w:tab w:val="left" w:pos="5496"/>
-          <w:tab w:val="left" w:pos="6412"/>
-          <w:tab w:val="left" w:pos="7328"/>
-          <w:tab w:val="left" w:pos="8244"/>
-          <w:tab w:val="left" w:pos="9160"/>
-          <w:tab w:val="left" w:pos="10076"/>
-          <w:tab w:val="left" w:pos="10992"/>
-          <w:tab w:val="left" w:pos="11908"/>
-          <w:tab w:val="left" w:pos="12824"/>
-          <w:tab w:val="left" w:pos="13740"/>
-          <w:tab w:val="left" w:pos="14656"/>
-        </w:tabs>
-        <w:spacing w:after="0" w:line="240" w:lineRule="auto"/>
-        <w:rPr>
-          <w:rFonts w:ascii="Courier New" w:eastAsia="Times New Roman" w:hAnsi="Courier New" w:cs="Courier New"/>
-          <w:kern w:val="0"/>
-          <w:sz w:val="20"/>
-          <w:szCs w:val="20"/>
-          <w:lang w:eastAsia="en-IN" w:bidi="ta-IN"/>
-          <w14:ligatures w14:val="none"/>
-        </w:rPr>
-      </w:pPr>
-      <w:r>
-        <w:rPr>
-          <w:rFonts w:ascii="Courier New" w:eastAsia="Times New Roman" w:hAnsi="Courier New" w:cs="Courier New"/>
-          <w:kern w:val="0"/>
-          <w:sz w:val="20"/>
-          <w:szCs w:val="20"/>
-          <w:lang w:eastAsia="en-IN" w:bidi="ta-IN"/>
-          <w14:ligatures w14:val="none"/>
-        </w:rPr>
-        <w:t xml:space="preserve">    WebDriver driver;</w:t>
-      </w:r>
-    </w:p>
-    <w:p>
-      <w:pPr>
-        <w:tabs>
-          <w:tab w:val="left" w:pos="916"/>
-          <w:tab w:val="left" w:pos="1832"/>
-          <w:tab w:val="left" w:pos="2748"/>
-          <w:tab w:val="left" w:pos="3664"/>
-          <w:tab w:val="left" w:pos="4580"/>
-          <w:tab w:val="left" w:pos="5496"/>
-          <w:tab w:val="left" w:pos="6412"/>
-          <w:tab w:val="left" w:pos="7328"/>
-          <w:tab w:val="left" w:pos="8244"/>
-          <w:tab w:val="left" w:pos="9160"/>
-          <w:tab w:val="left" w:pos="10076"/>
-          <w:tab w:val="left" w:pos="10992"/>
-          <w:tab w:val="left" w:pos="11908"/>
-          <w:tab w:val="left" w:pos="12824"/>
-          <w:tab w:val="left" w:pos="13740"/>
-          <w:tab w:val="left" w:pos="14656"/>
-        </w:tabs>
-        <w:spacing w:after="0" w:line="240" w:lineRule="auto"/>
-        <w:rPr>
-          <w:rFonts w:ascii="Courier New" w:eastAsia="Times New Roman" w:hAnsi="Courier New" w:cs="Courier New"/>
-          <w:kern w:val="0"/>
-          <w:sz w:val="20"/>
-          <w:szCs w:val="20"/>
-          <w:lang w:eastAsia="en-IN" w:bidi="ta-IN"/>
-          <w14:ligatures w14:val="none"/>
-        </w:rPr>
-      </w:pPr>
-    </w:p>
-    <w:p>
-      <w:pPr>
-        <w:tabs>
-          <w:tab w:val="left" w:pos="916"/>
-          <w:tab w:val="left" w:pos="1832"/>
-          <w:tab w:val="left" w:pos="2748"/>
-          <w:tab w:val="left" w:pos="3664"/>
-          <w:tab w:val="left" w:pos="4580"/>
-          <w:tab w:val="left" w:pos="5496"/>
-          <w:tab w:val="left" w:pos="6412"/>
-          <w:tab w:val="left" w:pos="7328"/>
-          <w:tab w:val="left" w:pos="8244"/>
-          <w:tab w:val="left" w:pos="9160"/>
-          <w:tab w:val="left" w:pos="10076"/>
-          <w:tab w:val="left" w:pos="10992"/>
-          <w:tab w:val="left" w:pos="11908"/>
-          <w:tab w:val="left" w:pos="12824"/>
-          <w:tab w:val="left" w:pos="13740"/>
-          <w:tab w:val="left" w:pos="14656"/>
-        </w:tabs>
-        <w:spacing w:after="0" w:line="240" w:lineRule="auto"/>
-        <w:rPr>
-          <w:rFonts w:ascii="Courier New" w:eastAsia="Times New Roman" w:hAnsi="Courier New" w:cs="Courier New"/>
-          <w:kern w:val="0"/>
-          <w:sz w:val="20"/>
-          <w:szCs w:val="20"/>
-          <w:lang w:eastAsia="en-IN" w:bidi="ta-IN"/>
-          <w14:ligatures w14:val="none"/>
-        </w:rPr>
-      </w:pPr>
-      <w:r>
-        <w:rPr>
-          <w:rFonts w:ascii="Courier New" w:eastAsia="Times New Roman" w:hAnsi="Courier New" w:cs="Courier New"/>
-          <w:kern w:val="0"/>
-          <w:sz w:val="20"/>
-          <w:szCs w:val="20"/>
-          <w:lang w:eastAsia="en-IN" w:bidi="ta-IN"/>
-          <w14:ligatures w14:val="none"/>
-        </w:rPr>
-        <w:t xml:space="preserve">    @</w:t>
-      </w:r>
-      <w:proofErr w:type="gramStart"/>
-      <w:r>
-        <w:rPr>
-          <w:rFonts w:ascii="Courier New" w:eastAsia="Times New Roman" w:hAnsi="Courier New" w:cs="Courier New"/>
-          <w:kern w:val="0"/>
-          <w:sz w:val="20"/>
-          <w:szCs w:val="20"/>
-          <w:lang w:eastAsia="en-IN" w:bidi="ta-IN"/>
-          <w14:ligatures w14:val="none"/>
-        </w:rPr>
-        <w:t>Given(</w:t>
-      </w:r>
-      <w:proofErr w:type="gramEnd"/>
-      <w:r>
-        <w:rPr>
-          <w:rFonts w:ascii="Courier New" w:eastAsia="Times New Roman" w:hAnsi="Courier New" w:cs="Courier New"/>
-          <w:kern w:val="0"/>
-          <w:sz w:val="20"/>
-          <w:szCs w:val="20"/>
-          <w:lang w:eastAsia="en-IN" w:bidi="ta-IN"/>
-          <w14:ligatures w14:val="none"/>
-        </w:rPr>
-        <w:t>"the user is on the login page")</w:t>
+        <w:t>() {</w:t>
+      </w:r>
+    </w:p>
+    <w:p>
+      <w:pPr>
+        <w:tabs>
+          <w:tab w:val="left" w:pos="916"/>
+          <w:tab w:val="left" w:pos="1832"/>
+          <w:tab w:val="left" w:pos="2748"/>
+          <w:tab w:val="left" w:pos="3664"/>
+          <w:tab w:val="left" w:pos="4580"/>
+          <w:tab w:val="left" w:pos="5496"/>
+          <w:tab w:val="left" w:pos="6412"/>
+          <w:tab w:val="left" w:pos="7328"/>
+          <w:tab w:val="left" w:pos="8244"/>
+          <w:tab w:val="left" w:pos="9160"/>
+          <w:tab w:val="left" w:pos="10076"/>
+          <w:tab w:val="left" w:pos="10992"/>
+          <w:tab w:val="left" w:pos="11908"/>
+          <w:tab w:val="left" w:pos="12824"/>
+          <w:tab w:val="left" w:pos="13740"/>
+          <w:tab w:val="left" w:pos="14656"/>
+        </w:tabs>
+        <w:spacing w:after="0" w:line="240" w:lineRule="auto"/>
+        <w:rPr>
+          <w:rFonts w:ascii="Courier New" w:eastAsia="Times New Roman" w:hAnsi="Courier New" w:cs="Courier New"/>
+          <w:kern w:val="0"/>
+          <w:sz w:val="20"/>
+          <w:szCs w:val="20"/>
+          <w:lang w:eastAsia="en-IN" w:bidi="ta-IN"/>
+          <w14:ligatures w14:val="none"/>
+        </w:rPr>
+      </w:pPr>
+      <w:r>
+        <w:rPr>
+          <w:rFonts w:ascii="Courier New" w:eastAsia="Times New Roman" w:hAnsi="Courier New" w:cs="Courier New"/>
+          <w:kern w:val="0"/>
+          <w:sz w:val="20"/>
+          <w:szCs w:val="20"/>
+          <w:lang w:eastAsia="en-IN" w:bidi="ta-IN"/>
+          <w14:ligatures w14:val="none"/>
+        </w:rPr>
+        <w:t xml:space="preserve">        driver = new </w:t>
+      </w:r>
+      <w:proofErr w:type="spellStart"/>
+      <w:r>
+        <w:rPr>
+          <w:rFonts w:ascii="Courier New" w:eastAsia="Times New Roman" w:hAnsi="Courier New" w:cs="Courier New"/>
+          <w:kern w:val="0"/>
+          <w:sz w:val="20"/>
+          <w:szCs w:val="20"/>
+          <w:lang w:eastAsia="en-IN" w:bidi="ta-IN"/>
+          <w14:ligatures w14:val="none"/>
+        </w:rPr>
+        <w:t>ChromeDriver</w:t>
+      </w:r>
+      <w:proofErr w:type="spellEnd"/>
+      <w:r>
+        <w:rPr>
+          <w:rFonts w:ascii="Courier New" w:eastAsia="Times New Roman" w:hAnsi="Courier New" w:cs="Courier New"/>
+          <w:kern w:val="0"/>
+          <w:sz w:val="20"/>
+          <w:szCs w:val="20"/>
+          <w:lang w:eastAsia="en-IN" w:bidi="ta-IN"/>
+          <w14:ligatures w14:val="none"/>
+        </w:rPr>
+        <w:t>();</w:t>
+      </w:r>
+    </w:p>
+    <w:p>
+      <w:pPr>
+        <w:tabs>
+          <w:tab w:val="left" w:pos="916"/>
+          <w:tab w:val="left" w:pos="1832"/>
+          <w:tab w:val="left" w:pos="2748"/>
+          <w:tab w:val="left" w:pos="3664"/>
+          <w:tab w:val="left" w:pos="4580"/>
+          <w:tab w:val="left" w:pos="5496"/>
+          <w:tab w:val="left" w:pos="6412"/>
+          <w:tab w:val="left" w:pos="7328"/>
+          <w:tab w:val="left" w:pos="8244"/>
+          <w:tab w:val="left" w:pos="9160"/>
+          <w:tab w:val="left" w:pos="10076"/>
+          <w:tab w:val="left" w:pos="10992"/>
+          <w:tab w:val="left" w:pos="11908"/>
+          <w:tab w:val="left" w:pos="12824"/>
+          <w:tab w:val="left" w:pos="13740"/>
+          <w:tab w:val="left" w:pos="14656"/>
+        </w:tabs>
+        <w:spacing w:after="0" w:line="240" w:lineRule="auto"/>
+        <w:rPr>
+          <w:rFonts w:ascii="Courier New" w:eastAsia="Times New Roman" w:hAnsi="Courier New" w:cs="Courier New"/>
+          <w:kern w:val="0"/>
+          <w:sz w:val="20"/>
+          <w:szCs w:val="20"/>
+          <w:lang w:eastAsia="en-IN" w:bidi="ta-IN"/>
+          <w14:ligatures w14:val="none"/>
+        </w:rPr>
+      </w:pPr>
+      <w:r>
+        <w:rPr>
+          <w:rFonts w:ascii="Courier New" w:eastAsia="Times New Roman" w:hAnsi="Courier New" w:cs="Courier New"/>
+          <w:kern w:val="0"/>
+          <w:sz w:val="20"/>
+          <w:szCs w:val="20"/>
+          <w:lang w:eastAsia="en-IN" w:bidi="ta-IN"/>
+          <w14:ligatures w14:val="none"/>
+        </w:rPr>
+        <w:t xml:space="preserve">        </w:t>
+      </w:r>
+      <w:proofErr w:type="spellStart"/>
+      <w:r>
+        <w:rPr>
+          <w:rFonts w:ascii="Courier New" w:eastAsia="Times New Roman" w:hAnsi="Courier New" w:cs="Courier New"/>
+          <w:kern w:val="0"/>
+          <w:sz w:val="20"/>
+          <w:szCs w:val="20"/>
+          <w:lang w:eastAsia="en-IN" w:bidi="ta-IN"/>
+          <w14:ligatures w14:val="none"/>
+        </w:rPr>
+        <w:t>driver.get</w:t>
+      </w:r>
+      <w:proofErr w:type="spellEnd"/>
+      <w:r>
+        <w:rPr>
+          <w:rFonts w:ascii="Courier New" w:eastAsia="Times New Roman" w:hAnsi="Courier New" w:cs="Courier New"/>
+          <w:kern w:val="0"/>
+          <w:sz w:val="20"/>
+          <w:szCs w:val="20"/>
+          <w:lang w:eastAsia="en-IN" w:bidi="ta-IN"/>
+          <w14:ligatures w14:val="none"/>
+        </w:rPr>
+        <w:t>("https://example.com/login");</w:t>
+      </w:r>
+    </w:p>
+    <w:p>
+      <w:pPr>
+        <w:tabs>
+          <w:tab w:val="left" w:pos="916"/>
+          <w:tab w:val="left" w:pos="1832"/>
+          <w:tab w:val="left" w:pos="2748"/>
+          <w:tab w:val="left" w:pos="3664"/>
+          <w:tab w:val="left" w:pos="4580"/>
+          <w:tab w:val="left" w:pos="5496"/>
+          <w:tab w:val="left" w:pos="6412"/>
+          <w:tab w:val="left" w:pos="7328"/>
+          <w:tab w:val="left" w:pos="8244"/>
+          <w:tab w:val="left" w:pos="9160"/>
+          <w:tab w:val="left" w:pos="10076"/>
+          <w:tab w:val="left" w:pos="10992"/>
+          <w:tab w:val="left" w:pos="11908"/>
+          <w:tab w:val="left" w:pos="12824"/>
+          <w:tab w:val="left" w:pos="13740"/>
+          <w:tab w:val="left" w:pos="14656"/>
+        </w:tabs>
+        <w:spacing w:after="0" w:line="240" w:lineRule="auto"/>
+        <w:rPr>
+          <w:rFonts w:ascii="Courier New" w:eastAsia="Times New Roman" w:hAnsi="Courier New" w:cs="Courier New"/>
+          <w:kern w:val="0"/>
+          <w:sz w:val="20"/>
+          <w:szCs w:val="20"/>
+          <w:lang w:eastAsia="en-IN" w:bidi="ta-IN"/>
+          <w14:ligatures w14:val="none"/>
+        </w:rPr>
+      </w:pPr>
+      <w:r>
+        <w:rPr>
+          <w:rFonts w:ascii="Courier New" w:eastAsia="Times New Roman" w:hAnsi="Courier New" w:cs="Courier New"/>
+          <w:kern w:val="0"/>
+          <w:sz w:val="20"/>
+          <w:szCs w:val="20"/>
+          <w:lang w:eastAsia="en-IN" w:bidi="ta-IN"/>
+          <w14:ligatures w14:val="none"/>
+        </w:rPr>
+        <w:t xml:space="preserve">    }</w:t>
+      </w:r>
+    </w:p>
+    <w:p>
+      <w:pPr>
+        <w:tabs>
+          <w:tab w:val="left" w:pos="916"/>
+          <w:tab w:val="left" w:pos="1832"/>
+          <w:tab w:val="left" w:pos="2748"/>
+          <w:tab w:val="left" w:pos="3664"/>
+          <w:tab w:val="left" w:pos="4580"/>
+          <w:tab w:val="left" w:pos="5496"/>
+          <w:tab w:val="left" w:pos="6412"/>
+          <w:tab w:val="left" w:pos="7328"/>
+          <w:tab w:val="left" w:pos="8244"/>
+          <w:tab w:val="left" w:pos="9160"/>
+          <w:tab w:val="left" w:pos="10076"/>
+          <w:tab w:val="left" w:pos="10992"/>
+          <w:tab w:val="left" w:pos="11908"/>
+          <w:tab w:val="left" w:pos="12824"/>
+          <w:tab w:val="left" w:pos="13740"/>
+          <w:tab w:val="left" w:pos="14656"/>
+        </w:tabs>
+        <w:spacing w:after="0" w:line="240" w:lineRule="auto"/>
+        <w:rPr>
+          <w:rFonts w:ascii="Courier New" w:eastAsia="Times New Roman" w:hAnsi="Courier New" w:cs="Courier New"/>
+          <w:kern w:val="0"/>
+          <w:sz w:val="20"/>
+          <w:szCs w:val="20"/>
+          <w:lang w:eastAsia="en-IN" w:bidi="ta-IN"/>
+          <w14:ligatures w14:val="none"/>
+        </w:rPr>
+      </w:pPr>
+    </w:p>
+    <w:p>
+      <w:pPr>
+        <w:tabs>
+          <w:tab w:val="left" w:pos="916"/>
+          <w:tab w:val="left" w:pos="1832"/>
+          <w:tab w:val="left" w:pos="2748"/>
+          <w:tab w:val="left" w:pos="3664"/>
+          <w:tab w:val="left" w:pos="4580"/>
+          <w:tab w:val="left" w:pos="5496"/>
+          <w:tab w:val="left" w:pos="6412"/>
+          <w:tab w:val="left" w:pos="7328"/>
+          <w:tab w:val="left" w:pos="8244"/>
+          <w:tab w:val="left" w:pos="9160"/>
+          <w:tab w:val="left" w:pos="10076"/>
+          <w:tab w:val="left" w:pos="10992"/>
+          <w:tab w:val="left" w:pos="11908"/>
+          <w:tab w:val="left" w:pos="12824"/>
+          <w:tab w:val="left" w:pos="13740"/>
+          <w:tab w:val="left" w:pos="14656"/>
+        </w:tabs>
+        <w:spacing w:after="0" w:line="240" w:lineRule="auto"/>
+        <w:rPr>
+          <w:rFonts w:ascii="Courier New" w:eastAsia="Times New Roman" w:hAnsi="Courier New" w:cs="Courier New"/>
+          <w:kern w:val="0"/>
+          <w:sz w:val="20"/>
+          <w:szCs w:val="20"/>
+          <w:lang w:eastAsia="en-IN" w:bidi="ta-IN"/>
+          <w14:ligatures w14:val="none"/>
+        </w:rPr>
+      </w:pPr>
+      <w:r>
+        <w:rPr>
+          <w:rFonts w:ascii="Courier New" w:eastAsia="Times New Roman" w:hAnsi="Courier New" w:cs="Courier New"/>
+          <w:kern w:val="0"/>
+          <w:sz w:val="20"/>
+          <w:szCs w:val="20"/>
+          <w:lang w:eastAsia="en-IN" w:bidi="ta-IN"/>
+          <w14:ligatures w14:val="none"/>
+        </w:rPr>
+        <w:t xml:space="preserve">    @When("the user enters valid credentials")</w:t>
       </w:r>
     </w:p>
     <w:p>
@@ -3559,19 +3654,7 @@
           <w:lang w:eastAsia="en-IN" w:bidi="ta-IN"/>
           <w14:ligatures w14:val="none"/>
         </w:rPr>
-        <w:t>the_user_is_on_the_login_</w:t>
-      </w:r>
-      <w:proofErr w:type="gramStart"/>
-      <w:r>
-        <w:rPr>
-          <w:rFonts w:ascii="Courier New" w:eastAsia="Times New Roman" w:hAnsi="Courier New" w:cs="Courier New"/>
-          <w:kern w:val="0"/>
-          <w:sz w:val="20"/>
-          <w:szCs w:val="20"/>
-          <w:lang w:eastAsia="en-IN" w:bidi="ta-IN"/>
-          <w14:ligatures w14:val="none"/>
-        </w:rPr>
-        <w:t>page</w:t>
+        <w:t>the_user_enters_valid_credentials</w:t>
       </w:r>
       <w:proofErr w:type="spellEnd"/>
       <w:r>
@@ -3583,74 +3666,61 @@
           <w:lang w:eastAsia="en-IN" w:bidi="ta-IN"/>
           <w14:ligatures w14:val="none"/>
         </w:rPr>
-        <w:t>(</w:t>
-      </w:r>
-      <w:proofErr w:type="gramEnd"/>
-      <w:r>
-        <w:rPr>
-          <w:rFonts w:ascii="Courier New" w:eastAsia="Times New Roman" w:hAnsi="Courier New" w:cs="Courier New"/>
-          <w:kern w:val="0"/>
-          <w:sz w:val="20"/>
-          <w:szCs w:val="20"/>
-          <w:lang w:eastAsia="en-IN" w:bidi="ta-IN"/>
-          <w14:ligatures w14:val="none"/>
-        </w:rPr>
-        <w:t>) {</w:t>
-      </w:r>
-    </w:p>
-    <w:p>
-      <w:pPr>
-        <w:tabs>
-          <w:tab w:val="left" w:pos="916"/>
-          <w:tab w:val="left" w:pos="1832"/>
-          <w:tab w:val="left" w:pos="2748"/>
-          <w:tab w:val="left" w:pos="3664"/>
-          <w:tab w:val="left" w:pos="4580"/>
-          <w:tab w:val="left" w:pos="5496"/>
-          <w:tab w:val="left" w:pos="6412"/>
-          <w:tab w:val="left" w:pos="7328"/>
-          <w:tab w:val="left" w:pos="8244"/>
-          <w:tab w:val="left" w:pos="9160"/>
-          <w:tab w:val="left" w:pos="10076"/>
-          <w:tab w:val="left" w:pos="10992"/>
-          <w:tab w:val="left" w:pos="11908"/>
-          <w:tab w:val="left" w:pos="12824"/>
-          <w:tab w:val="left" w:pos="13740"/>
-          <w:tab w:val="left" w:pos="14656"/>
-        </w:tabs>
-        <w:spacing w:after="0" w:line="240" w:lineRule="auto"/>
-        <w:rPr>
-          <w:rFonts w:ascii="Courier New" w:eastAsia="Times New Roman" w:hAnsi="Courier New" w:cs="Courier New"/>
-          <w:kern w:val="0"/>
-          <w:sz w:val="20"/>
-          <w:szCs w:val="20"/>
-          <w:lang w:eastAsia="en-IN" w:bidi="ta-IN"/>
-          <w14:ligatures w14:val="none"/>
-        </w:rPr>
-      </w:pPr>
-      <w:r>
-        <w:rPr>
-          <w:rFonts w:ascii="Courier New" w:eastAsia="Times New Roman" w:hAnsi="Courier New" w:cs="Courier New"/>
-          <w:kern w:val="0"/>
-          <w:sz w:val="20"/>
-          <w:szCs w:val="20"/>
-          <w:lang w:eastAsia="en-IN" w:bidi="ta-IN"/>
-          <w14:ligatures w14:val="none"/>
-        </w:rPr>
-        <w:t xml:space="preserve">        driver = new </w:t>
+        <w:t>() {</w:t>
+      </w:r>
+    </w:p>
+    <w:p>
+      <w:pPr>
+        <w:tabs>
+          <w:tab w:val="left" w:pos="916"/>
+          <w:tab w:val="left" w:pos="1832"/>
+          <w:tab w:val="left" w:pos="2748"/>
+          <w:tab w:val="left" w:pos="3664"/>
+          <w:tab w:val="left" w:pos="4580"/>
+          <w:tab w:val="left" w:pos="5496"/>
+          <w:tab w:val="left" w:pos="6412"/>
+          <w:tab w:val="left" w:pos="7328"/>
+          <w:tab w:val="left" w:pos="8244"/>
+          <w:tab w:val="left" w:pos="9160"/>
+          <w:tab w:val="left" w:pos="10076"/>
+          <w:tab w:val="left" w:pos="10992"/>
+          <w:tab w:val="left" w:pos="11908"/>
+          <w:tab w:val="left" w:pos="12824"/>
+          <w:tab w:val="left" w:pos="13740"/>
+          <w:tab w:val="left" w:pos="14656"/>
+        </w:tabs>
+        <w:spacing w:after="0" w:line="240" w:lineRule="auto"/>
+        <w:rPr>
+          <w:rFonts w:ascii="Courier New" w:eastAsia="Times New Roman" w:hAnsi="Courier New" w:cs="Courier New"/>
+          <w:kern w:val="0"/>
+          <w:sz w:val="20"/>
+          <w:szCs w:val="20"/>
+          <w:lang w:eastAsia="en-IN" w:bidi="ta-IN"/>
+          <w14:ligatures w14:val="none"/>
+        </w:rPr>
+      </w:pPr>
+      <w:r>
+        <w:rPr>
+          <w:rFonts w:ascii="Courier New" w:eastAsia="Times New Roman" w:hAnsi="Courier New" w:cs="Courier New"/>
+          <w:kern w:val="0"/>
+          <w:sz w:val="20"/>
+          <w:szCs w:val="20"/>
+          <w:lang w:eastAsia="en-IN" w:bidi="ta-IN"/>
+          <w14:ligatures w14:val="none"/>
+        </w:rPr>
+        <w:t xml:space="preserve">        </w:t>
       </w:r>
       <w:proofErr w:type="spellStart"/>
-      <w:proofErr w:type="gramStart"/>
-      <w:r>
-        <w:rPr>
-          <w:rFonts w:ascii="Courier New" w:eastAsia="Times New Roman" w:hAnsi="Courier New" w:cs="Courier New"/>
-          <w:kern w:val="0"/>
-          <w:sz w:val="20"/>
-          <w:szCs w:val="20"/>
-          <w:lang w:eastAsia="en-IN" w:bidi="ta-IN"/>
-          <w14:ligatures w14:val="none"/>
-        </w:rPr>
-        <w:t>ChromeDriver</w:t>
+      <w:r>
+        <w:rPr>
+          <w:rFonts w:ascii="Courier New" w:eastAsia="Times New Roman" w:hAnsi="Courier New" w:cs="Courier New"/>
+          <w:kern w:val="0"/>
+          <w:sz w:val="20"/>
+          <w:szCs w:val="20"/>
+          <w:lang w:eastAsia="en-IN" w:bidi="ta-IN"/>
+          <w14:ligatures w14:val="none"/>
+        </w:rPr>
+        <w:t>driver.findElement</w:t>
       </w:r>
       <w:proofErr w:type="spellEnd"/>
       <w:r>
@@ -3662,19 +3732,98 @@
           <w:lang w:eastAsia="en-IN" w:bidi="ta-IN"/>
           <w14:ligatures w14:val="none"/>
         </w:rPr>
-        <w:t>(</w:t>
-      </w:r>
-      <w:proofErr w:type="gramEnd"/>
-      <w:r>
-        <w:rPr>
-          <w:rFonts w:ascii="Courier New" w:eastAsia="Times New Roman" w:hAnsi="Courier New" w:cs="Courier New"/>
-          <w:kern w:val="0"/>
-          <w:sz w:val="20"/>
-          <w:szCs w:val="20"/>
-          <w:lang w:eastAsia="en-IN" w:bidi="ta-IN"/>
-          <w14:ligatures w14:val="none"/>
-        </w:rPr>
-        <w:t>);</w:t>
+        <w:t>(By.id("username")).</w:t>
+      </w:r>
+      <w:proofErr w:type="spellStart"/>
+      <w:r>
+        <w:rPr>
+          <w:rFonts w:ascii="Courier New" w:eastAsia="Times New Roman" w:hAnsi="Courier New" w:cs="Courier New"/>
+          <w:kern w:val="0"/>
+          <w:sz w:val="20"/>
+          <w:szCs w:val="20"/>
+          <w:lang w:eastAsia="en-IN" w:bidi="ta-IN"/>
+          <w14:ligatures w14:val="none"/>
+        </w:rPr>
+        <w:t>sendKeys</w:t>
+      </w:r>
+      <w:proofErr w:type="spellEnd"/>
+      <w:r>
+        <w:rPr>
+          <w:rFonts w:ascii="Courier New" w:eastAsia="Times New Roman" w:hAnsi="Courier New" w:cs="Courier New"/>
+          <w:kern w:val="0"/>
+          <w:sz w:val="20"/>
+          <w:szCs w:val="20"/>
+          <w:lang w:eastAsia="en-IN" w:bidi="ta-IN"/>
+          <w14:ligatures w14:val="none"/>
+        </w:rPr>
+        <w:t>("</w:t>
+      </w:r>
+      <w:proofErr w:type="spellStart"/>
+      <w:r>
+        <w:rPr>
+          <w:rFonts w:ascii="Courier New" w:eastAsia="Times New Roman" w:hAnsi="Courier New" w:cs="Courier New"/>
+          <w:kern w:val="0"/>
+          <w:sz w:val="20"/>
+          <w:szCs w:val="20"/>
+          <w:lang w:eastAsia="en-IN" w:bidi="ta-IN"/>
+          <w14:ligatures w14:val="none"/>
+        </w:rPr>
+        <w:t>test_user</w:t>
+      </w:r>
+      <w:proofErr w:type="spellEnd"/>
+      <w:r>
+        <w:rPr>
+          <w:rFonts w:ascii="Courier New" w:eastAsia="Times New Roman" w:hAnsi="Courier New" w:cs="Courier New"/>
+          <w:kern w:val="0"/>
+          <w:sz w:val="20"/>
+          <w:szCs w:val="20"/>
+          <w:lang w:eastAsia="en-IN" w:bidi="ta-IN"/>
+          <w14:ligatures w14:val="none"/>
+        </w:rPr>
+        <w:t>");</w:t>
+      </w:r>
+    </w:p>
+    <w:p>
+      <w:pPr>
+        <w:tabs>
+          <w:tab w:val="left" w:pos="916"/>
+          <w:tab w:val="left" w:pos="1832"/>
+          <w:tab w:val="left" w:pos="2748"/>
+          <w:tab w:val="left" w:pos="3664"/>
+          <w:tab w:val="left" w:pos="4580"/>
+          <w:tab w:val="left" w:pos="5496"/>
+          <w:tab w:val="left" w:pos="6412"/>
+          <w:tab w:val="left" w:pos="7328"/>
+          <w:tab w:val="left" w:pos="8244"/>
+          <w:tab w:val="left" w:pos="9160"/>
+          <w:tab w:val="left" w:pos="10076"/>
+          <w:tab w:val="left" w:pos="10992"/>
+          <w:tab w:val="left" w:pos="11908"/>
+          <w:tab w:val="left" w:pos="12824"/>
+          <w:tab w:val="left" w:pos="13740"/>
+          <w:tab w:val="left" w:pos="14656"/>
+        </w:tabs>
+        <w:spacing w:after="0" w:line="240" w:lineRule="auto"/>
+        <w:rPr>
+          <w:rFonts w:ascii="Courier New" w:eastAsia="Times New Roman" w:hAnsi="Courier New" w:cs="Courier New"/>
+          <w:kern w:val="0"/>
+          <w:sz w:val="20"/>
+          <w:szCs w:val="20"/>
+          <w:lang w:eastAsia="en-IN" w:bidi="ta-IN"/>
+          <w14:ligatures w14:val="none"/>
+        </w:rPr>
+      </w:pPr>
+      <w:r>
+        <w:rPr>
+          <w:rFonts w:ascii="Courier New" w:eastAsia="Times New Roman" w:hAnsi="Courier New" w:cs="Courier New"/>
+          <w:kern w:val="0"/>
+          <w:sz w:val="20"/>
+          <w:szCs w:val="20"/>
+          <w:lang w:eastAsia="en-IN" w:bidi="ta-IN"/>
+          <w14:ligatures w14:val="none"/>
+        </w:rPr>
+        <w:lastRenderedPageBreak/>
+        <w:t xml:space="preserve">        driver.findElement(By.id("password")).sendKeys("secure_password");</w:t>
       </w:r>
     </w:p>
     <w:p>
@@ -3728,7 +3877,7 @@
           <w:lang w:eastAsia="en-IN" w:bidi="ta-IN"/>
           <w14:ligatures w14:val="none"/>
         </w:rPr>
-        <w:t>driver.get</w:t>
+        <w:t>driver.findElement</w:t>
       </w:r>
       <w:proofErr w:type="spellEnd"/>
       <w:r>
@@ -3740,7 +3889,7 @@
           <w:lang w:eastAsia="en-IN" w:bidi="ta-IN"/>
           <w14:ligatures w14:val="none"/>
         </w:rPr>
-        <w:t>("https://example.com/login");</w:t>
+        <w:t>(By.id("login-button")).click();</w:t>
       </w:r>
     </w:p>
     <w:p>
@@ -3855,31 +4004,7 @@
           <w:lang w:eastAsia="en-IN" w:bidi="ta-IN"/>
           <w14:ligatures w14:val="none"/>
         </w:rPr>
-        <w:t xml:space="preserve">    @</w:t>
-      </w:r>
-      <w:proofErr w:type="gramStart"/>
-      <w:r>
-        <w:rPr>
-          <w:rFonts w:ascii="Courier New" w:eastAsia="Times New Roman" w:hAnsi="Courier New" w:cs="Courier New"/>
-          <w:kern w:val="0"/>
-          <w:sz w:val="20"/>
-          <w:szCs w:val="20"/>
-          <w:lang w:eastAsia="en-IN" w:bidi="ta-IN"/>
-          <w14:ligatures w14:val="none"/>
-        </w:rPr>
-        <w:t>When(</w:t>
-      </w:r>
-      <w:proofErr w:type="gramEnd"/>
-      <w:r>
-        <w:rPr>
-          <w:rFonts w:ascii="Courier New" w:eastAsia="Times New Roman" w:hAnsi="Courier New" w:cs="Courier New"/>
-          <w:kern w:val="0"/>
-          <w:sz w:val="20"/>
-          <w:szCs w:val="20"/>
-          <w:lang w:eastAsia="en-IN" w:bidi="ta-IN"/>
-          <w14:ligatures w14:val="none"/>
-        </w:rPr>
-        <w:t>"the user enters valid credentials")</w:t>
+        <w:t xml:space="preserve">    @Then("the user should be redirected to the dashboard")</w:t>
       </w:r>
     </w:p>
     <w:p>
@@ -3933,19 +4058,7 @@
           <w:lang w:eastAsia="en-IN" w:bidi="ta-IN"/>
           <w14:ligatures w14:val="none"/>
         </w:rPr>
-        <w:t>the_user_enters_valid_</w:t>
-      </w:r>
-      <w:proofErr w:type="gramStart"/>
-      <w:r>
-        <w:rPr>
-          <w:rFonts w:ascii="Courier New" w:eastAsia="Times New Roman" w:hAnsi="Courier New" w:cs="Courier New"/>
-          <w:kern w:val="0"/>
-          <w:sz w:val="20"/>
-          <w:szCs w:val="20"/>
-          <w:lang w:eastAsia="en-IN" w:bidi="ta-IN"/>
-          <w14:ligatures w14:val="none"/>
-        </w:rPr>
-        <w:t>credentials</w:t>
+        <w:t>the_user_should_be_redirected_to_the_dashboard</w:t>
       </w:r>
       <w:proofErr w:type="spellEnd"/>
       <w:r>
@@ -3957,19 +4070,163 @@
           <w:lang w:eastAsia="en-IN" w:bidi="ta-IN"/>
           <w14:ligatures w14:val="none"/>
         </w:rPr>
-        <w:t>(</w:t>
-      </w:r>
-      <w:proofErr w:type="gramEnd"/>
-      <w:r>
-        <w:rPr>
-          <w:rFonts w:ascii="Courier New" w:eastAsia="Times New Roman" w:hAnsi="Courier New" w:cs="Courier New"/>
-          <w:kern w:val="0"/>
-          <w:sz w:val="20"/>
-          <w:szCs w:val="20"/>
-          <w:lang w:eastAsia="en-IN" w:bidi="ta-IN"/>
-          <w14:ligatures w14:val="none"/>
-        </w:rPr>
-        <w:t>) {</w:t>
+        <w:t>() {</w:t>
+      </w:r>
+    </w:p>
+    <w:p>
+      <w:pPr>
+        <w:tabs>
+          <w:tab w:val="left" w:pos="916"/>
+          <w:tab w:val="left" w:pos="1832"/>
+          <w:tab w:val="left" w:pos="2748"/>
+          <w:tab w:val="left" w:pos="3664"/>
+          <w:tab w:val="left" w:pos="4580"/>
+          <w:tab w:val="left" w:pos="5496"/>
+          <w:tab w:val="left" w:pos="6412"/>
+          <w:tab w:val="left" w:pos="7328"/>
+          <w:tab w:val="left" w:pos="8244"/>
+          <w:tab w:val="left" w:pos="9160"/>
+          <w:tab w:val="left" w:pos="10076"/>
+          <w:tab w:val="left" w:pos="10992"/>
+          <w:tab w:val="left" w:pos="11908"/>
+          <w:tab w:val="left" w:pos="12824"/>
+          <w:tab w:val="left" w:pos="13740"/>
+          <w:tab w:val="left" w:pos="14656"/>
+        </w:tabs>
+        <w:spacing w:after="0" w:line="240" w:lineRule="auto"/>
+        <w:rPr>
+          <w:rFonts w:ascii="Courier New" w:eastAsia="Times New Roman" w:hAnsi="Courier New" w:cs="Courier New"/>
+          <w:kern w:val="0"/>
+          <w:sz w:val="20"/>
+          <w:szCs w:val="20"/>
+          <w:lang w:eastAsia="en-IN" w:bidi="ta-IN"/>
+          <w14:ligatures w14:val="none"/>
+        </w:rPr>
+      </w:pPr>
+      <w:r>
+        <w:rPr>
+          <w:rFonts w:ascii="Courier New" w:eastAsia="Times New Roman" w:hAnsi="Courier New" w:cs="Courier New"/>
+          <w:kern w:val="0"/>
+          <w:sz w:val="20"/>
+          <w:szCs w:val="20"/>
+          <w:lang w:eastAsia="en-IN" w:bidi="ta-IN"/>
+          <w14:ligatures w14:val="none"/>
+        </w:rPr>
+        <w:t xml:space="preserve">        String </w:t>
+      </w:r>
+      <w:proofErr w:type="spellStart"/>
+      <w:r>
+        <w:rPr>
+          <w:rFonts w:ascii="Courier New" w:eastAsia="Times New Roman" w:hAnsi="Courier New" w:cs="Courier New"/>
+          <w:kern w:val="0"/>
+          <w:sz w:val="20"/>
+          <w:szCs w:val="20"/>
+          <w:lang w:eastAsia="en-IN" w:bidi="ta-IN"/>
+          <w14:ligatures w14:val="none"/>
+        </w:rPr>
+        <w:t>currentUrl</w:t>
+      </w:r>
+      <w:proofErr w:type="spellEnd"/>
+      <w:r>
+        <w:rPr>
+          <w:rFonts w:ascii="Courier New" w:eastAsia="Times New Roman" w:hAnsi="Courier New" w:cs="Courier New"/>
+          <w:kern w:val="0"/>
+          <w:sz w:val="20"/>
+          <w:szCs w:val="20"/>
+          <w:lang w:eastAsia="en-IN" w:bidi="ta-IN"/>
+          <w14:ligatures w14:val="none"/>
+        </w:rPr>
+        <w:t xml:space="preserve"> = </w:t>
+      </w:r>
+      <w:proofErr w:type="spellStart"/>
+      <w:r>
+        <w:rPr>
+          <w:rFonts w:ascii="Courier New" w:eastAsia="Times New Roman" w:hAnsi="Courier New" w:cs="Courier New"/>
+          <w:kern w:val="0"/>
+          <w:sz w:val="20"/>
+          <w:szCs w:val="20"/>
+          <w:lang w:eastAsia="en-IN" w:bidi="ta-IN"/>
+          <w14:ligatures w14:val="none"/>
+        </w:rPr>
+        <w:t>driver.getCurrentUrl</w:t>
+      </w:r>
+      <w:proofErr w:type="spellEnd"/>
+      <w:r>
+        <w:rPr>
+          <w:rFonts w:ascii="Courier New" w:eastAsia="Times New Roman" w:hAnsi="Courier New" w:cs="Courier New"/>
+          <w:kern w:val="0"/>
+          <w:sz w:val="20"/>
+          <w:szCs w:val="20"/>
+          <w:lang w:eastAsia="en-IN" w:bidi="ta-IN"/>
+          <w14:ligatures w14:val="none"/>
+        </w:rPr>
+        <w:t>();</w:t>
+      </w:r>
+    </w:p>
+    <w:p>
+      <w:pPr>
+        <w:tabs>
+          <w:tab w:val="left" w:pos="916"/>
+          <w:tab w:val="left" w:pos="1832"/>
+          <w:tab w:val="left" w:pos="2748"/>
+          <w:tab w:val="left" w:pos="3664"/>
+          <w:tab w:val="left" w:pos="4580"/>
+          <w:tab w:val="left" w:pos="5496"/>
+          <w:tab w:val="left" w:pos="6412"/>
+          <w:tab w:val="left" w:pos="7328"/>
+          <w:tab w:val="left" w:pos="8244"/>
+          <w:tab w:val="left" w:pos="9160"/>
+          <w:tab w:val="left" w:pos="10076"/>
+          <w:tab w:val="left" w:pos="10992"/>
+          <w:tab w:val="left" w:pos="11908"/>
+          <w:tab w:val="left" w:pos="12824"/>
+          <w:tab w:val="left" w:pos="13740"/>
+          <w:tab w:val="left" w:pos="14656"/>
+        </w:tabs>
+        <w:spacing w:after="0" w:line="240" w:lineRule="auto"/>
+        <w:rPr>
+          <w:rFonts w:ascii="Courier New" w:eastAsia="Times New Roman" w:hAnsi="Courier New" w:cs="Courier New"/>
+          <w:kern w:val="0"/>
+          <w:sz w:val="20"/>
+          <w:szCs w:val="20"/>
+          <w:lang w:eastAsia="en-IN" w:bidi="ta-IN"/>
+          <w14:ligatures w14:val="none"/>
+        </w:rPr>
+      </w:pPr>
+      <w:r>
+        <w:rPr>
+          <w:rFonts w:ascii="Courier New" w:eastAsia="Times New Roman" w:hAnsi="Courier New" w:cs="Courier New"/>
+          <w:kern w:val="0"/>
+          <w:sz w:val="20"/>
+          <w:szCs w:val="20"/>
+          <w:lang w:eastAsia="en-IN" w:bidi="ta-IN"/>
+          <w14:ligatures w14:val="none"/>
+        </w:rPr>
+        <w:t xml:space="preserve">        assert </w:t>
+      </w:r>
+      <w:proofErr w:type="spellStart"/>
+      <w:r>
+        <w:rPr>
+          <w:rFonts w:ascii="Courier New" w:eastAsia="Times New Roman" w:hAnsi="Courier New" w:cs="Courier New"/>
+          <w:kern w:val="0"/>
+          <w:sz w:val="20"/>
+          <w:szCs w:val="20"/>
+          <w:lang w:eastAsia="en-IN" w:bidi="ta-IN"/>
+          <w14:ligatures w14:val="none"/>
+        </w:rPr>
+        <w:t>currentUrl.contains</w:t>
+      </w:r>
+      <w:proofErr w:type="spellEnd"/>
+      <w:r>
+        <w:rPr>
+          <w:rFonts w:ascii="Courier New" w:eastAsia="Times New Roman" w:hAnsi="Courier New" w:cs="Courier New"/>
+          <w:kern w:val="0"/>
+          <w:sz w:val="20"/>
+          <w:szCs w:val="20"/>
+          <w:lang w:eastAsia="en-IN" w:bidi="ta-IN"/>
+          <w14:ligatures w14:val="none"/>
+        </w:rPr>
+        <w:t>("dashboard");</w:t>
       </w:r>
     </w:p>
     <w:p>
@@ -4014,658 +4271,18 @@
         <w:t xml:space="preserve">        </w:t>
       </w:r>
       <w:proofErr w:type="spellStart"/>
-      <w:proofErr w:type="gramStart"/>
-      <w:r>
-        <w:rPr>
-          <w:rFonts w:ascii="Courier New" w:eastAsia="Times New Roman" w:hAnsi="Courier New" w:cs="Courier New"/>
-          <w:kern w:val="0"/>
-          <w:sz w:val="20"/>
-          <w:szCs w:val="20"/>
-          <w:lang w:eastAsia="en-IN" w:bidi="ta-IN"/>
-          <w14:ligatures w14:val="none"/>
-        </w:rPr>
-        <w:t>driver.findElement</w:t>
+      <w:r>
+        <w:rPr>
+          <w:rFonts w:ascii="Courier New" w:eastAsia="Times New Roman" w:hAnsi="Courier New" w:cs="Courier New"/>
+          <w:kern w:val="0"/>
+          <w:sz w:val="20"/>
+          <w:szCs w:val="20"/>
+          <w:lang w:eastAsia="en-IN" w:bidi="ta-IN"/>
+          <w14:ligatures w14:val="none"/>
+        </w:rPr>
+        <w:t>driver.quit</w:t>
       </w:r>
       <w:proofErr w:type="spellEnd"/>
-      <w:proofErr w:type="gramEnd"/>
-      <w:r>
-        <w:rPr>
-          <w:rFonts w:ascii="Courier New" w:eastAsia="Times New Roman" w:hAnsi="Courier New" w:cs="Courier New"/>
-          <w:kern w:val="0"/>
-          <w:sz w:val="20"/>
-          <w:szCs w:val="20"/>
-          <w:lang w:eastAsia="en-IN" w:bidi="ta-IN"/>
-          <w14:ligatures w14:val="none"/>
-        </w:rPr>
-        <w:t>(By.id("username")).</w:t>
-      </w:r>
-      <w:proofErr w:type="spellStart"/>
-      <w:r>
-        <w:rPr>
-          <w:rFonts w:ascii="Courier New" w:eastAsia="Times New Roman" w:hAnsi="Courier New" w:cs="Courier New"/>
-          <w:kern w:val="0"/>
-          <w:sz w:val="20"/>
-          <w:szCs w:val="20"/>
-          <w:lang w:eastAsia="en-IN" w:bidi="ta-IN"/>
-          <w14:ligatures w14:val="none"/>
-        </w:rPr>
-        <w:t>sendKeys</w:t>
-      </w:r>
-      <w:proofErr w:type="spellEnd"/>
-      <w:r>
-        <w:rPr>
-          <w:rFonts w:ascii="Courier New" w:eastAsia="Times New Roman" w:hAnsi="Courier New" w:cs="Courier New"/>
-          <w:kern w:val="0"/>
-          <w:sz w:val="20"/>
-          <w:szCs w:val="20"/>
-          <w:lang w:eastAsia="en-IN" w:bidi="ta-IN"/>
-          <w14:ligatures w14:val="none"/>
-        </w:rPr>
-        <w:t>("</w:t>
-      </w:r>
-      <w:proofErr w:type="spellStart"/>
-      <w:r>
-        <w:rPr>
-          <w:rFonts w:ascii="Courier New" w:eastAsia="Times New Roman" w:hAnsi="Courier New" w:cs="Courier New"/>
-          <w:kern w:val="0"/>
-          <w:sz w:val="20"/>
-          <w:szCs w:val="20"/>
-          <w:lang w:eastAsia="en-IN" w:bidi="ta-IN"/>
-          <w14:ligatures w14:val="none"/>
-        </w:rPr>
-        <w:t>test_user</w:t>
-      </w:r>
-      <w:proofErr w:type="spellEnd"/>
-      <w:r>
-        <w:rPr>
-          <w:rFonts w:ascii="Courier New" w:eastAsia="Times New Roman" w:hAnsi="Courier New" w:cs="Courier New"/>
-          <w:kern w:val="0"/>
-          <w:sz w:val="20"/>
-          <w:szCs w:val="20"/>
-          <w:lang w:eastAsia="en-IN" w:bidi="ta-IN"/>
-          <w14:ligatures w14:val="none"/>
-        </w:rPr>
-        <w:t>");</w:t>
-      </w:r>
-    </w:p>
-    <w:p>
-      <w:pPr>
-        <w:tabs>
-          <w:tab w:val="left" w:pos="916"/>
-          <w:tab w:val="left" w:pos="1832"/>
-          <w:tab w:val="left" w:pos="2748"/>
-          <w:tab w:val="left" w:pos="3664"/>
-          <w:tab w:val="left" w:pos="4580"/>
-          <w:tab w:val="left" w:pos="5496"/>
-          <w:tab w:val="left" w:pos="6412"/>
-          <w:tab w:val="left" w:pos="7328"/>
-          <w:tab w:val="left" w:pos="8244"/>
-          <w:tab w:val="left" w:pos="9160"/>
-          <w:tab w:val="left" w:pos="10076"/>
-          <w:tab w:val="left" w:pos="10992"/>
-          <w:tab w:val="left" w:pos="11908"/>
-          <w:tab w:val="left" w:pos="12824"/>
-          <w:tab w:val="left" w:pos="13740"/>
-          <w:tab w:val="left" w:pos="14656"/>
-        </w:tabs>
-        <w:spacing w:after="0" w:line="240" w:lineRule="auto"/>
-        <w:rPr>
-          <w:rFonts w:ascii="Courier New" w:eastAsia="Times New Roman" w:hAnsi="Courier New" w:cs="Courier New"/>
-          <w:kern w:val="0"/>
-          <w:sz w:val="20"/>
-          <w:szCs w:val="20"/>
-          <w:lang w:eastAsia="en-IN" w:bidi="ta-IN"/>
-          <w14:ligatures w14:val="none"/>
-        </w:rPr>
-      </w:pPr>
-      <w:r>
-        <w:rPr>
-          <w:rFonts w:ascii="Courier New" w:eastAsia="Times New Roman" w:hAnsi="Courier New" w:cs="Courier New"/>
-          <w:kern w:val="0"/>
-          <w:sz w:val="20"/>
-          <w:szCs w:val="20"/>
-          <w:lang w:eastAsia="en-IN" w:bidi="ta-IN"/>
-          <w14:ligatures w14:val="none"/>
-        </w:rPr>
-        <w:t xml:space="preserve">        </w:t>
-      </w:r>
-      <w:proofErr w:type="gramStart"/>
-      <w:r>
-        <w:rPr>
-          <w:rFonts w:ascii="Courier New" w:eastAsia="Times New Roman" w:hAnsi="Courier New" w:cs="Courier New"/>
-          <w:kern w:val="0"/>
-          <w:sz w:val="20"/>
-          <w:szCs w:val="20"/>
-          <w:lang w:eastAsia="en-IN" w:bidi="ta-IN"/>
-          <w14:ligatures w14:val="none"/>
-        </w:rPr>
-        <w:t>driver.findElement</w:t>
-      </w:r>
-      <w:proofErr w:type="gramEnd"/>
-      <w:r>
-        <w:rPr>
-          <w:rFonts w:ascii="Courier New" w:eastAsia="Times New Roman" w:hAnsi="Courier New" w:cs="Courier New"/>
-          <w:kern w:val="0"/>
-          <w:sz w:val="20"/>
-          <w:szCs w:val="20"/>
-          <w:lang w:eastAsia="en-IN" w:bidi="ta-IN"/>
-          <w14:ligatures w14:val="none"/>
-        </w:rPr>
-        <w:t>(By.id("password")).sendKeys("secure_password");</w:t>
-      </w:r>
-    </w:p>
-    <w:p>
-      <w:pPr>
-        <w:tabs>
-          <w:tab w:val="left" w:pos="916"/>
-          <w:tab w:val="left" w:pos="1832"/>
-          <w:tab w:val="left" w:pos="2748"/>
-          <w:tab w:val="left" w:pos="3664"/>
-          <w:tab w:val="left" w:pos="4580"/>
-          <w:tab w:val="left" w:pos="5496"/>
-          <w:tab w:val="left" w:pos="6412"/>
-          <w:tab w:val="left" w:pos="7328"/>
-          <w:tab w:val="left" w:pos="8244"/>
-          <w:tab w:val="left" w:pos="9160"/>
-          <w:tab w:val="left" w:pos="10076"/>
-          <w:tab w:val="left" w:pos="10992"/>
-          <w:tab w:val="left" w:pos="11908"/>
-          <w:tab w:val="left" w:pos="12824"/>
-          <w:tab w:val="left" w:pos="13740"/>
-          <w:tab w:val="left" w:pos="14656"/>
-        </w:tabs>
-        <w:spacing w:after="0" w:line="240" w:lineRule="auto"/>
-        <w:rPr>
-          <w:rFonts w:ascii="Courier New" w:eastAsia="Times New Roman" w:hAnsi="Courier New" w:cs="Courier New"/>
-          <w:kern w:val="0"/>
-          <w:sz w:val="20"/>
-          <w:szCs w:val="20"/>
-          <w:lang w:eastAsia="en-IN" w:bidi="ta-IN"/>
-          <w14:ligatures w14:val="none"/>
-        </w:rPr>
-      </w:pPr>
-      <w:r>
-        <w:rPr>
-          <w:rFonts w:ascii="Courier New" w:eastAsia="Times New Roman" w:hAnsi="Courier New" w:cs="Courier New"/>
-          <w:kern w:val="0"/>
-          <w:sz w:val="20"/>
-          <w:szCs w:val="20"/>
-          <w:lang w:eastAsia="en-IN" w:bidi="ta-IN"/>
-          <w14:ligatures w14:val="none"/>
-        </w:rPr>
-        <w:t xml:space="preserve">        </w:t>
-      </w:r>
-      <w:proofErr w:type="spellStart"/>
-      <w:proofErr w:type="gramStart"/>
-      <w:r>
-        <w:rPr>
-          <w:rFonts w:ascii="Courier New" w:eastAsia="Times New Roman" w:hAnsi="Courier New" w:cs="Courier New"/>
-          <w:kern w:val="0"/>
-          <w:sz w:val="20"/>
-          <w:szCs w:val="20"/>
-          <w:lang w:eastAsia="en-IN" w:bidi="ta-IN"/>
-          <w14:ligatures w14:val="none"/>
-        </w:rPr>
-        <w:t>driver.findElement</w:t>
-      </w:r>
-      <w:proofErr w:type="spellEnd"/>
-      <w:proofErr w:type="gramEnd"/>
-      <w:r>
-        <w:rPr>
-          <w:rFonts w:ascii="Courier New" w:eastAsia="Times New Roman" w:hAnsi="Courier New" w:cs="Courier New"/>
-          <w:kern w:val="0"/>
-          <w:sz w:val="20"/>
-          <w:szCs w:val="20"/>
-          <w:lang w:eastAsia="en-IN" w:bidi="ta-IN"/>
-          <w14:ligatures w14:val="none"/>
-        </w:rPr>
-        <w:t>(By.id("login-button")).click();</w:t>
-      </w:r>
-    </w:p>
-    <w:p>
-      <w:pPr>
-        <w:tabs>
-          <w:tab w:val="left" w:pos="916"/>
-          <w:tab w:val="left" w:pos="1832"/>
-          <w:tab w:val="left" w:pos="2748"/>
-          <w:tab w:val="left" w:pos="3664"/>
-          <w:tab w:val="left" w:pos="4580"/>
-          <w:tab w:val="left" w:pos="5496"/>
-          <w:tab w:val="left" w:pos="6412"/>
-          <w:tab w:val="left" w:pos="7328"/>
-          <w:tab w:val="left" w:pos="8244"/>
-          <w:tab w:val="left" w:pos="9160"/>
-          <w:tab w:val="left" w:pos="10076"/>
-          <w:tab w:val="left" w:pos="10992"/>
-          <w:tab w:val="left" w:pos="11908"/>
-          <w:tab w:val="left" w:pos="12824"/>
-          <w:tab w:val="left" w:pos="13740"/>
-          <w:tab w:val="left" w:pos="14656"/>
-        </w:tabs>
-        <w:spacing w:after="0" w:line="240" w:lineRule="auto"/>
-        <w:rPr>
-          <w:rFonts w:ascii="Courier New" w:eastAsia="Times New Roman" w:hAnsi="Courier New" w:cs="Courier New"/>
-          <w:kern w:val="0"/>
-          <w:sz w:val="20"/>
-          <w:szCs w:val="20"/>
-          <w:lang w:eastAsia="en-IN" w:bidi="ta-IN"/>
-          <w14:ligatures w14:val="none"/>
-        </w:rPr>
-      </w:pPr>
-      <w:r>
-        <w:rPr>
-          <w:rFonts w:ascii="Courier New" w:eastAsia="Times New Roman" w:hAnsi="Courier New" w:cs="Courier New"/>
-          <w:kern w:val="0"/>
-          <w:sz w:val="20"/>
-          <w:szCs w:val="20"/>
-          <w:lang w:eastAsia="en-IN" w:bidi="ta-IN"/>
-          <w14:ligatures w14:val="none"/>
-        </w:rPr>
-        <w:t xml:space="preserve">    }</w:t>
-      </w:r>
-    </w:p>
-    <w:p>
-      <w:pPr>
-        <w:tabs>
-          <w:tab w:val="left" w:pos="916"/>
-          <w:tab w:val="left" w:pos="1832"/>
-          <w:tab w:val="left" w:pos="2748"/>
-          <w:tab w:val="left" w:pos="3664"/>
-          <w:tab w:val="left" w:pos="4580"/>
-          <w:tab w:val="left" w:pos="5496"/>
-          <w:tab w:val="left" w:pos="6412"/>
-          <w:tab w:val="left" w:pos="7328"/>
-          <w:tab w:val="left" w:pos="8244"/>
-          <w:tab w:val="left" w:pos="9160"/>
-          <w:tab w:val="left" w:pos="10076"/>
-          <w:tab w:val="left" w:pos="10992"/>
-          <w:tab w:val="left" w:pos="11908"/>
-          <w:tab w:val="left" w:pos="12824"/>
-          <w:tab w:val="left" w:pos="13740"/>
-          <w:tab w:val="left" w:pos="14656"/>
-        </w:tabs>
-        <w:spacing w:after="0" w:line="240" w:lineRule="auto"/>
-        <w:rPr>
-          <w:rFonts w:ascii="Courier New" w:eastAsia="Times New Roman" w:hAnsi="Courier New" w:cs="Courier New"/>
-          <w:kern w:val="0"/>
-          <w:sz w:val="20"/>
-          <w:szCs w:val="20"/>
-          <w:lang w:eastAsia="en-IN" w:bidi="ta-IN"/>
-          <w14:ligatures w14:val="none"/>
-        </w:rPr>
-      </w:pPr>
-    </w:p>
-    <w:p>
-      <w:pPr>
-        <w:tabs>
-          <w:tab w:val="left" w:pos="916"/>
-          <w:tab w:val="left" w:pos="1832"/>
-          <w:tab w:val="left" w:pos="2748"/>
-          <w:tab w:val="left" w:pos="3664"/>
-          <w:tab w:val="left" w:pos="4580"/>
-          <w:tab w:val="left" w:pos="5496"/>
-          <w:tab w:val="left" w:pos="6412"/>
-          <w:tab w:val="left" w:pos="7328"/>
-          <w:tab w:val="left" w:pos="8244"/>
-          <w:tab w:val="left" w:pos="9160"/>
-          <w:tab w:val="left" w:pos="10076"/>
-          <w:tab w:val="left" w:pos="10992"/>
-          <w:tab w:val="left" w:pos="11908"/>
-          <w:tab w:val="left" w:pos="12824"/>
-          <w:tab w:val="left" w:pos="13740"/>
-          <w:tab w:val="left" w:pos="14656"/>
-        </w:tabs>
-        <w:spacing w:after="0" w:line="240" w:lineRule="auto"/>
-        <w:rPr>
-          <w:rFonts w:ascii="Courier New" w:eastAsia="Times New Roman" w:hAnsi="Courier New" w:cs="Courier New"/>
-          <w:kern w:val="0"/>
-          <w:sz w:val="20"/>
-          <w:szCs w:val="20"/>
-          <w:lang w:eastAsia="en-IN" w:bidi="ta-IN"/>
-          <w14:ligatures w14:val="none"/>
-        </w:rPr>
-      </w:pPr>
-      <w:r>
-        <w:rPr>
-          <w:rFonts w:ascii="Courier New" w:eastAsia="Times New Roman" w:hAnsi="Courier New" w:cs="Courier New"/>
-          <w:kern w:val="0"/>
-          <w:sz w:val="20"/>
-          <w:szCs w:val="20"/>
-          <w:lang w:eastAsia="en-IN" w:bidi="ta-IN"/>
-          <w14:ligatures w14:val="none"/>
-        </w:rPr>
-        <w:lastRenderedPageBreak/>
-        <w:t xml:space="preserve">    @</w:t>
-      </w:r>
-      <w:proofErr w:type="gramStart"/>
-      <w:r>
-        <w:rPr>
-          <w:rFonts w:ascii="Courier New" w:eastAsia="Times New Roman" w:hAnsi="Courier New" w:cs="Courier New"/>
-          <w:kern w:val="0"/>
-          <w:sz w:val="20"/>
-          <w:szCs w:val="20"/>
-          <w:lang w:eastAsia="en-IN" w:bidi="ta-IN"/>
-          <w14:ligatures w14:val="none"/>
-        </w:rPr>
-        <w:t>Then(</w:t>
-      </w:r>
-      <w:proofErr w:type="gramEnd"/>
-      <w:r>
-        <w:rPr>
-          <w:rFonts w:ascii="Courier New" w:eastAsia="Times New Roman" w:hAnsi="Courier New" w:cs="Courier New"/>
-          <w:kern w:val="0"/>
-          <w:sz w:val="20"/>
-          <w:szCs w:val="20"/>
-          <w:lang w:eastAsia="en-IN" w:bidi="ta-IN"/>
-          <w14:ligatures w14:val="none"/>
-        </w:rPr>
-        <w:t>"the user should be redirected to the dashboard")</w:t>
-      </w:r>
-    </w:p>
-    <w:p>
-      <w:pPr>
-        <w:tabs>
-          <w:tab w:val="left" w:pos="916"/>
-          <w:tab w:val="left" w:pos="1832"/>
-          <w:tab w:val="left" w:pos="2748"/>
-          <w:tab w:val="left" w:pos="3664"/>
-          <w:tab w:val="left" w:pos="4580"/>
-          <w:tab w:val="left" w:pos="5496"/>
-          <w:tab w:val="left" w:pos="6412"/>
-          <w:tab w:val="left" w:pos="7328"/>
-          <w:tab w:val="left" w:pos="8244"/>
-          <w:tab w:val="left" w:pos="9160"/>
-          <w:tab w:val="left" w:pos="10076"/>
-          <w:tab w:val="left" w:pos="10992"/>
-          <w:tab w:val="left" w:pos="11908"/>
-          <w:tab w:val="left" w:pos="12824"/>
-          <w:tab w:val="left" w:pos="13740"/>
-          <w:tab w:val="left" w:pos="14656"/>
-        </w:tabs>
-        <w:spacing w:after="0" w:line="240" w:lineRule="auto"/>
-        <w:rPr>
-          <w:rFonts w:ascii="Courier New" w:eastAsia="Times New Roman" w:hAnsi="Courier New" w:cs="Courier New"/>
-          <w:kern w:val="0"/>
-          <w:sz w:val="20"/>
-          <w:szCs w:val="20"/>
-          <w:lang w:eastAsia="en-IN" w:bidi="ta-IN"/>
-          <w14:ligatures w14:val="none"/>
-        </w:rPr>
-      </w:pPr>
-      <w:r>
-        <w:rPr>
-          <w:rFonts w:ascii="Courier New" w:eastAsia="Times New Roman" w:hAnsi="Courier New" w:cs="Courier New"/>
-          <w:kern w:val="0"/>
-          <w:sz w:val="20"/>
-          <w:szCs w:val="20"/>
-          <w:lang w:eastAsia="en-IN" w:bidi="ta-IN"/>
-          <w14:ligatures w14:val="none"/>
-        </w:rPr>
-        <w:t xml:space="preserve">    public void </w:t>
-      </w:r>
-      <w:proofErr w:type="spellStart"/>
-      <w:r>
-        <w:rPr>
-          <w:rFonts w:ascii="Courier New" w:eastAsia="Times New Roman" w:hAnsi="Courier New" w:cs="Courier New"/>
-          <w:kern w:val="0"/>
-          <w:sz w:val="20"/>
-          <w:szCs w:val="20"/>
-          <w:lang w:eastAsia="en-IN" w:bidi="ta-IN"/>
-          <w14:ligatures w14:val="none"/>
-        </w:rPr>
-        <w:t>the_user_should_be_redirected_to_the_</w:t>
-      </w:r>
-      <w:proofErr w:type="gramStart"/>
-      <w:r>
-        <w:rPr>
-          <w:rFonts w:ascii="Courier New" w:eastAsia="Times New Roman" w:hAnsi="Courier New" w:cs="Courier New"/>
-          <w:kern w:val="0"/>
-          <w:sz w:val="20"/>
-          <w:szCs w:val="20"/>
-          <w:lang w:eastAsia="en-IN" w:bidi="ta-IN"/>
-          <w14:ligatures w14:val="none"/>
-        </w:rPr>
-        <w:t>dashboard</w:t>
-      </w:r>
-      <w:proofErr w:type="spellEnd"/>
-      <w:r>
-        <w:rPr>
-          <w:rFonts w:ascii="Courier New" w:eastAsia="Times New Roman" w:hAnsi="Courier New" w:cs="Courier New"/>
-          <w:kern w:val="0"/>
-          <w:sz w:val="20"/>
-          <w:szCs w:val="20"/>
-          <w:lang w:eastAsia="en-IN" w:bidi="ta-IN"/>
-          <w14:ligatures w14:val="none"/>
-        </w:rPr>
-        <w:t>(</w:t>
-      </w:r>
-      <w:proofErr w:type="gramEnd"/>
-      <w:r>
-        <w:rPr>
-          <w:rFonts w:ascii="Courier New" w:eastAsia="Times New Roman" w:hAnsi="Courier New" w:cs="Courier New"/>
-          <w:kern w:val="0"/>
-          <w:sz w:val="20"/>
-          <w:szCs w:val="20"/>
-          <w:lang w:eastAsia="en-IN" w:bidi="ta-IN"/>
-          <w14:ligatures w14:val="none"/>
-        </w:rPr>
-        <w:t>) {</w:t>
-      </w:r>
-    </w:p>
-    <w:p>
-      <w:pPr>
-        <w:tabs>
-          <w:tab w:val="left" w:pos="916"/>
-          <w:tab w:val="left" w:pos="1832"/>
-          <w:tab w:val="left" w:pos="2748"/>
-          <w:tab w:val="left" w:pos="3664"/>
-          <w:tab w:val="left" w:pos="4580"/>
-          <w:tab w:val="left" w:pos="5496"/>
-          <w:tab w:val="left" w:pos="6412"/>
-          <w:tab w:val="left" w:pos="7328"/>
-          <w:tab w:val="left" w:pos="8244"/>
-          <w:tab w:val="left" w:pos="9160"/>
-          <w:tab w:val="left" w:pos="10076"/>
-          <w:tab w:val="left" w:pos="10992"/>
-          <w:tab w:val="left" w:pos="11908"/>
-          <w:tab w:val="left" w:pos="12824"/>
-          <w:tab w:val="left" w:pos="13740"/>
-          <w:tab w:val="left" w:pos="14656"/>
-        </w:tabs>
-        <w:spacing w:after="0" w:line="240" w:lineRule="auto"/>
-        <w:rPr>
-          <w:rFonts w:ascii="Courier New" w:eastAsia="Times New Roman" w:hAnsi="Courier New" w:cs="Courier New"/>
-          <w:kern w:val="0"/>
-          <w:sz w:val="20"/>
-          <w:szCs w:val="20"/>
-          <w:lang w:eastAsia="en-IN" w:bidi="ta-IN"/>
-          <w14:ligatures w14:val="none"/>
-        </w:rPr>
-      </w:pPr>
-      <w:r>
-        <w:rPr>
-          <w:rFonts w:ascii="Courier New" w:eastAsia="Times New Roman" w:hAnsi="Courier New" w:cs="Courier New"/>
-          <w:kern w:val="0"/>
-          <w:sz w:val="20"/>
-          <w:szCs w:val="20"/>
-          <w:lang w:eastAsia="en-IN" w:bidi="ta-IN"/>
-          <w14:ligatures w14:val="none"/>
-        </w:rPr>
-        <w:t xml:space="preserve">        String </w:t>
-      </w:r>
-      <w:proofErr w:type="spellStart"/>
-      <w:r>
-        <w:rPr>
-          <w:rFonts w:ascii="Courier New" w:eastAsia="Times New Roman" w:hAnsi="Courier New" w:cs="Courier New"/>
-          <w:kern w:val="0"/>
-          <w:sz w:val="20"/>
-          <w:szCs w:val="20"/>
-          <w:lang w:eastAsia="en-IN" w:bidi="ta-IN"/>
-          <w14:ligatures w14:val="none"/>
-        </w:rPr>
-        <w:t>currentUrl</w:t>
-      </w:r>
-      <w:proofErr w:type="spellEnd"/>
-      <w:r>
-        <w:rPr>
-          <w:rFonts w:ascii="Courier New" w:eastAsia="Times New Roman" w:hAnsi="Courier New" w:cs="Courier New"/>
-          <w:kern w:val="0"/>
-          <w:sz w:val="20"/>
-          <w:szCs w:val="20"/>
-          <w:lang w:eastAsia="en-IN" w:bidi="ta-IN"/>
-          <w14:ligatures w14:val="none"/>
-        </w:rPr>
-        <w:t xml:space="preserve"> = </w:t>
-      </w:r>
-      <w:proofErr w:type="spellStart"/>
-      <w:proofErr w:type="gramStart"/>
-      <w:r>
-        <w:rPr>
-          <w:rFonts w:ascii="Courier New" w:eastAsia="Times New Roman" w:hAnsi="Courier New" w:cs="Courier New"/>
-          <w:kern w:val="0"/>
-          <w:sz w:val="20"/>
-          <w:szCs w:val="20"/>
-          <w:lang w:eastAsia="en-IN" w:bidi="ta-IN"/>
-          <w14:ligatures w14:val="none"/>
-        </w:rPr>
-        <w:t>driver.getCurrentUrl</w:t>
-      </w:r>
-      <w:proofErr w:type="spellEnd"/>
-      <w:proofErr w:type="gramEnd"/>
-      <w:r>
-        <w:rPr>
-          <w:rFonts w:ascii="Courier New" w:eastAsia="Times New Roman" w:hAnsi="Courier New" w:cs="Courier New"/>
-          <w:kern w:val="0"/>
-          <w:sz w:val="20"/>
-          <w:szCs w:val="20"/>
-          <w:lang w:eastAsia="en-IN" w:bidi="ta-IN"/>
-          <w14:ligatures w14:val="none"/>
-        </w:rPr>
-        <w:t>();</w:t>
-      </w:r>
-    </w:p>
-    <w:p>
-      <w:pPr>
-        <w:tabs>
-          <w:tab w:val="left" w:pos="916"/>
-          <w:tab w:val="left" w:pos="1832"/>
-          <w:tab w:val="left" w:pos="2748"/>
-          <w:tab w:val="left" w:pos="3664"/>
-          <w:tab w:val="left" w:pos="4580"/>
-          <w:tab w:val="left" w:pos="5496"/>
-          <w:tab w:val="left" w:pos="6412"/>
-          <w:tab w:val="left" w:pos="7328"/>
-          <w:tab w:val="left" w:pos="8244"/>
-          <w:tab w:val="left" w:pos="9160"/>
-          <w:tab w:val="left" w:pos="10076"/>
-          <w:tab w:val="left" w:pos="10992"/>
-          <w:tab w:val="left" w:pos="11908"/>
-          <w:tab w:val="left" w:pos="12824"/>
-          <w:tab w:val="left" w:pos="13740"/>
-          <w:tab w:val="left" w:pos="14656"/>
-        </w:tabs>
-        <w:spacing w:after="0" w:line="240" w:lineRule="auto"/>
-        <w:rPr>
-          <w:rFonts w:ascii="Courier New" w:eastAsia="Times New Roman" w:hAnsi="Courier New" w:cs="Courier New"/>
-          <w:kern w:val="0"/>
-          <w:sz w:val="20"/>
-          <w:szCs w:val="20"/>
-          <w:lang w:eastAsia="en-IN" w:bidi="ta-IN"/>
-          <w14:ligatures w14:val="none"/>
-        </w:rPr>
-      </w:pPr>
-      <w:r>
-        <w:rPr>
-          <w:rFonts w:ascii="Courier New" w:eastAsia="Times New Roman" w:hAnsi="Courier New" w:cs="Courier New"/>
-          <w:kern w:val="0"/>
-          <w:sz w:val="20"/>
-          <w:szCs w:val="20"/>
-          <w:lang w:eastAsia="en-IN" w:bidi="ta-IN"/>
-          <w14:ligatures w14:val="none"/>
-        </w:rPr>
-        <w:t xml:space="preserve">        assert </w:t>
-      </w:r>
-      <w:proofErr w:type="spellStart"/>
-      <w:r>
-        <w:rPr>
-          <w:rFonts w:ascii="Courier New" w:eastAsia="Times New Roman" w:hAnsi="Courier New" w:cs="Courier New"/>
-          <w:kern w:val="0"/>
-          <w:sz w:val="20"/>
-          <w:szCs w:val="20"/>
-          <w:lang w:eastAsia="en-IN" w:bidi="ta-IN"/>
-          <w14:ligatures w14:val="none"/>
-        </w:rPr>
-        <w:t>currentUrl.contains</w:t>
-      </w:r>
-      <w:proofErr w:type="spellEnd"/>
-      <w:r>
-        <w:rPr>
-          <w:rFonts w:ascii="Courier New" w:eastAsia="Times New Roman" w:hAnsi="Courier New" w:cs="Courier New"/>
-          <w:kern w:val="0"/>
-          <w:sz w:val="20"/>
-          <w:szCs w:val="20"/>
-          <w:lang w:eastAsia="en-IN" w:bidi="ta-IN"/>
-          <w14:ligatures w14:val="none"/>
-        </w:rPr>
-        <w:t>("dashboard");</w:t>
-      </w:r>
-    </w:p>
-    <w:p>
-      <w:pPr>
-        <w:tabs>
-          <w:tab w:val="left" w:pos="916"/>
-          <w:tab w:val="left" w:pos="1832"/>
-          <w:tab w:val="left" w:pos="2748"/>
-          <w:tab w:val="left" w:pos="3664"/>
-          <w:tab w:val="left" w:pos="4580"/>
-          <w:tab w:val="left" w:pos="5496"/>
-          <w:tab w:val="left" w:pos="6412"/>
-          <w:tab w:val="left" w:pos="7328"/>
-          <w:tab w:val="left" w:pos="8244"/>
-          <w:tab w:val="left" w:pos="9160"/>
-          <w:tab w:val="left" w:pos="10076"/>
-          <w:tab w:val="left" w:pos="10992"/>
-          <w:tab w:val="left" w:pos="11908"/>
-          <w:tab w:val="left" w:pos="12824"/>
-          <w:tab w:val="left" w:pos="13740"/>
-          <w:tab w:val="left" w:pos="14656"/>
-        </w:tabs>
-        <w:spacing w:after="0" w:line="240" w:lineRule="auto"/>
-        <w:rPr>
-          <w:rFonts w:ascii="Courier New" w:eastAsia="Times New Roman" w:hAnsi="Courier New" w:cs="Courier New"/>
-          <w:kern w:val="0"/>
-          <w:sz w:val="20"/>
-          <w:szCs w:val="20"/>
-          <w:lang w:eastAsia="en-IN" w:bidi="ta-IN"/>
-          <w14:ligatures w14:val="none"/>
-        </w:rPr>
-      </w:pPr>
-      <w:r>
-        <w:rPr>
-          <w:rFonts w:ascii="Courier New" w:eastAsia="Times New Roman" w:hAnsi="Courier New" w:cs="Courier New"/>
-          <w:kern w:val="0"/>
-          <w:sz w:val="20"/>
-          <w:szCs w:val="20"/>
-          <w:lang w:eastAsia="en-IN" w:bidi="ta-IN"/>
-          <w14:ligatures w14:val="none"/>
-        </w:rPr>
-        <w:t xml:space="preserve">        </w:t>
-      </w:r>
-      <w:proofErr w:type="spellStart"/>
-      <w:proofErr w:type="gramStart"/>
-      <w:r>
-        <w:rPr>
-          <w:rFonts w:ascii="Courier New" w:eastAsia="Times New Roman" w:hAnsi="Courier New" w:cs="Courier New"/>
-          <w:kern w:val="0"/>
-          <w:sz w:val="20"/>
-          <w:szCs w:val="20"/>
-          <w:lang w:eastAsia="en-IN" w:bidi="ta-IN"/>
-          <w14:ligatures w14:val="none"/>
-        </w:rPr>
-        <w:t>driver.quit</w:t>
-      </w:r>
-      <w:proofErr w:type="spellEnd"/>
-      <w:proofErr w:type="gramEnd"/>
       <w:r>
         <w:rPr>
           <w:rFonts w:ascii="Courier New" w:eastAsia="Times New Roman" w:hAnsi="Courier New" w:cs="Courier New"/>
@@ -4833,29 +4450,16 @@
         <w:t xml:space="preserve">import </w:t>
       </w:r>
       <w:proofErr w:type="spellStart"/>
-      <w:proofErr w:type="gramStart"/>
-      <w:r>
-        <w:rPr>
-          <w:rFonts w:ascii="Courier New" w:eastAsia="Times New Roman" w:hAnsi="Courier New" w:cs="Courier New"/>
-          <w:kern w:val="0"/>
-          <w:sz w:val="20"/>
-          <w:szCs w:val="20"/>
-          <w:lang w:eastAsia="en-IN" w:bidi="ta-IN"/>
-          <w14:ligatures w14:val="none"/>
-        </w:rPr>
-        <w:t>org.junit</w:t>
-      </w:r>
-      <w:proofErr w:type="gramEnd"/>
-      <w:r>
-        <w:rPr>
-          <w:rFonts w:ascii="Courier New" w:eastAsia="Times New Roman" w:hAnsi="Courier New" w:cs="Courier New"/>
-          <w:kern w:val="0"/>
-          <w:sz w:val="20"/>
-          <w:szCs w:val="20"/>
-          <w:lang w:eastAsia="en-IN" w:bidi="ta-IN"/>
-          <w14:ligatures w14:val="none"/>
-        </w:rPr>
-        <w:t>.runner.RunWith</w:t>
+      <w:r>
+        <w:rPr>
+          <w:rFonts w:ascii="Courier New" w:eastAsia="Times New Roman" w:hAnsi="Courier New" w:cs="Courier New"/>
+          <w:kern w:val="0"/>
+          <w:sz w:val="20"/>
+          <w:szCs w:val="20"/>
+          <w:lang w:eastAsia="en-IN" w:bidi="ta-IN"/>
+          <w14:ligatures w14:val="none"/>
+        </w:rPr>
+        <w:t>org.junit.runner.RunWith</w:t>
       </w:r>
       <w:proofErr w:type="spellEnd"/>
       <w:r>
@@ -4912,29 +4516,16 @@
         <w:t xml:space="preserve">import </w:t>
       </w:r>
       <w:proofErr w:type="spellStart"/>
-      <w:proofErr w:type="gramStart"/>
-      <w:r>
-        <w:rPr>
-          <w:rFonts w:ascii="Courier New" w:eastAsia="Times New Roman" w:hAnsi="Courier New" w:cs="Courier New"/>
-          <w:kern w:val="0"/>
-          <w:sz w:val="20"/>
-          <w:szCs w:val="20"/>
-          <w:lang w:eastAsia="en-IN" w:bidi="ta-IN"/>
-          <w14:ligatures w14:val="none"/>
-        </w:rPr>
-        <w:t>io.cucumber</w:t>
-      </w:r>
-      <w:proofErr w:type="gramEnd"/>
-      <w:r>
-        <w:rPr>
-          <w:rFonts w:ascii="Courier New" w:eastAsia="Times New Roman" w:hAnsi="Courier New" w:cs="Courier New"/>
-          <w:kern w:val="0"/>
-          <w:sz w:val="20"/>
-          <w:szCs w:val="20"/>
-          <w:lang w:eastAsia="en-IN" w:bidi="ta-IN"/>
-          <w14:ligatures w14:val="none"/>
-        </w:rPr>
-        <w:t>.junit.Cucumber</w:t>
+      <w:r>
+        <w:rPr>
+          <w:rFonts w:ascii="Courier New" w:eastAsia="Times New Roman" w:hAnsi="Courier New" w:cs="Courier New"/>
+          <w:kern w:val="0"/>
+          <w:sz w:val="20"/>
+          <w:szCs w:val="20"/>
+          <w:lang w:eastAsia="en-IN" w:bidi="ta-IN"/>
+          <w14:ligatures w14:val="none"/>
+        </w:rPr>
+        <w:t>io.cucumber.junit.Cucumber</w:t>
       </w:r>
       <w:proofErr w:type="spellEnd"/>
       <w:r>
@@ -4991,29 +4582,16 @@
         <w:t xml:space="preserve">import </w:t>
       </w:r>
       <w:proofErr w:type="spellStart"/>
-      <w:proofErr w:type="gramStart"/>
-      <w:r>
-        <w:rPr>
-          <w:rFonts w:ascii="Courier New" w:eastAsia="Times New Roman" w:hAnsi="Courier New" w:cs="Courier New"/>
-          <w:kern w:val="0"/>
-          <w:sz w:val="20"/>
-          <w:szCs w:val="20"/>
-          <w:lang w:eastAsia="en-IN" w:bidi="ta-IN"/>
-          <w14:ligatures w14:val="none"/>
-        </w:rPr>
-        <w:t>io.cucumber</w:t>
-      </w:r>
-      <w:proofErr w:type="gramEnd"/>
-      <w:r>
-        <w:rPr>
-          <w:rFonts w:ascii="Courier New" w:eastAsia="Times New Roman" w:hAnsi="Courier New" w:cs="Courier New"/>
-          <w:kern w:val="0"/>
-          <w:sz w:val="20"/>
-          <w:szCs w:val="20"/>
-          <w:lang w:eastAsia="en-IN" w:bidi="ta-IN"/>
-          <w14:ligatures w14:val="none"/>
-        </w:rPr>
-        <w:t>.junit.CucumberOptions</w:t>
+      <w:r>
+        <w:rPr>
+          <w:rFonts w:ascii="Courier New" w:eastAsia="Times New Roman" w:hAnsi="Courier New" w:cs="Courier New"/>
+          <w:kern w:val="0"/>
+          <w:sz w:val="20"/>
+          <w:szCs w:val="20"/>
+          <w:lang w:eastAsia="en-IN" w:bidi="ta-IN"/>
+          <w14:ligatures w14:val="none"/>
+        </w:rPr>
+        <w:t>io.cucumber.junit.CucumberOptions</w:t>
       </w:r>
       <w:proofErr w:type="spellEnd"/>
       <w:r>
@@ -5098,97 +4676,49 @@
           <w:lang w:eastAsia="en-IN" w:bidi="ta-IN"/>
           <w14:ligatures w14:val="none"/>
         </w:rPr>
-        <w:t>@</w:t>
-      </w:r>
-      <w:proofErr w:type="gramStart"/>
-      <w:r>
-        <w:rPr>
-          <w:rFonts w:ascii="Courier New" w:eastAsia="Times New Roman" w:hAnsi="Courier New" w:cs="Courier New"/>
-          <w:kern w:val="0"/>
-          <w:sz w:val="20"/>
-          <w:szCs w:val="20"/>
-          <w:lang w:eastAsia="en-IN" w:bidi="ta-IN"/>
-          <w14:ligatures w14:val="none"/>
-        </w:rPr>
-        <w:t>RunWith(</w:t>
-      </w:r>
-      <w:proofErr w:type="gramEnd"/>
-      <w:r>
-        <w:rPr>
-          <w:rFonts w:ascii="Courier New" w:eastAsia="Times New Roman" w:hAnsi="Courier New" w:cs="Courier New"/>
-          <w:kern w:val="0"/>
-          <w:sz w:val="20"/>
-          <w:szCs w:val="20"/>
-          <w:lang w:eastAsia="en-IN" w:bidi="ta-IN"/>
-          <w14:ligatures w14:val="none"/>
-        </w:rPr>
-        <w:t>Cucumber.class)</w:t>
-      </w:r>
-    </w:p>
-    <w:p>
-      <w:pPr>
-        <w:tabs>
-          <w:tab w:val="left" w:pos="916"/>
-          <w:tab w:val="left" w:pos="1832"/>
-          <w:tab w:val="left" w:pos="2748"/>
-          <w:tab w:val="left" w:pos="3664"/>
-          <w:tab w:val="left" w:pos="4580"/>
-          <w:tab w:val="left" w:pos="5496"/>
-          <w:tab w:val="left" w:pos="6412"/>
-          <w:tab w:val="left" w:pos="7328"/>
-          <w:tab w:val="left" w:pos="8244"/>
-          <w:tab w:val="left" w:pos="9160"/>
-          <w:tab w:val="left" w:pos="10076"/>
-          <w:tab w:val="left" w:pos="10992"/>
-          <w:tab w:val="left" w:pos="11908"/>
-          <w:tab w:val="left" w:pos="12824"/>
-          <w:tab w:val="left" w:pos="13740"/>
-          <w:tab w:val="left" w:pos="14656"/>
-        </w:tabs>
-        <w:spacing w:after="0" w:line="240" w:lineRule="auto"/>
-        <w:rPr>
-          <w:rFonts w:ascii="Courier New" w:eastAsia="Times New Roman" w:hAnsi="Courier New" w:cs="Courier New"/>
-          <w:kern w:val="0"/>
-          <w:sz w:val="20"/>
-          <w:szCs w:val="20"/>
-          <w:lang w:eastAsia="en-IN" w:bidi="ta-IN"/>
-          <w14:ligatures w14:val="none"/>
-        </w:rPr>
-      </w:pPr>
-      <w:r>
-        <w:rPr>
-          <w:rFonts w:ascii="Courier New" w:eastAsia="Times New Roman" w:hAnsi="Courier New" w:cs="Courier New"/>
-          <w:kern w:val="0"/>
-          <w:sz w:val="20"/>
-          <w:szCs w:val="20"/>
-          <w:lang w:eastAsia="en-IN" w:bidi="ta-IN"/>
-          <w14:ligatures w14:val="none"/>
-        </w:rPr>
-        <w:t>@</w:t>
-      </w:r>
-      <w:proofErr w:type="gramStart"/>
-      <w:r>
-        <w:rPr>
-          <w:rFonts w:ascii="Courier New" w:eastAsia="Times New Roman" w:hAnsi="Courier New" w:cs="Courier New"/>
-          <w:kern w:val="0"/>
-          <w:sz w:val="20"/>
-          <w:szCs w:val="20"/>
-          <w:lang w:eastAsia="en-IN" w:bidi="ta-IN"/>
-          <w14:ligatures w14:val="none"/>
-        </w:rPr>
-        <w:t>CucumberOptions(</w:t>
-      </w:r>
-      <w:proofErr w:type="gramEnd"/>
-      <w:r>
-        <w:rPr>
-          <w:rFonts w:ascii="Courier New" w:eastAsia="Times New Roman" w:hAnsi="Courier New" w:cs="Courier New"/>
-          <w:kern w:val="0"/>
-          <w:sz w:val="20"/>
-          <w:szCs w:val="20"/>
-          <w:lang w:eastAsia="en-IN" w:bidi="ta-IN"/>
-          <w14:ligatures w14:val="none"/>
-        </w:rPr>
-        <w:t>features = "</w:t>
+        <w:t>@RunWith(Cucumber.class)</w:t>
+      </w:r>
+    </w:p>
+    <w:p>
+      <w:pPr>
+        <w:tabs>
+          <w:tab w:val="left" w:pos="916"/>
+          <w:tab w:val="left" w:pos="1832"/>
+          <w:tab w:val="left" w:pos="2748"/>
+          <w:tab w:val="left" w:pos="3664"/>
+          <w:tab w:val="left" w:pos="4580"/>
+          <w:tab w:val="left" w:pos="5496"/>
+          <w:tab w:val="left" w:pos="6412"/>
+          <w:tab w:val="left" w:pos="7328"/>
+          <w:tab w:val="left" w:pos="8244"/>
+          <w:tab w:val="left" w:pos="9160"/>
+          <w:tab w:val="left" w:pos="10076"/>
+          <w:tab w:val="left" w:pos="10992"/>
+          <w:tab w:val="left" w:pos="11908"/>
+          <w:tab w:val="left" w:pos="12824"/>
+          <w:tab w:val="left" w:pos="13740"/>
+          <w:tab w:val="left" w:pos="14656"/>
+        </w:tabs>
+        <w:spacing w:after="0" w:line="240" w:lineRule="auto"/>
+        <w:rPr>
+          <w:rFonts w:ascii="Courier New" w:eastAsia="Times New Roman" w:hAnsi="Courier New" w:cs="Courier New"/>
+          <w:kern w:val="0"/>
+          <w:sz w:val="20"/>
+          <w:szCs w:val="20"/>
+          <w:lang w:eastAsia="en-IN" w:bidi="ta-IN"/>
+          <w14:ligatures w14:val="none"/>
+        </w:rPr>
+      </w:pPr>
+      <w:r>
+        <w:rPr>
+          <w:rFonts w:ascii="Courier New" w:eastAsia="Times New Roman" w:hAnsi="Courier New" w:cs="Courier New"/>
+          <w:kern w:val="0"/>
+          <w:sz w:val="20"/>
+          <w:szCs w:val="20"/>
+          <w:lang w:eastAsia="en-IN" w:bidi="ta-IN"/>
+          <w14:ligatures w14:val="none"/>
+        </w:rPr>
+        <w:t>@CucumberOptions(features = "</w:t>
       </w:r>
       <w:proofErr w:type="spellStart"/>
       <w:r>
@@ -5477,7 +5007,7 @@
           <w14:ligatures w14:val="none"/>
         </w:rPr>
         <w:pict w14:anchorId="13F466CE">
-          <v:rect id="_x0000_i1154" style="width:0;height:1.5pt" o:hralign="center" o:hrstd="t" o:hr="t" fillcolor="#a0a0a0" stroked="f"/>
+          <v:rect id="_x0000_i1028" style="width:0;height:1.5pt" o:hralign="center" o:hrstd="t" o:hr="t" fillcolor="#a0a0a0" stroked="f"/>
         </w:pict>
       </w:r>
     </w:p>
@@ -5896,7 +5426,7 @@
           <w:lang w:eastAsia="en-IN" w:bidi="ta-IN"/>
           <w14:ligatures w14:val="none"/>
         </w:rPr>
-        <w:t xml:space="preserve">import </w:t>
+        <w:t xml:space="preserve">import { Given, When, </w:t>
       </w:r>
       <w:proofErr w:type="gramStart"/>
       <w:r>
@@ -5908,7 +5438,7 @@
           <w:lang w:eastAsia="en-IN" w:bidi="ta-IN"/>
           <w14:ligatures w14:val="none"/>
         </w:rPr>
-        <w:t>{ Given</w:t>
+        <w:t>Then</w:t>
       </w:r>
       <w:proofErr w:type="gramEnd"/>
       <w:r>
@@ -5920,7 +5450,7 @@
           <w:lang w:eastAsia="en-IN" w:bidi="ta-IN"/>
           <w14:ligatures w14:val="none"/>
         </w:rPr>
-        <w:t>, When, Then } from "@</w:t>
+        <w:t xml:space="preserve"> } from "@</w:t>
       </w:r>
       <w:proofErr w:type="spellStart"/>
       <w:r>
@@ -6008,29 +5538,16 @@
           <w14:ligatures w14:val="none"/>
         </w:rPr>
       </w:pPr>
-      <w:proofErr w:type="gramStart"/>
-      <w:r>
-        <w:rPr>
-          <w:rFonts w:ascii="Courier New" w:eastAsia="Times New Roman" w:hAnsi="Courier New" w:cs="Courier New"/>
-          <w:kern w:val="0"/>
-          <w:sz w:val="20"/>
-          <w:szCs w:val="20"/>
-          <w:lang w:eastAsia="en-IN" w:bidi="ta-IN"/>
-          <w14:ligatures w14:val="none"/>
-        </w:rPr>
-        <w:t>Given(</w:t>
-      </w:r>
-      <w:proofErr w:type="gramEnd"/>
-      <w:r>
-        <w:rPr>
-          <w:rFonts w:ascii="Courier New" w:eastAsia="Times New Roman" w:hAnsi="Courier New" w:cs="Courier New"/>
-          <w:kern w:val="0"/>
-          <w:sz w:val="20"/>
-          <w:szCs w:val="20"/>
-          <w:lang w:eastAsia="en-IN" w:bidi="ta-IN"/>
-          <w14:ligatures w14:val="none"/>
-        </w:rPr>
-        <w:t>"the user is on the login page", () =&gt; {</w:t>
+      <w:r>
+        <w:rPr>
+          <w:rFonts w:ascii="Courier New" w:eastAsia="Times New Roman" w:hAnsi="Courier New" w:cs="Courier New"/>
+          <w:kern w:val="0"/>
+          <w:sz w:val="20"/>
+          <w:szCs w:val="20"/>
+          <w:lang w:eastAsia="en-IN" w:bidi="ta-IN"/>
+          <w14:ligatures w14:val="none"/>
+        </w:rPr>
+        <w:t>Given("the user is on the login page", () =&gt; {</w:t>
       </w:r>
     </w:p>
     <w:p>
@@ -6075,7 +5592,6 @@
         <w:t xml:space="preserve">    </w:t>
       </w:r>
       <w:proofErr w:type="spellStart"/>
-      <w:proofErr w:type="gramStart"/>
       <w:r>
         <w:rPr>
           <w:rFonts w:ascii="Courier New" w:eastAsia="Times New Roman" w:hAnsi="Courier New" w:cs="Courier New"/>
@@ -6088,7 +5604,6 @@
         <w:t>cy.visit</w:t>
       </w:r>
       <w:proofErr w:type="spellEnd"/>
-      <w:proofErr w:type="gramEnd"/>
       <w:r>
         <w:rPr>
           <w:rFonts w:ascii="Courier New" w:eastAsia="Times New Roman" w:hAnsi="Courier New" w:cs="Courier New"/>
@@ -6204,29 +5719,16 @@
           <w14:ligatures w14:val="none"/>
         </w:rPr>
       </w:pPr>
-      <w:proofErr w:type="gramStart"/>
-      <w:r>
-        <w:rPr>
-          <w:rFonts w:ascii="Courier New" w:eastAsia="Times New Roman" w:hAnsi="Courier New" w:cs="Courier New"/>
-          <w:kern w:val="0"/>
-          <w:sz w:val="20"/>
-          <w:szCs w:val="20"/>
-          <w:lang w:eastAsia="en-IN" w:bidi="ta-IN"/>
-          <w14:ligatures w14:val="none"/>
-        </w:rPr>
-        <w:t>When(</w:t>
-      </w:r>
-      <w:proofErr w:type="gramEnd"/>
-      <w:r>
-        <w:rPr>
-          <w:rFonts w:ascii="Courier New" w:eastAsia="Times New Roman" w:hAnsi="Courier New" w:cs="Courier New"/>
-          <w:kern w:val="0"/>
-          <w:sz w:val="20"/>
-          <w:szCs w:val="20"/>
-          <w:lang w:eastAsia="en-IN" w:bidi="ta-IN"/>
-          <w14:ligatures w14:val="none"/>
-        </w:rPr>
-        <w:t>"the user enters valid credentials", () =&gt; {</w:t>
+      <w:r>
+        <w:rPr>
+          <w:rFonts w:ascii="Courier New" w:eastAsia="Times New Roman" w:hAnsi="Courier New" w:cs="Courier New"/>
+          <w:kern w:val="0"/>
+          <w:sz w:val="20"/>
+          <w:szCs w:val="20"/>
+          <w:lang w:eastAsia="en-IN" w:bidi="ta-IN"/>
+          <w14:ligatures w14:val="none"/>
+        </w:rPr>
+        <w:t>When("the user enters valid credentials", () =&gt; {</w:t>
       </w:r>
     </w:p>
     <w:p>
@@ -6292,31 +5794,7 @@
           <w:lang w:eastAsia="en-IN" w:bidi="ta-IN"/>
           <w14:ligatures w14:val="none"/>
         </w:rPr>
-        <w:t>("#username"</w:t>
-      </w:r>
-      <w:proofErr w:type="gramStart"/>
-      <w:r>
-        <w:rPr>
-          <w:rFonts w:ascii="Courier New" w:eastAsia="Times New Roman" w:hAnsi="Courier New" w:cs="Courier New"/>
-          <w:kern w:val="0"/>
-          <w:sz w:val="20"/>
-          <w:szCs w:val="20"/>
-          <w:lang w:eastAsia="en-IN" w:bidi="ta-IN"/>
-          <w14:ligatures w14:val="none"/>
-        </w:rPr>
-        <w:t>).type</w:t>
-      </w:r>
-      <w:proofErr w:type="gramEnd"/>
-      <w:r>
-        <w:rPr>
-          <w:rFonts w:ascii="Courier New" w:eastAsia="Times New Roman" w:hAnsi="Courier New" w:cs="Courier New"/>
-          <w:kern w:val="0"/>
-          <w:sz w:val="20"/>
-          <w:szCs w:val="20"/>
-          <w:lang w:eastAsia="en-IN" w:bidi="ta-IN"/>
-          <w14:ligatures w14:val="none"/>
-        </w:rPr>
-        <w:t>("</w:t>
+        <w:t>("#username").type("</w:t>
       </w:r>
       <w:proofErr w:type="spellStart"/>
       <w:r>
@@ -6406,31 +5884,7 @@
           <w:lang w:eastAsia="en-IN" w:bidi="ta-IN"/>
           <w14:ligatures w14:val="none"/>
         </w:rPr>
-        <w:t>("#password"</w:t>
-      </w:r>
-      <w:proofErr w:type="gramStart"/>
-      <w:r>
-        <w:rPr>
-          <w:rFonts w:ascii="Courier New" w:eastAsia="Times New Roman" w:hAnsi="Courier New" w:cs="Courier New"/>
-          <w:kern w:val="0"/>
-          <w:sz w:val="20"/>
-          <w:szCs w:val="20"/>
-          <w:lang w:eastAsia="en-IN" w:bidi="ta-IN"/>
-          <w14:ligatures w14:val="none"/>
-        </w:rPr>
-        <w:t>).type</w:t>
-      </w:r>
-      <w:proofErr w:type="gramEnd"/>
-      <w:r>
-        <w:rPr>
-          <w:rFonts w:ascii="Courier New" w:eastAsia="Times New Roman" w:hAnsi="Courier New" w:cs="Courier New"/>
-          <w:kern w:val="0"/>
-          <w:sz w:val="20"/>
-          <w:szCs w:val="20"/>
-          <w:lang w:eastAsia="en-IN" w:bidi="ta-IN"/>
-          <w14:ligatures w14:val="none"/>
-        </w:rPr>
-        <w:t>("</w:t>
+        <w:t>("#password").type("</w:t>
       </w:r>
       <w:proofErr w:type="spellStart"/>
       <w:r>
@@ -6520,225 +5974,7 @@
           <w:lang w:eastAsia="en-IN" w:bidi="ta-IN"/>
           <w14:ligatures w14:val="none"/>
         </w:rPr>
-        <w:t>("#login-button"</w:t>
-      </w:r>
-      <w:proofErr w:type="gramStart"/>
-      <w:r>
-        <w:rPr>
-          <w:rFonts w:ascii="Courier New" w:eastAsia="Times New Roman" w:hAnsi="Courier New" w:cs="Courier New"/>
-          <w:kern w:val="0"/>
-          <w:sz w:val="20"/>
-          <w:szCs w:val="20"/>
-          <w:lang w:eastAsia="en-IN" w:bidi="ta-IN"/>
-          <w14:ligatures w14:val="none"/>
-        </w:rPr>
-        <w:t>).click</w:t>
-      </w:r>
-      <w:proofErr w:type="gramEnd"/>
-      <w:r>
-        <w:rPr>
-          <w:rFonts w:ascii="Courier New" w:eastAsia="Times New Roman" w:hAnsi="Courier New" w:cs="Courier New"/>
-          <w:kern w:val="0"/>
-          <w:sz w:val="20"/>
-          <w:szCs w:val="20"/>
-          <w:lang w:eastAsia="en-IN" w:bidi="ta-IN"/>
-          <w14:ligatures w14:val="none"/>
-        </w:rPr>
-        <w:t>();</w:t>
-      </w:r>
-    </w:p>
-    <w:p>
-      <w:pPr>
-        <w:tabs>
-          <w:tab w:val="left" w:pos="916"/>
-          <w:tab w:val="left" w:pos="1832"/>
-          <w:tab w:val="left" w:pos="2748"/>
-          <w:tab w:val="left" w:pos="3664"/>
-          <w:tab w:val="left" w:pos="4580"/>
-          <w:tab w:val="left" w:pos="5496"/>
-          <w:tab w:val="left" w:pos="6412"/>
-          <w:tab w:val="left" w:pos="7328"/>
-          <w:tab w:val="left" w:pos="8244"/>
-          <w:tab w:val="left" w:pos="9160"/>
-          <w:tab w:val="left" w:pos="10076"/>
-          <w:tab w:val="left" w:pos="10992"/>
-          <w:tab w:val="left" w:pos="11908"/>
-          <w:tab w:val="left" w:pos="12824"/>
-          <w:tab w:val="left" w:pos="13740"/>
-          <w:tab w:val="left" w:pos="14656"/>
-        </w:tabs>
-        <w:spacing w:after="0" w:line="240" w:lineRule="auto"/>
-        <w:rPr>
-          <w:rFonts w:ascii="Courier New" w:eastAsia="Times New Roman" w:hAnsi="Courier New" w:cs="Courier New"/>
-          <w:kern w:val="0"/>
-          <w:sz w:val="20"/>
-          <w:szCs w:val="20"/>
-          <w:lang w:eastAsia="en-IN" w:bidi="ta-IN"/>
-          <w14:ligatures w14:val="none"/>
-        </w:rPr>
-      </w:pPr>
-      <w:r>
-        <w:rPr>
-          <w:rFonts w:ascii="Courier New" w:eastAsia="Times New Roman" w:hAnsi="Courier New" w:cs="Courier New"/>
-          <w:kern w:val="0"/>
-          <w:sz w:val="20"/>
-          <w:szCs w:val="20"/>
-          <w:lang w:eastAsia="en-IN" w:bidi="ta-IN"/>
-          <w14:ligatures w14:val="none"/>
-        </w:rPr>
-        <w:t>});</w:t>
-      </w:r>
-    </w:p>
-    <w:p>
-      <w:pPr>
-        <w:tabs>
-          <w:tab w:val="left" w:pos="916"/>
-          <w:tab w:val="left" w:pos="1832"/>
-          <w:tab w:val="left" w:pos="2748"/>
-          <w:tab w:val="left" w:pos="3664"/>
-          <w:tab w:val="left" w:pos="4580"/>
-          <w:tab w:val="left" w:pos="5496"/>
-          <w:tab w:val="left" w:pos="6412"/>
-          <w:tab w:val="left" w:pos="7328"/>
-          <w:tab w:val="left" w:pos="8244"/>
-          <w:tab w:val="left" w:pos="9160"/>
-          <w:tab w:val="left" w:pos="10076"/>
-          <w:tab w:val="left" w:pos="10992"/>
-          <w:tab w:val="left" w:pos="11908"/>
-          <w:tab w:val="left" w:pos="12824"/>
-          <w:tab w:val="left" w:pos="13740"/>
-          <w:tab w:val="left" w:pos="14656"/>
-        </w:tabs>
-        <w:spacing w:after="0" w:line="240" w:lineRule="auto"/>
-        <w:rPr>
-          <w:rFonts w:ascii="Courier New" w:eastAsia="Times New Roman" w:hAnsi="Courier New" w:cs="Courier New"/>
-          <w:kern w:val="0"/>
-          <w:sz w:val="20"/>
-          <w:szCs w:val="20"/>
-          <w:lang w:eastAsia="en-IN" w:bidi="ta-IN"/>
-          <w14:ligatures w14:val="none"/>
-        </w:rPr>
-      </w:pPr>
-    </w:p>
-    <w:p>
-      <w:pPr>
-        <w:tabs>
-          <w:tab w:val="left" w:pos="916"/>
-          <w:tab w:val="left" w:pos="1832"/>
-          <w:tab w:val="left" w:pos="2748"/>
-          <w:tab w:val="left" w:pos="3664"/>
-          <w:tab w:val="left" w:pos="4580"/>
-          <w:tab w:val="left" w:pos="5496"/>
-          <w:tab w:val="left" w:pos="6412"/>
-          <w:tab w:val="left" w:pos="7328"/>
-          <w:tab w:val="left" w:pos="8244"/>
-          <w:tab w:val="left" w:pos="9160"/>
-          <w:tab w:val="left" w:pos="10076"/>
-          <w:tab w:val="left" w:pos="10992"/>
-          <w:tab w:val="left" w:pos="11908"/>
-          <w:tab w:val="left" w:pos="12824"/>
-          <w:tab w:val="left" w:pos="13740"/>
-          <w:tab w:val="left" w:pos="14656"/>
-        </w:tabs>
-        <w:spacing w:after="0" w:line="240" w:lineRule="auto"/>
-        <w:rPr>
-          <w:rFonts w:ascii="Courier New" w:eastAsia="Times New Roman" w:hAnsi="Courier New" w:cs="Courier New"/>
-          <w:kern w:val="0"/>
-          <w:sz w:val="20"/>
-          <w:szCs w:val="20"/>
-          <w:lang w:eastAsia="en-IN" w:bidi="ta-IN"/>
-          <w14:ligatures w14:val="none"/>
-        </w:rPr>
-      </w:pPr>
-      <w:proofErr w:type="gramStart"/>
-      <w:r>
-        <w:rPr>
-          <w:rFonts w:ascii="Courier New" w:eastAsia="Times New Roman" w:hAnsi="Courier New" w:cs="Courier New"/>
-          <w:kern w:val="0"/>
-          <w:sz w:val="20"/>
-          <w:szCs w:val="20"/>
-          <w:lang w:eastAsia="en-IN" w:bidi="ta-IN"/>
-          <w14:ligatures w14:val="none"/>
-        </w:rPr>
-        <w:t>Then(</w:t>
-      </w:r>
-      <w:proofErr w:type="gramEnd"/>
-      <w:r>
-        <w:rPr>
-          <w:rFonts w:ascii="Courier New" w:eastAsia="Times New Roman" w:hAnsi="Courier New" w:cs="Courier New"/>
-          <w:kern w:val="0"/>
-          <w:sz w:val="20"/>
-          <w:szCs w:val="20"/>
-          <w:lang w:eastAsia="en-IN" w:bidi="ta-IN"/>
-          <w14:ligatures w14:val="none"/>
-        </w:rPr>
-        <w:t>"the user should be redirected to the dashboard", () =&gt; {</w:t>
-      </w:r>
-    </w:p>
-    <w:p>
-      <w:pPr>
-        <w:tabs>
-          <w:tab w:val="left" w:pos="916"/>
-          <w:tab w:val="left" w:pos="1832"/>
-          <w:tab w:val="left" w:pos="2748"/>
-          <w:tab w:val="left" w:pos="3664"/>
-          <w:tab w:val="left" w:pos="4580"/>
-          <w:tab w:val="left" w:pos="5496"/>
-          <w:tab w:val="left" w:pos="6412"/>
-          <w:tab w:val="left" w:pos="7328"/>
-          <w:tab w:val="left" w:pos="8244"/>
-          <w:tab w:val="left" w:pos="9160"/>
-          <w:tab w:val="left" w:pos="10076"/>
-          <w:tab w:val="left" w:pos="10992"/>
-          <w:tab w:val="left" w:pos="11908"/>
-          <w:tab w:val="left" w:pos="12824"/>
-          <w:tab w:val="left" w:pos="13740"/>
-          <w:tab w:val="left" w:pos="14656"/>
-        </w:tabs>
-        <w:spacing w:after="0" w:line="240" w:lineRule="auto"/>
-        <w:rPr>
-          <w:rFonts w:ascii="Courier New" w:eastAsia="Times New Roman" w:hAnsi="Courier New" w:cs="Courier New"/>
-          <w:kern w:val="0"/>
-          <w:sz w:val="20"/>
-          <w:szCs w:val="20"/>
-          <w:lang w:eastAsia="en-IN" w:bidi="ta-IN"/>
-          <w14:ligatures w14:val="none"/>
-        </w:rPr>
-      </w:pPr>
-      <w:r>
-        <w:rPr>
-          <w:rFonts w:ascii="Courier New" w:eastAsia="Times New Roman" w:hAnsi="Courier New" w:cs="Courier New"/>
-          <w:kern w:val="0"/>
-          <w:sz w:val="20"/>
-          <w:szCs w:val="20"/>
-          <w:lang w:eastAsia="en-IN" w:bidi="ta-IN"/>
-          <w14:ligatures w14:val="none"/>
-        </w:rPr>
-        <w:t xml:space="preserve">    </w:t>
-      </w:r>
-      <w:proofErr w:type="gramStart"/>
-      <w:r>
-        <w:rPr>
-          <w:rFonts w:ascii="Courier New" w:eastAsia="Times New Roman" w:hAnsi="Courier New" w:cs="Courier New"/>
-          <w:kern w:val="0"/>
-          <w:sz w:val="20"/>
-          <w:szCs w:val="20"/>
-          <w:lang w:eastAsia="en-IN" w:bidi="ta-IN"/>
-          <w14:ligatures w14:val="none"/>
-        </w:rPr>
-        <w:t>cy.url(</w:t>
-      </w:r>
-      <w:proofErr w:type="gramEnd"/>
-      <w:r>
-        <w:rPr>
-          <w:rFonts w:ascii="Courier New" w:eastAsia="Times New Roman" w:hAnsi="Courier New" w:cs="Courier New"/>
-          <w:kern w:val="0"/>
-          <w:sz w:val="20"/>
-          <w:szCs w:val="20"/>
-          <w:lang w:eastAsia="en-IN" w:bidi="ta-IN"/>
-          <w14:ligatures w14:val="none"/>
-        </w:rPr>
-        <w:t>).should("include", "dashboard");</w:t>
+        <w:t>("#login-button").click();</w:t>
       </w:r>
     </w:p>
     <w:p>
@@ -6786,6 +6022,163 @@
     </w:p>
     <w:p>
       <w:pPr>
+        <w:tabs>
+          <w:tab w:val="left" w:pos="916"/>
+          <w:tab w:val="left" w:pos="1832"/>
+          <w:tab w:val="left" w:pos="2748"/>
+          <w:tab w:val="left" w:pos="3664"/>
+          <w:tab w:val="left" w:pos="4580"/>
+          <w:tab w:val="left" w:pos="5496"/>
+          <w:tab w:val="left" w:pos="6412"/>
+          <w:tab w:val="left" w:pos="7328"/>
+          <w:tab w:val="left" w:pos="8244"/>
+          <w:tab w:val="left" w:pos="9160"/>
+          <w:tab w:val="left" w:pos="10076"/>
+          <w:tab w:val="left" w:pos="10992"/>
+          <w:tab w:val="left" w:pos="11908"/>
+          <w:tab w:val="left" w:pos="12824"/>
+          <w:tab w:val="left" w:pos="13740"/>
+          <w:tab w:val="left" w:pos="14656"/>
+        </w:tabs>
+        <w:spacing w:after="0" w:line="240" w:lineRule="auto"/>
+        <w:rPr>
+          <w:rFonts w:ascii="Courier New" w:eastAsia="Times New Roman" w:hAnsi="Courier New" w:cs="Courier New"/>
+          <w:kern w:val="0"/>
+          <w:sz w:val="20"/>
+          <w:szCs w:val="20"/>
+          <w:lang w:eastAsia="en-IN" w:bidi="ta-IN"/>
+          <w14:ligatures w14:val="none"/>
+        </w:rPr>
+      </w:pPr>
+    </w:p>
+    <w:p>
+      <w:pPr>
+        <w:tabs>
+          <w:tab w:val="left" w:pos="916"/>
+          <w:tab w:val="left" w:pos="1832"/>
+          <w:tab w:val="left" w:pos="2748"/>
+          <w:tab w:val="left" w:pos="3664"/>
+          <w:tab w:val="left" w:pos="4580"/>
+          <w:tab w:val="left" w:pos="5496"/>
+          <w:tab w:val="left" w:pos="6412"/>
+          <w:tab w:val="left" w:pos="7328"/>
+          <w:tab w:val="left" w:pos="8244"/>
+          <w:tab w:val="left" w:pos="9160"/>
+          <w:tab w:val="left" w:pos="10076"/>
+          <w:tab w:val="left" w:pos="10992"/>
+          <w:tab w:val="left" w:pos="11908"/>
+          <w:tab w:val="left" w:pos="12824"/>
+          <w:tab w:val="left" w:pos="13740"/>
+          <w:tab w:val="left" w:pos="14656"/>
+        </w:tabs>
+        <w:spacing w:after="0" w:line="240" w:lineRule="auto"/>
+        <w:rPr>
+          <w:rFonts w:ascii="Courier New" w:eastAsia="Times New Roman" w:hAnsi="Courier New" w:cs="Courier New"/>
+          <w:kern w:val="0"/>
+          <w:sz w:val="20"/>
+          <w:szCs w:val="20"/>
+          <w:lang w:eastAsia="en-IN" w:bidi="ta-IN"/>
+          <w14:ligatures w14:val="none"/>
+        </w:rPr>
+      </w:pPr>
+      <w:r>
+        <w:rPr>
+          <w:rFonts w:ascii="Courier New" w:eastAsia="Times New Roman" w:hAnsi="Courier New" w:cs="Courier New"/>
+          <w:kern w:val="0"/>
+          <w:sz w:val="20"/>
+          <w:szCs w:val="20"/>
+          <w:lang w:eastAsia="en-IN" w:bidi="ta-IN"/>
+          <w14:ligatures w14:val="none"/>
+        </w:rPr>
+        <w:t>Then("the user should be redirected to the dashboard", () =&gt; {</w:t>
+      </w:r>
+    </w:p>
+    <w:p>
+      <w:pPr>
+        <w:tabs>
+          <w:tab w:val="left" w:pos="916"/>
+          <w:tab w:val="left" w:pos="1832"/>
+          <w:tab w:val="left" w:pos="2748"/>
+          <w:tab w:val="left" w:pos="3664"/>
+          <w:tab w:val="left" w:pos="4580"/>
+          <w:tab w:val="left" w:pos="5496"/>
+          <w:tab w:val="left" w:pos="6412"/>
+          <w:tab w:val="left" w:pos="7328"/>
+          <w:tab w:val="left" w:pos="8244"/>
+          <w:tab w:val="left" w:pos="9160"/>
+          <w:tab w:val="left" w:pos="10076"/>
+          <w:tab w:val="left" w:pos="10992"/>
+          <w:tab w:val="left" w:pos="11908"/>
+          <w:tab w:val="left" w:pos="12824"/>
+          <w:tab w:val="left" w:pos="13740"/>
+          <w:tab w:val="left" w:pos="14656"/>
+        </w:tabs>
+        <w:spacing w:after="0" w:line="240" w:lineRule="auto"/>
+        <w:rPr>
+          <w:rFonts w:ascii="Courier New" w:eastAsia="Times New Roman" w:hAnsi="Courier New" w:cs="Courier New"/>
+          <w:kern w:val="0"/>
+          <w:sz w:val="20"/>
+          <w:szCs w:val="20"/>
+          <w:lang w:eastAsia="en-IN" w:bidi="ta-IN"/>
+          <w14:ligatures w14:val="none"/>
+        </w:rPr>
+      </w:pPr>
+      <w:r>
+        <w:rPr>
+          <w:rFonts w:ascii="Courier New" w:eastAsia="Times New Roman" w:hAnsi="Courier New" w:cs="Courier New"/>
+          <w:kern w:val="0"/>
+          <w:sz w:val="20"/>
+          <w:szCs w:val="20"/>
+          <w:lang w:eastAsia="en-IN" w:bidi="ta-IN"/>
+          <w14:ligatures w14:val="none"/>
+        </w:rPr>
+        <w:t xml:space="preserve">    cy.url().should("include", "dashboard");</w:t>
+      </w:r>
+    </w:p>
+    <w:p>
+      <w:pPr>
+        <w:tabs>
+          <w:tab w:val="left" w:pos="916"/>
+          <w:tab w:val="left" w:pos="1832"/>
+          <w:tab w:val="left" w:pos="2748"/>
+          <w:tab w:val="left" w:pos="3664"/>
+          <w:tab w:val="left" w:pos="4580"/>
+          <w:tab w:val="left" w:pos="5496"/>
+          <w:tab w:val="left" w:pos="6412"/>
+          <w:tab w:val="left" w:pos="7328"/>
+          <w:tab w:val="left" w:pos="8244"/>
+          <w:tab w:val="left" w:pos="9160"/>
+          <w:tab w:val="left" w:pos="10076"/>
+          <w:tab w:val="left" w:pos="10992"/>
+          <w:tab w:val="left" w:pos="11908"/>
+          <w:tab w:val="left" w:pos="12824"/>
+          <w:tab w:val="left" w:pos="13740"/>
+          <w:tab w:val="left" w:pos="14656"/>
+        </w:tabs>
+        <w:spacing w:after="0" w:line="240" w:lineRule="auto"/>
+        <w:rPr>
+          <w:rFonts w:ascii="Courier New" w:eastAsia="Times New Roman" w:hAnsi="Courier New" w:cs="Courier New"/>
+          <w:kern w:val="0"/>
+          <w:sz w:val="20"/>
+          <w:szCs w:val="20"/>
+          <w:lang w:eastAsia="en-IN" w:bidi="ta-IN"/>
+          <w14:ligatures w14:val="none"/>
+        </w:rPr>
+      </w:pPr>
+      <w:r>
+        <w:rPr>
+          <w:rFonts w:ascii="Courier New" w:eastAsia="Times New Roman" w:hAnsi="Courier New" w:cs="Courier New"/>
+          <w:kern w:val="0"/>
+          <w:sz w:val="20"/>
+          <w:szCs w:val="20"/>
+          <w:lang w:eastAsia="en-IN" w:bidi="ta-IN"/>
+          <w14:ligatures w14:val="none"/>
+        </w:rPr>
+        <w:t>});</w:t>
+      </w:r>
+    </w:p>
+    <w:p>
+      <w:pPr>
         <w:spacing w:before="100" w:beforeAutospacing="1" w:after="100" w:afterAutospacing="1" w:line="240" w:lineRule="auto"/>
         <w:outlineLvl w:val="3"/>
         <w:rPr>
@@ -7079,7 +6472,6 @@
         </w:rPr>
       </w:pPr>
       <w:proofErr w:type="spellStart"/>
-      <w:proofErr w:type="gramStart"/>
       <w:r>
         <w:rPr>
           <w:rFonts w:ascii="Courier New" w:eastAsia="Times New Roman" w:hAnsi="Courier New" w:cs="Courier New"/>
@@ -7092,7 +6484,6 @@
         <w:t>module.exports</w:t>
       </w:r>
       <w:proofErr w:type="spellEnd"/>
-      <w:proofErr w:type="gramEnd"/>
       <w:r>
         <w:rPr>
           <w:rFonts w:ascii="Courier New" w:eastAsia="Times New Roman" w:hAnsi="Courier New" w:cs="Courier New"/>
@@ -7189,7 +6580,6 @@
         <w:t xml:space="preserve">        </w:t>
       </w:r>
       <w:proofErr w:type="spellStart"/>
-      <w:proofErr w:type="gramStart"/>
       <w:r>
         <w:rPr>
           <w:rFonts w:ascii="Courier New" w:eastAsia="Times New Roman" w:hAnsi="Courier New" w:cs="Courier New"/>
@@ -7211,85 +6601,49 @@
           <w:lang w:eastAsia="en-IN" w:bidi="ta-IN"/>
           <w14:ligatures w14:val="none"/>
         </w:rPr>
-        <w:t>(</w:t>
-      </w:r>
-      <w:proofErr w:type="gramEnd"/>
-      <w:r>
-        <w:rPr>
-          <w:rFonts w:ascii="Courier New" w:eastAsia="Times New Roman" w:hAnsi="Courier New" w:cs="Courier New"/>
-          <w:kern w:val="0"/>
-          <w:sz w:val="20"/>
-          <w:szCs w:val="20"/>
-          <w:lang w:eastAsia="en-IN" w:bidi="ta-IN"/>
-          <w14:ligatures w14:val="none"/>
-        </w:rPr>
-        <w:t>on, config) {</w:t>
-      </w:r>
-    </w:p>
-    <w:p>
-      <w:pPr>
-        <w:tabs>
-          <w:tab w:val="left" w:pos="916"/>
-          <w:tab w:val="left" w:pos="1832"/>
-          <w:tab w:val="left" w:pos="2748"/>
-          <w:tab w:val="left" w:pos="3664"/>
-          <w:tab w:val="left" w:pos="4580"/>
-          <w:tab w:val="left" w:pos="5496"/>
-          <w:tab w:val="left" w:pos="6412"/>
-          <w:tab w:val="left" w:pos="7328"/>
-          <w:tab w:val="left" w:pos="8244"/>
-          <w:tab w:val="left" w:pos="9160"/>
-          <w:tab w:val="left" w:pos="10076"/>
-          <w:tab w:val="left" w:pos="10992"/>
-          <w:tab w:val="left" w:pos="11908"/>
-          <w:tab w:val="left" w:pos="12824"/>
-          <w:tab w:val="left" w:pos="13740"/>
-          <w:tab w:val="left" w:pos="14656"/>
-        </w:tabs>
-        <w:spacing w:after="0" w:line="240" w:lineRule="auto"/>
-        <w:rPr>
-          <w:rFonts w:ascii="Courier New" w:eastAsia="Times New Roman" w:hAnsi="Courier New" w:cs="Courier New"/>
-          <w:kern w:val="0"/>
-          <w:sz w:val="20"/>
-          <w:szCs w:val="20"/>
-          <w:lang w:eastAsia="en-IN" w:bidi="ta-IN"/>
-          <w14:ligatures w14:val="none"/>
-        </w:rPr>
-      </w:pPr>
-      <w:r>
-        <w:rPr>
-          <w:rFonts w:ascii="Courier New" w:eastAsia="Times New Roman" w:hAnsi="Courier New" w:cs="Courier New"/>
-          <w:kern w:val="0"/>
-          <w:sz w:val="20"/>
-          <w:szCs w:val="20"/>
-          <w:lang w:eastAsia="en-IN" w:bidi="ta-IN"/>
-          <w14:ligatures w14:val="none"/>
-        </w:rPr>
-        <w:t xml:space="preserve">            </w:t>
-      </w:r>
-      <w:proofErr w:type="gramStart"/>
-      <w:r>
-        <w:rPr>
-          <w:rFonts w:ascii="Courier New" w:eastAsia="Times New Roman" w:hAnsi="Courier New" w:cs="Courier New"/>
-          <w:kern w:val="0"/>
-          <w:sz w:val="20"/>
-          <w:szCs w:val="20"/>
-          <w:lang w:eastAsia="en-IN" w:bidi="ta-IN"/>
-          <w14:ligatures w14:val="none"/>
-        </w:rPr>
-        <w:t>on(</w:t>
-      </w:r>
-      <w:proofErr w:type="gramEnd"/>
-      <w:r>
-        <w:rPr>
-          <w:rFonts w:ascii="Courier New" w:eastAsia="Times New Roman" w:hAnsi="Courier New" w:cs="Courier New"/>
-          <w:kern w:val="0"/>
-          <w:sz w:val="20"/>
-          <w:szCs w:val="20"/>
-          <w:lang w:eastAsia="en-IN" w:bidi="ta-IN"/>
-          <w14:ligatures w14:val="none"/>
-        </w:rPr>
-        <w:t>"file:preprocessor", cucumber());</w:t>
+        <w:t>(on, config) {</w:t>
+      </w:r>
+    </w:p>
+    <w:p>
+      <w:pPr>
+        <w:tabs>
+          <w:tab w:val="left" w:pos="916"/>
+          <w:tab w:val="left" w:pos="1832"/>
+          <w:tab w:val="left" w:pos="2748"/>
+          <w:tab w:val="left" w:pos="3664"/>
+          <w:tab w:val="left" w:pos="4580"/>
+          <w:tab w:val="left" w:pos="5496"/>
+          <w:tab w:val="left" w:pos="6412"/>
+          <w:tab w:val="left" w:pos="7328"/>
+          <w:tab w:val="left" w:pos="8244"/>
+          <w:tab w:val="left" w:pos="9160"/>
+          <w:tab w:val="left" w:pos="10076"/>
+          <w:tab w:val="left" w:pos="10992"/>
+          <w:tab w:val="left" w:pos="11908"/>
+          <w:tab w:val="left" w:pos="12824"/>
+          <w:tab w:val="left" w:pos="13740"/>
+          <w:tab w:val="left" w:pos="14656"/>
+        </w:tabs>
+        <w:spacing w:after="0" w:line="240" w:lineRule="auto"/>
+        <w:rPr>
+          <w:rFonts w:ascii="Courier New" w:eastAsia="Times New Roman" w:hAnsi="Courier New" w:cs="Courier New"/>
+          <w:kern w:val="0"/>
+          <w:sz w:val="20"/>
+          <w:szCs w:val="20"/>
+          <w:lang w:eastAsia="en-IN" w:bidi="ta-IN"/>
+          <w14:ligatures w14:val="none"/>
+        </w:rPr>
+      </w:pPr>
+      <w:r>
+        <w:rPr>
+          <w:rFonts w:ascii="Courier New" w:eastAsia="Times New Roman" w:hAnsi="Courier New" w:cs="Courier New"/>
+          <w:kern w:val="0"/>
+          <w:sz w:val="20"/>
+          <w:szCs w:val="20"/>
+          <w:lang w:eastAsia="en-IN" w:bidi="ta-IN"/>
+          <w14:ligatures w14:val="none"/>
+        </w:rPr>
+        <w:t xml:space="preserve">            on("file:preprocessor", cucumber());</w:t>
       </w:r>
     </w:p>
     <w:p>
@@ -7397,31 +6751,7 @@
           <w:lang w:eastAsia="en-IN" w:bidi="ta-IN"/>
           <w14:ligatures w14:val="none"/>
         </w:rPr>
-        <w:t>: "cypress/e2e/**/</w:t>
-      </w:r>
-      <w:proofErr w:type="gramStart"/>
-      <w:r>
-        <w:rPr>
-          <w:rFonts w:ascii="Courier New" w:eastAsia="Times New Roman" w:hAnsi="Courier New" w:cs="Courier New"/>
-          <w:kern w:val="0"/>
-          <w:sz w:val="20"/>
-          <w:szCs w:val="20"/>
-          <w:lang w:eastAsia="en-IN" w:bidi="ta-IN"/>
-          <w14:ligatures w14:val="none"/>
-        </w:rPr>
-        <w:t>*.feature</w:t>
-      </w:r>
-      <w:proofErr w:type="gramEnd"/>
-      <w:r>
-        <w:rPr>
-          <w:rFonts w:ascii="Courier New" w:eastAsia="Times New Roman" w:hAnsi="Courier New" w:cs="Courier New"/>
-          <w:kern w:val="0"/>
-          <w:sz w:val="20"/>
-          <w:szCs w:val="20"/>
-          <w:lang w:eastAsia="en-IN" w:bidi="ta-IN"/>
-          <w14:ligatures w14:val="none"/>
-        </w:rPr>
-        <w:t>",</w:t>
+        <w:t>: "cypress/e2e/**/*.feature",</w:t>
       </w:r>
     </w:p>
     <w:p>
@@ -7638,7 +6968,7 @@
           <w14:ligatures w14:val="none"/>
         </w:rPr>
         <w:pict w14:anchorId="22189706">
-          <v:rect id="_x0000_i1155" style="width:0;height:1.5pt" o:hralign="center" o:hrstd="t" o:hr="t" fillcolor="#a0a0a0" stroked="f"/>
+          <v:rect id="_x0000_i1029" style="width:0;height:1.5pt" o:hralign="center" o:hrstd="t" o:hr="t" fillcolor="#a0a0a0" stroked="f"/>
         </w:pict>
       </w:r>
     </w:p>
@@ -8694,6 +8024,7 @@
   <w:style w:type="character" w:default="1" w:styleId="DefaultParagraphFont">
     <w:name w:val="Default Paragraph Font"/>
     <w:uiPriority w:val="1"/>
+    <w:semiHidden/>
     <w:unhideWhenUsed/>
   </w:style>
   <w:style w:type="table" w:default="1" w:styleId="TableNormal">
@@ -8716,6 +8047,40 @@
     <w:uiPriority w:val="99"/>
     <w:semiHidden/>
     <w:unhideWhenUsed/>
+  </w:style>
+  <w:style w:type="paragraph" w:styleId="Title">
+    <w:name w:val="Title"/>
+    <w:basedOn w:val="Normal"/>
+    <w:next w:val="Normal"/>
+    <w:link w:val="TitleChar"/>
+    <w:uiPriority w:val="10"/>
+    <w:qFormat/>
+    <w:rsid w:val="003468E9"/>
+    <w:pPr>
+      <w:spacing w:after="0" w:line="240" w:lineRule="auto"/>
+      <w:contextualSpacing/>
+    </w:pPr>
+    <w:rPr>
+      <w:rFonts w:asciiTheme="majorHAnsi" w:eastAsiaTheme="majorEastAsia" w:hAnsiTheme="majorHAnsi" w:cstheme="majorBidi"/>
+      <w:spacing w:val="-10"/>
+      <w:kern w:val="28"/>
+      <w:sz w:val="56"/>
+      <w:szCs w:val="56"/>
+    </w:rPr>
+  </w:style>
+  <w:style w:type="character" w:customStyle="1" w:styleId="TitleChar">
+    <w:name w:val="Title Char"/>
+    <w:basedOn w:val="DefaultParagraphFont"/>
+    <w:link w:val="Title"/>
+    <w:uiPriority w:val="10"/>
+    <w:rsid w:val="003468E9"/>
+    <w:rPr>
+      <w:rFonts w:asciiTheme="majorHAnsi" w:eastAsiaTheme="majorEastAsia" w:hAnsiTheme="majorHAnsi" w:cstheme="majorBidi"/>
+      <w:spacing w:val="-10"/>
+      <w:kern w:val="28"/>
+      <w:sz w:val="56"/>
+      <w:szCs w:val="56"/>
+    </w:rPr>
   </w:style>
 </w:styles>
 </file>

</xml_diff>